<commit_message>
docs: sync defense materials with completed implementation
- report: update F3/F4/F5 to implemented; add section 8-10 (system design, implementation, testing) with table 12-13

- ppt: update module status, fill slides 10-12 (quiz/grading, mistake/review, frontend/testing)
</commit_message>
<xml_diff>
--- a/defense/1组-张三-23级计算机科学与技术1班-课程设计报告.docx
+++ b/defense/1组-张三-23级计算机科学与技术1班-课程设计报告.docx
@@ -3674,14 +3674,13 @@
               <w:ind w:firstLine="0"/>
               <w:jc w:val="left"/>
             </w:pPr>
-            <w:r/>
-            <w:r>
-              <w:rPr>
-                <w:rFonts w:ascii="Times New Roman" w:hAnsi="Times New Roman" w:eastAsia="宋体"/>
-                <w:b w:val="0"/>
-                <w:sz w:val="21"/>
-              </w:rPr>
-              <w:t>按题型（单选／多选／判断／简答）、难度（易／中／难）与数量生成题目；客观题返回结构化的题干、选项、正确答案与解析，简答题附参考答案要点</w:t>
+            <w:r>
+              <w:rPr>
+                <w:rFonts w:ascii="Times New Roman" w:hAnsi="Times New Roman" w:eastAsia="宋体"/>
+                <w:b w:val="0"/>
+                <w:sz w:val="21"/>
+              </w:rPr>
+              <w:t>按题型、难度、数量生成题目（已实现）：先按主题检索知识库片段，再交由大模型生成结构化 JSON，解析校验失败最多重试 2 次；客观题返回题干、选项、正确答案与解析，简答题附参考答案要点</w:t>
             </w:r>
           </w:p>
         </w:tc>
@@ -3739,14 +3738,13 @@
               <w:ind w:firstLine="0"/>
               <w:jc w:val="left"/>
             </w:pPr>
-            <w:r/>
-            <w:r>
-              <w:rPr>
-                <w:rFonts w:ascii="Times New Roman" w:hAnsi="Times New Roman" w:eastAsia="宋体"/>
-                <w:b w:val="0"/>
-                <w:sz w:val="21"/>
-              </w:rPr>
-              <w:t>提交答案即时判分，答错题目自动沉淀并记录用户答案与正确答案；按课程分组展示，支持按掌握状态筛选、标记掌握与移除</w:t>
+            <w:r>
+              <w:rPr>
+                <w:rFonts w:ascii="Times New Roman" w:hAnsi="Times New Roman" w:eastAsia="宋体"/>
+                <w:b w:val="0"/>
+                <w:sz w:val="21"/>
+              </w:rPr>
+              <w:t>提交答案即时判分，答错自动沉淀（已实现）：客观题按字符串比对判分，多选题先排序再比对；简答题调用大模型语义打分，失败时降级为关键词匹配；同一题目已有未掌握记录则不重复写入</w:t>
             </w:r>
           </w:p>
         </w:tc>
@@ -3804,14 +3802,13 @@
               <w:ind w:firstLine="0"/>
               <w:jc w:val="left"/>
             </w:pPr>
-            <w:r/>
-            <w:r>
-              <w:rPr>
-                <w:rFonts w:ascii="Times New Roman" w:hAnsi="Times New Roman" w:eastAsia="宋体"/>
-                <w:b w:val="0"/>
-                <w:sz w:val="21"/>
-              </w:rPr>
-              <w:t>基于错题与知识库内容生成复习计划，条目按日期组织并标注知识点；支持查看计划详情与标记完成；无可复习内容时给出明确提示</w:t>
+            <w:r>
+              <w:rPr>
+                <w:rFonts w:ascii="Times New Roman" w:hAnsi="Times New Roman" w:eastAsia="宋体"/>
+                <w:b w:val="0"/>
+                <w:sz w:val="21"/>
+              </w:rPr>
+              <w:t>基于错题生成 7 天复习计划（已实现）：读取未掌握错题，交由大模型分配知识点到 7 天，条目日期由服务端按当天日期计算写入，支持查看计划与标记完成；无错题时给出明确提示</w:t>
             </w:r>
           </w:p>
         </w:tc>
@@ -10694,6 +10691,1871 @@
           <w:sz w:val="24"/>
         </w:rPr>
         <w:t>物理层通过四类约束保证数据完整性：实体完整性，各表均以自增 BIGINT 为主键，保证记录可唯一标识；参照完整性，文档表、出题批次表、题目表、错题表、复习计划表均通过课程编号外键关联课程表，题目表关联出题批次表，错题表关联题目表，复习条目表关联复习计划表，且外键列均建立索引；域完整性，状态与题型字段的取值由应用层枚举约束，数值与字符串字段限定类型与长度，作答与复习日期等必填字段不允许为空；用户定义完整性，入库状态默认 processing、切分块数默认 0、难度默认 medium、掌握状态默认 unmastered、完成标志默认未完成。删除课程时，应用层严格按“复习条目—复习计划—错题—题目—出题批次—文档—课程”的逆序逐级清理，并同步删除向量库中对应的集合，从而避免产生孤儿记录与不一致状态。</w:t>
+      </w:r>
+    </w:p>
+    <w:p>
+      <w:pPr>
+        <w:spacing w:line="400" w:lineRule="exact" w:before="0" w:after="0"/>
+        <w:ind w:firstLine="480"/>
+        <w:jc w:val="both"/>
+      </w:pPr>
+      <w:r>
+        <w:rPr>
+          <w:rFonts w:ascii="Times New Roman" w:hAnsi="Times New Roman" w:eastAsia="宋体"/>
+          <w:b/>
+          <w:sz w:val="24"/>
+        </w:rPr>
+        <w:t>8．信息系统设计</w:t>
+      </w:r>
+    </w:p>
+    <w:p>
+      <w:pPr>
+        <w:spacing w:line="400" w:lineRule="exact" w:before="0" w:after="0"/>
+        <w:ind w:firstLine="480"/>
+        <w:jc w:val="both"/>
+      </w:pPr>
+      <w:r>
+        <w:rPr>
+          <w:rFonts w:ascii="Times New Roman" w:hAnsi="Times New Roman" w:eastAsia="宋体"/>
+          <w:sz w:val="24"/>
+        </w:rPr>
+        <w:t>系统功能划分为课程管理、文档管理、智能问答、自动出题、判题与错题、复习计划六个模块，各模块均通过课程编号组织数据，其接口与主要处理逻辑如表 12 所示。采用功能结构说明的主要作用是：清晰呈现系统的功能分解与各模块之间的数据依赖，便于分工实现与后期维护。</w:t>
+      </w:r>
+    </w:p>
+    <w:p>
+      <w:pPr>
+        <w:spacing w:line="400" w:lineRule="exact" w:before="0" w:after="0"/>
+        <w:ind w:firstLine="0"/>
+        <w:jc w:val="center"/>
+      </w:pPr>
+      <w:r>
+        <w:rPr>
+          <w:rFonts w:ascii="Times New Roman" w:hAnsi="Times New Roman" w:eastAsia="宋体"/>
+          <w:b w:val="0"/>
+          <w:sz w:val="21"/>
+        </w:rPr>
+        <w:t>表 12  系统功能模块划分</w:t>
+      </w:r>
+    </w:p>
+    <w:tbl>
+      <w:tblPr>
+        <w:tblStyle w:val="5"/>
+        <w:tblW w:type="auto" w:w="0"/>
+        <w:tblLayout w:type="fixed"/>
+        <w:tblLook w:firstColumn="1" w:firstRow="1" w:lastColumn="0" w:lastRow="0" w:noHBand="0" w:noVBand="1" w:val="04A0"/>
+      </w:tblPr>
+      <w:tblGrid>
+        <w:gridCol w:w="2769"/>
+        <w:gridCol w:w="2769"/>
+        <w:gridCol w:w="2769"/>
+      </w:tblGrid>
+      <w:tr>
+        <w:tc>
+          <w:tcPr>
+            <w:tcW w:type="dxa" w:w="1079"/>
+          </w:tcPr>
+          <w:p>
+            <w:pPr>
+              <w:spacing w:line="400" w:lineRule="exact" w:before="0" w:after="0"/>
+              <w:ind w:firstLine="0"/>
+              <w:jc w:val="center"/>
+            </w:pPr>
+            <w:r/>
+            <w:r>
+              <w:rPr>
+                <w:rFonts w:ascii="Times New Roman" w:hAnsi="Times New Roman" w:eastAsia="宋体"/>
+                <w:b/>
+                <w:sz w:val="21"/>
+              </w:rPr>
+              <w:t>模块</w:t>
+            </w:r>
+          </w:p>
+        </w:tc>
+        <w:tc>
+          <w:tcPr>
+            <w:tcW w:type="dxa" w:w="2589"/>
+          </w:tcPr>
+          <w:p>
+            <w:pPr>
+              <w:spacing w:line="400" w:lineRule="exact" w:before="0" w:after="0"/>
+              <w:ind w:firstLine="0"/>
+              <w:jc w:val="center"/>
+            </w:pPr>
+            <w:r/>
+            <w:r>
+              <w:rPr>
+                <w:rFonts w:ascii="Times New Roman" w:hAnsi="Times New Roman" w:eastAsia="宋体"/>
+                <w:b/>
+                <w:sz w:val="21"/>
+              </w:rPr>
+              <w:t>对应接口</w:t>
+            </w:r>
+          </w:p>
+        </w:tc>
+        <w:tc>
+          <w:tcPr>
+            <w:tcW w:type="dxa" w:w="4638"/>
+          </w:tcPr>
+          <w:p>
+            <w:pPr>
+              <w:spacing w:line="400" w:lineRule="exact" w:before="0" w:after="0"/>
+              <w:ind w:firstLine="0"/>
+              <w:jc w:val="center"/>
+            </w:pPr>
+            <w:r/>
+            <w:r>
+              <w:rPr>
+                <w:rFonts w:ascii="Times New Roman" w:hAnsi="Times New Roman" w:eastAsia="宋体"/>
+                <w:b/>
+                <w:sz w:val="21"/>
+              </w:rPr>
+              <w:t>主要处理逻辑</w:t>
+            </w:r>
+          </w:p>
+        </w:tc>
+      </w:tr>
+      <w:tr>
+        <w:tc>
+          <w:tcPr>
+            <w:tcW w:type="dxa" w:w="1079"/>
+          </w:tcPr>
+          <w:p>
+            <w:pPr>
+              <w:spacing w:line="400" w:lineRule="exact" w:before="0" w:after="0"/>
+              <w:ind w:firstLine="0"/>
+              <w:jc w:val="center"/>
+            </w:pPr>
+            <w:r/>
+            <w:r>
+              <w:rPr>
+                <w:rFonts w:ascii="Times New Roman" w:hAnsi="Times New Roman" w:eastAsia="宋体"/>
+                <w:b w:val="0"/>
+                <w:sz w:val="21"/>
+              </w:rPr>
+              <w:t>课程管理</w:t>
+            </w:r>
+          </w:p>
+        </w:tc>
+        <w:tc>
+          <w:tcPr>
+            <w:tcW w:type="dxa" w:w="2589"/>
+          </w:tcPr>
+          <w:p>
+            <w:pPr>
+              <w:spacing w:line="400" w:lineRule="exact" w:before="0" w:after="0"/>
+              <w:ind w:firstLine="0"/>
+              <w:jc w:val="left"/>
+            </w:pPr>
+            <w:r/>
+            <w:r>
+              <w:rPr>
+                <w:rFonts w:ascii="Times New Roman" w:hAnsi="Times New Roman" w:eastAsia="宋体"/>
+                <w:b w:val="0"/>
+                <w:sz w:val="21"/>
+              </w:rPr>
+              <w:t>POST/GET/DELETE /api/courses</w:t>
+            </w:r>
+          </w:p>
+        </w:tc>
+        <w:tc>
+          <w:tcPr>
+            <w:tcW w:type="dxa" w:w="4638"/>
+          </w:tcPr>
+          <w:p>
+            <w:pPr>
+              <w:spacing w:line="400" w:lineRule="exact" w:before="0" w:after="0"/>
+              <w:ind w:firstLine="0"/>
+              <w:jc w:val="left"/>
+            </w:pPr>
+            <w:r/>
+            <w:r>
+              <w:rPr>
+                <w:rFonts w:ascii="Times New Roman" w:hAnsi="Times New Roman" w:eastAsia="宋体"/>
+                <w:b w:val="0"/>
+                <w:sz w:val="21"/>
+              </w:rPr>
+              <w:t>课程增删改查，删除时级联清理全部关联数据与向量集合</w:t>
+            </w:r>
+          </w:p>
+        </w:tc>
+      </w:tr>
+      <w:tr>
+        <w:tc>
+          <w:tcPr>
+            <w:tcW w:type="dxa" w:w="1079"/>
+          </w:tcPr>
+          <w:p>
+            <w:pPr>
+              <w:spacing w:line="400" w:lineRule="exact" w:before="0" w:after="0"/>
+              <w:ind w:firstLine="0"/>
+              <w:jc w:val="center"/>
+            </w:pPr>
+            <w:r/>
+            <w:r>
+              <w:rPr>
+                <w:rFonts w:ascii="Times New Roman" w:hAnsi="Times New Roman" w:eastAsia="宋体"/>
+                <w:b w:val="0"/>
+                <w:sz w:val="21"/>
+              </w:rPr>
+              <w:t>文档管理</w:t>
+            </w:r>
+          </w:p>
+        </w:tc>
+        <w:tc>
+          <w:tcPr>
+            <w:tcW w:type="dxa" w:w="2589"/>
+          </w:tcPr>
+          <w:p>
+            <w:pPr>
+              <w:spacing w:line="400" w:lineRule="exact" w:before="0" w:after="0"/>
+              <w:ind w:firstLine="0"/>
+              <w:jc w:val="left"/>
+            </w:pPr>
+            <w:r/>
+            <w:r>
+              <w:rPr>
+                <w:rFonts w:ascii="Times New Roman" w:hAnsi="Times New Roman" w:eastAsia="宋体"/>
+                <w:b w:val="0"/>
+                <w:sz w:val="21"/>
+              </w:rPr>
+              <w:t>POST/GET /api/courses/{id}/documents</w:t>
+            </w:r>
+          </w:p>
+        </w:tc>
+        <w:tc>
+          <w:tcPr>
+            <w:tcW w:type="dxa" w:w="4638"/>
+          </w:tcPr>
+          <w:p>
+            <w:pPr>
+              <w:spacing w:line="400" w:lineRule="exact" w:before="0" w:after="0"/>
+              <w:ind w:firstLine="0"/>
+              <w:jc w:val="left"/>
+            </w:pPr>
+            <w:r/>
+            <w:r>
+              <w:rPr>
+                <w:rFonts w:ascii="Times New Roman" w:hAnsi="Times New Roman" w:eastAsia="宋体"/>
+                <w:b w:val="0"/>
+                <w:sz w:val="21"/>
+              </w:rPr>
+              <w:t>类型与大小校验、解析、切分、向量化，回写切分块数与入库状态</w:t>
+            </w:r>
+          </w:p>
+        </w:tc>
+      </w:tr>
+      <w:tr>
+        <w:tc>
+          <w:tcPr>
+            <w:tcW w:type="dxa" w:w="1079"/>
+          </w:tcPr>
+          <w:p>
+            <w:pPr>
+              <w:spacing w:line="400" w:lineRule="exact" w:before="0" w:after="0"/>
+              <w:ind w:firstLine="0"/>
+              <w:jc w:val="center"/>
+            </w:pPr>
+            <w:r/>
+            <w:r>
+              <w:rPr>
+                <w:rFonts w:ascii="Times New Roman" w:hAnsi="Times New Roman" w:eastAsia="宋体"/>
+                <w:b w:val="0"/>
+                <w:sz w:val="21"/>
+              </w:rPr>
+              <w:t>智能问答</w:t>
+            </w:r>
+          </w:p>
+        </w:tc>
+        <w:tc>
+          <w:tcPr>
+            <w:tcW w:type="dxa" w:w="2589"/>
+          </w:tcPr>
+          <w:p>
+            <w:pPr>
+              <w:spacing w:line="400" w:lineRule="exact" w:before="0" w:after="0"/>
+              <w:ind w:firstLine="0"/>
+              <w:jc w:val="left"/>
+            </w:pPr>
+            <w:r/>
+            <w:r>
+              <w:rPr>
+                <w:rFonts w:ascii="Times New Roman" w:hAnsi="Times New Roman" w:eastAsia="宋体"/>
+                <w:b w:val="0"/>
+                <w:sz w:val="21"/>
+              </w:rPr>
+              <w:t>POST /api/courses/{id}/chat</w:t>
+            </w:r>
+          </w:p>
+        </w:tc>
+        <w:tc>
+          <w:tcPr>
+            <w:tcW w:type="dxa" w:w="4638"/>
+          </w:tcPr>
+          <w:p>
+            <w:pPr>
+              <w:spacing w:line="400" w:lineRule="exact" w:before="0" w:after="0"/>
+              <w:ind w:firstLine="0"/>
+              <w:jc w:val="left"/>
+            </w:pPr>
+            <w:r/>
+            <w:r>
+              <w:rPr>
+                <w:rFonts w:ascii="Times New Roman" w:hAnsi="Times New Roman" w:eastAsia="宋体"/>
+                <w:b w:val="0"/>
+                <w:sz w:val="21"/>
+              </w:rPr>
+              <w:t>问题向量化后检索 top_k 条片段，拼接上下文交由大模型生成并返回引用来源</w:t>
+            </w:r>
+          </w:p>
+        </w:tc>
+      </w:tr>
+      <w:tr>
+        <w:tc>
+          <w:tcPr>
+            <w:tcW w:type="dxa" w:w="1079"/>
+          </w:tcPr>
+          <w:p>
+            <w:pPr>
+              <w:spacing w:line="400" w:lineRule="exact" w:before="0" w:after="0"/>
+              <w:ind w:firstLine="0"/>
+              <w:jc w:val="center"/>
+            </w:pPr>
+            <w:r/>
+            <w:r>
+              <w:rPr>
+                <w:rFonts w:ascii="Times New Roman" w:hAnsi="Times New Roman" w:eastAsia="宋体"/>
+                <w:b w:val="0"/>
+                <w:sz w:val="21"/>
+              </w:rPr>
+              <w:t>自动出题</w:t>
+            </w:r>
+          </w:p>
+        </w:tc>
+        <w:tc>
+          <w:tcPr>
+            <w:tcW w:type="dxa" w:w="2589"/>
+          </w:tcPr>
+          <w:p>
+            <w:pPr>
+              <w:spacing w:line="400" w:lineRule="exact" w:before="0" w:after="0"/>
+              <w:ind w:firstLine="0"/>
+              <w:jc w:val="left"/>
+            </w:pPr>
+            <w:r/>
+            <w:r>
+              <w:rPr>
+                <w:rFonts w:ascii="Times New Roman" w:hAnsi="Times New Roman" w:eastAsia="宋体"/>
+                <w:b w:val="0"/>
+                <w:sz w:val="21"/>
+              </w:rPr>
+              <w:t>POST /api/courses/{id}/quizzes/generate</w:t>
+            </w:r>
+          </w:p>
+        </w:tc>
+        <w:tc>
+          <w:tcPr>
+            <w:tcW w:type="dxa" w:w="4638"/>
+          </w:tcPr>
+          <w:p>
+            <w:pPr>
+              <w:spacing w:line="400" w:lineRule="exact" w:before="0" w:after="0"/>
+              <w:ind w:firstLine="0"/>
+              <w:jc w:val="left"/>
+            </w:pPr>
+            <w:r/>
+            <w:r>
+              <w:rPr>
+                <w:rFonts w:ascii="Times New Roman" w:hAnsi="Times New Roman" w:eastAsia="宋体"/>
+                <w:b w:val="0"/>
+                <w:sz w:val="21"/>
+              </w:rPr>
+              <w:t>按主题检索片段，大模型生成结构化 JSON，解析校验失败重试，写入批次与题目</w:t>
+            </w:r>
+          </w:p>
+        </w:tc>
+      </w:tr>
+      <w:tr>
+        <w:tc>
+          <w:tcPr>
+            <w:tcW w:type="dxa" w:w="1079"/>
+          </w:tcPr>
+          <w:p>
+            <w:pPr>
+              <w:spacing w:line="400" w:lineRule="exact" w:before="0" w:after="0"/>
+              <w:ind w:firstLine="0"/>
+              <w:jc w:val="center"/>
+            </w:pPr>
+            <w:r/>
+            <w:r>
+              <w:rPr>
+                <w:rFonts w:ascii="Times New Roman" w:hAnsi="Times New Roman" w:eastAsia="宋体"/>
+                <w:b w:val="0"/>
+                <w:sz w:val="21"/>
+              </w:rPr>
+              <w:t>判题与错题</w:t>
+            </w:r>
+          </w:p>
+        </w:tc>
+        <w:tc>
+          <w:tcPr>
+            <w:tcW w:type="dxa" w:w="2589"/>
+          </w:tcPr>
+          <w:p>
+            <w:pPr>
+              <w:spacing w:line="400" w:lineRule="exact" w:before="0" w:after="0"/>
+              <w:ind w:firstLine="0"/>
+              <w:jc w:val="left"/>
+            </w:pPr>
+            <w:r/>
+            <w:r>
+              <w:rPr>
+                <w:rFonts w:ascii="Times New Roman" w:hAnsi="Times New Roman" w:eastAsia="宋体"/>
+                <w:b w:val="0"/>
+                <w:sz w:val="21"/>
+              </w:rPr>
+              <w:t>POST /api/questions/{id}/submit</w:t>
+            </w:r>
+          </w:p>
+        </w:tc>
+        <w:tc>
+          <w:tcPr>
+            <w:tcW w:type="dxa" w:w="4638"/>
+          </w:tcPr>
+          <w:p>
+            <w:pPr>
+              <w:spacing w:line="400" w:lineRule="exact" w:before="0" w:after="0"/>
+              <w:ind w:firstLine="0"/>
+              <w:jc w:val="left"/>
+            </w:pPr>
+            <w:r/>
+            <w:r>
+              <w:rPr>
+                <w:rFonts w:ascii="Times New Roman" w:hAnsi="Times New Roman" w:eastAsia="宋体"/>
+                <w:b w:val="0"/>
+                <w:sz w:val="21"/>
+              </w:rPr>
+              <w:t>客观题字符串比对、简答题大模型语义打分，答错写入错题本</w:t>
+            </w:r>
+          </w:p>
+        </w:tc>
+      </w:tr>
+      <w:tr>
+        <w:tc>
+          <w:tcPr>
+            <w:tcW w:type="dxa" w:w="1079"/>
+          </w:tcPr>
+          <w:p>
+            <w:pPr>
+              <w:spacing w:line="400" w:lineRule="exact" w:before="0" w:after="0"/>
+              <w:ind w:firstLine="0"/>
+              <w:jc w:val="center"/>
+            </w:pPr>
+            <w:r/>
+            <w:r>
+              <w:rPr>
+                <w:rFonts w:ascii="Times New Roman" w:hAnsi="Times New Roman" w:eastAsia="宋体"/>
+                <w:b w:val="0"/>
+                <w:sz w:val="21"/>
+              </w:rPr>
+              <w:t>复习计划</w:t>
+            </w:r>
+          </w:p>
+        </w:tc>
+        <w:tc>
+          <w:tcPr>
+            <w:tcW w:type="dxa" w:w="2589"/>
+          </w:tcPr>
+          <w:p>
+            <w:pPr>
+              <w:spacing w:line="400" w:lineRule="exact" w:before="0" w:after="0"/>
+              <w:ind w:firstLine="0"/>
+              <w:jc w:val="left"/>
+            </w:pPr>
+            <w:r/>
+            <w:r>
+              <w:rPr>
+                <w:rFonts w:ascii="Times New Roman" w:hAnsi="Times New Roman" w:eastAsia="宋体"/>
+                <w:b w:val="0"/>
+                <w:sz w:val="21"/>
+              </w:rPr>
+              <w:t>POST /api/courses/{id}/review-plans</w:t>
+            </w:r>
+          </w:p>
+        </w:tc>
+        <w:tc>
+          <w:tcPr>
+            <w:tcW w:type="dxa" w:w="4638"/>
+          </w:tcPr>
+          <w:p>
+            <w:pPr>
+              <w:spacing w:line="400" w:lineRule="exact" w:before="0" w:after="0"/>
+              <w:ind w:firstLine="0"/>
+              <w:jc w:val="left"/>
+            </w:pPr>
+            <w:r/>
+            <w:r>
+              <w:rPr>
+                <w:rFonts w:ascii="Times New Roman" w:hAnsi="Times New Roman" w:eastAsia="宋体"/>
+                <w:b w:val="0"/>
+                <w:sz w:val="21"/>
+              </w:rPr>
+              <w:t>读取未掌握错题，大模型分配知识点到 7 天，服务端计算日期写入条目</w:t>
+            </w:r>
+          </w:p>
+        </w:tc>
+      </w:tr>
+    </w:tbl>
+    <w:p>
+      <w:pPr>
+        <w:spacing w:line="400" w:lineRule="exact" w:before="0" w:after="0"/>
+        <w:ind w:firstLine="480"/>
+        <w:jc w:val="both"/>
+      </w:pPr>
+      <w:r>
+        <w:rPr>
+          <w:rFonts w:ascii="Times New Roman" w:hAnsi="Times New Roman" w:eastAsia="宋体"/>
+          <w:b/>
+          <w:sz w:val="24"/>
+        </w:rPr>
+        <w:t>9．信息系统实现</w:t>
+      </w:r>
+    </w:p>
+    <w:p>
+      <w:pPr>
+        <w:spacing w:line="400" w:lineRule="exact" w:before="0" w:after="0"/>
+        <w:ind w:firstLine="480"/>
+        <w:jc w:val="both"/>
+      </w:pPr>
+      <w:r>
+        <w:rPr>
+          <w:rFonts w:ascii="Times New Roman" w:hAnsi="Times New Roman" w:eastAsia="宋体"/>
+          <w:b w:val="0"/>
+          <w:sz w:val="24"/>
+        </w:rPr>
+        <w:t>系统采用分层架构实现。路由层只负责参数校验与转发，不写业务逻辑；业务逻辑集中在服务层；数据模型与请求响应契约分别由 ORM 模型与 Pydantic Schema 定义。数据库通过 SQLAlchemy 建立引擎并注入会话，应用启动时调用元数据自动建表。以下以自动出题为例说明核心实现。</w:t>
+      </w:r>
+    </w:p>
+    <w:p>
+      <w:pPr>
+        <w:spacing w:line="400" w:lineRule="exact" w:before="0" w:after="0"/>
+        <w:ind w:firstLine="480"/>
+        <w:jc w:val="both"/>
+      </w:pPr>
+      <w:r>
+        <w:rPr>
+          <w:rFonts w:ascii="Times New Roman" w:hAnsi="Times New Roman" w:eastAsia="宋体"/>
+          <w:b w:val="0"/>
+          <w:sz w:val="24"/>
+        </w:rPr>
+        <w:t>自动出题的执行流程为：首先按出题主题（未指定时用默认查询词）从 Chroma 检索相关文本片段，拼接为参考资料；随后将题型、难度、数量等参数与参考资料一同填入出题提示词，交由大模型生成；模型输出经去除代码块标记、JSON 解析与字段校验后，取前 N 条作为结果；最后在同一数据库会话中先写出题批次记录并获取其编号，再批量写入题目记录后提交。若解析或调用失败则最多重试两次，仍失败则返回统一错误响应。</w:t>
+      </w:r>
+    </w:p>
+    <w:p>
+      <w:pPr>
+        <w:spacing w:line="400" w:lineRule="exact" w:before="0" w:after="0"/>
+        <w:ind w:firstLine="480"/>
+        <w:jc w:val="both"/>
+      </w:pPr>
+      <w:r>
+        <w:rPr>
+          <w:rFonts w:ascii="Times New Roman" w:hAnsi="Times New Roman" w:eastAsia="宋体"/>
+          <w:b w:val="0"/>
+          <w:sz w:val="24"/>
+        </w:rPr>
+        <w:t>判题环节针对题型采用不同策略：单选题与判断题直接比对答案字符串；多选题因作答顺序可能不同，先将用户答案与正确答案分别排序后再比对，使“AB”与“BA”等价；简答题先调用大模型做语义评分，若调用或解析失败则降级为关键词匹配——从参考答案中切分关键词，命中比例达到百分之六十即判为正确，仍无法判断时记为待复习。判为错误的题目会写入错题本，但同一题目若已存在未掌握记录则不重复插入。</w:t>
+      </w:r>
+    </w:p>
+    <w:p>
+      <w:pPr>
+        <w:spacing w:line="400" w:lineRule="exact" w:before="0" w:after="0"/>
+        <w:ind w:firstLine="480"/>
+        <w:jc w:val="both"/>
+      </w:pPr>
+      <w:r>
+        <w:rPr>
+          <w:rFonts w:ascii="Times New Roman" w:hAnsi="Times New Roman" w:eastAsia="宋体"/>
+          <w:b w:val="0"/>
+          <w:sz w:val="24"/>
+        </w:rPr>
+        <w:t>复习计划的生成同样复用大模型能力：读取该课程所有未掌握的错题及其解析，交由大模型将涉及的知识点分配到七天之内，输出的条目仅含“第几天”与知识点描述，具体日期由服务端以当天为基准计算后写入，避免因模型不了解当前日期而产生错误。</w:t>
+      </w:r>
+    </w:p>
+    <w:p>
+      <w:pPr>
+        <w:spacing w:line="400" w:lineRule="exact" w:before="0" w:after="0"/>
+        <w:ind w:firstLine="480"/>
+        <w:jc w:val="both"/>
+      </w:pPr>
+      <w:r>
+        <w:rPr>
+          <w:rFonts w:ascii="Times New Roman" w:hAnsi="Times New Roman" w:eastAsia="宋体"/>
+          <w:b/>
+          <w:sz w:val="24"/>
+        </w:rPr>
+        <w:t>10．系统测试</w:t>
+      </w:r>
+    </w:p>
+    <w:p>
+      <w:pPr>
+        <w:spacing w:line="400" w:lineRule="exact" w:before="0" w:after="0"/>
+        <w:ind w:firstLine="480"/>
+        <w:jc w:val="both"/>
+      </w:pPr>
+      <w:r>
+        <w:rPr>
+          <w:rFonts w:ascii="Times New Roman" w:hAnsi="Times New Roman" w:eastAsia="宋体"/>
+          <w:b w:val="0"/>
+          <w:sz w:val="24"/>
+        </w:rPr>
+        <w:t>系统采用功能测试与结构测试相结合的方式。功能测试从用户角度出发，验证各模块是否按需求工作；结构测试针对核心函数编写用例，验证内部逻辑的正确性。主要测试用例与预期结果如表 13 所示。</w:t>
+      </w:r>
+    </w:p>
+    <w:p>
+      <w:pPr>
+        <w:spacing w:line="400" w:lineRule="exact" w:before="0" w:after="0"/>
+        <w:ind w:firstLine="0"/>
+        <w:jc w:val="center"/>
+      </w:pPr>
+      <w:r>
+        <w:rPr>
+          <w:rFonts w:ascii="Times New Roman" w:hAnsi="Times New Roman" w:eastAsia="宋体"/>
+          <w:b w:val="0"/>
+          <w:sz w:val="21"/>
+        </w:rPr>
+        <w:t>表 13  主要测试用例与预期结果</w:t>
+      </w:r>
+    </w:p>
+    <w:tbl>
+      <w:tblPr>
+        <w:tblStyle w:val="5"/>
+        <w:tblW w:type="auto" w:w="0"/>
+        <w:tblLayout w:type="fixed"/>
+        <w:tblLook w:firstColumn="1" w:firstRow="1" w:lastColumn="0" w:lastRow="0" w:noHBand="0" w:noVBand="1" w:val="04A0"/>
+      </w:tblPr>
+      <w:tblGrid>
+        <w:gridCol w:w="2076"/>
+        <w:gridCol w:w="2076"/>
+        <w:gridCol w:w="2076"/>
+        <w:gridCol w:w="2076"/>
+      </w:tblGrid>
+      <w:tr>
+        <w:tc>
+          <w:tcPr>
+            <w:tcW w:type="dxa" w:w="971"/>
+          </w:tcPr>
+          <w:p>
+            <w:pPr>
+              <w:spacing w:line="400" w:lineRule="exact" w:before="0" w:after="0"/>
+              <w:ind w:firstLine="0"/>
+              <w:jc w:val="center"/>
+            </w:pPr>
+            <w:r/>
+            <w:r>
+              <w:rPr>
+                <w:rFonts w:ascii="Times New Roman" w:hAnsi="Times New Roman" w:eastAsia="宋体"/>
+                <w:b/>
+                <w:sz w:val="21"/>
+              </w:rPr>
+              <w:t>测试类型</w:t>
+            </w:r>
+          </w:p>
+        </w:tc>
+        <w:tc>
+          <w:tcPr>
+            <w:tcW w:type="dxa" w:w="1726"/>
+          </w:tcPr>
+          <w:p>
+            <w:pPr>
+              <w:spacing w:line="400" w:lineRule="exact" w:before="0" w:after="0"/>
+              <w:ind w:firstLine="0"/>
+              <w:jc w:val="center"/>
+            </w:pPr>
+            <w:r/>
+            <w:r>
+              <w:rPr>
+                <w:rFonts w:ascii="Times New Roman" w:hAnsi="Times New Roman" w:eastAsia="宋体"/>
+                <w:b/>
+                <w:sz w:val="21"/>
+              </w:rPr>
+              <w:t>测试内容</w:t>
+            </w:r>
+          </w:p>
+        </w:tc>
+        <w:tc>
+          <w:tcPr>
+            <w:tcW w:type="dxa" w:w="3236"/>
+          </w:tcPr>
+          <w:p>
+            <w:pPr>
+              <w:spacing w:line="400" w:lineRule="exact" w:before="0" w:after="0"/>
+              <w:ind w:firstLine="0"/>
+              <w:jc w:val="center"/>
+            </w:pPr>
+            <w:r/>
+            <w:r>
+              <w:rPr>
+                <w:rFonts w:ascii="Times New Roman" w:hAnsi="Times New Roman" w:eastAsia="宋体"/>
+                <w:b/>
+                <w:sz w:val="21"/>
+              </w:rPr>
+              <w:t>输入/操作</w:t>
+            </w:r>
+          </w:p>
+        </w:tc>
+        <w:tc>
+          <w:tcPr>
+            <w:tcW w:type="dxa" w:w="2373"/>
+          </w:tcPr>
+          <w:p>
+            <w:pPr>
+              <w:spacing w:line="400" w:lineRule="exact" w:before="0" w:after="0"/>
+              <w:ind w:firstLine="0"/>
+              <w:jc w:val="center"/>
+            </w:pPr>
+            <w:r/>
+            <w:r>
+              <w:rPr>
+                <w:rFonts w:ascii="Times New Roman" w:hAnsi="Times New Roman" w:eastAsia="宋体"/>
+                <w:b/>
+                <w:sz w:val="21"/>
+              </w:rPr>
+              <w:t>预期结果</w:t>
+            </w:r>
+          </w:p>
+        </w:tc>
+      </w:tr>
+      <w:tr>
+        <w:tc>
+          <w:tcPr>
+            <w:tcW w:type="dxa" w:w="971"/>
+          </w:tcPr>
+          <w:p>
+            <w:pPr>
+              <w:spacing w:line="400" w:lineRule="exact" w:before="0" w:after="0"/>
+              <w:ind w:firstLine="0"/>
+              <w:jc w:val="center"/>
+            </w:pPr>
+            <w:r/>
+            <w:r>
+              <w:rPr>
+                <w:rFonts w:ascii="Times New Roman" w:hAnsi="Times New Roman" w:eastAsia="宋体"/>
+                <w:b w:val="0"/>
+                <w:sz w:val="21"/>
+              </w:rPr>
+              <w:t>功能测试</w:t>
+            </w:r>
+          </w:p>
+        </w:tc>
+        <w:tc>
+          <w:tcPr>
+            <w:tcW w:type="dxa" w:w="1726"/>
+          </w:tcPr>
+          <w:p>
+            <w:pPr>
+              <w:spacing w:line="400" w:lineRule="exact" w:before="0" w:after="0"/>
+              <w:ind w:firstLine="0"/>
+              <w:jc w:val="left"/>
+            </w:pPr>
+            <w:r/>
+            <w:r>
+              <w:rPr>
+                <w:rFonts w:ascii="Times New Roman" w:hAnsi="Times New Roman" w:eastAsia="宋体"/>
+                <w:b w:val="0"/>
+                <w:sz w:val="21"/>
+              </w:rPr>
+              <w:t>课程创建</w:t>
+            </w:r>
+          </w:p>
+        </w:tc>
+        <w:tc>
+          <w:tcPr>
+            <w:tcW w:type="dxa" w:w="3236"/>
+          </w:tcPr>
+          <w:p>
+            <w:pPr>
+              <w:spacing w:line="400" w:lineRule="exact" w:before="0" w:after="0"/>
+              <w:ind w:firstLine="0"/>
+              <w:jc w:val="left"/>
+            </w:pPr>
+            <w:r/>
+            <w:r>
+              <w:rPr>
+                <w:rFonts w:ascii="Times New Roman" w:hAnsi="Times New Roman" w:eastAsia="宋体"/>
+                <w:b w:val="0"/>
+                <w:sz w:val="21"/>
+              </w:rPr>
+              <w:t>提交课程名称与描述</w:t>
+            </w:r>
+          </w:p>
+        </w:tc>
+        <w:tc>
+          <w:tcPr>
+            <w:tcW w:type="dxa" w:w="2373"/>
+          </w:tcPr>
+          <w:p>
+            <w:pPr>
+              <w:spacing w:line="400" w:lineRule="exact" w:before="0" w:after="0"/>
+              <w:ind w:firstLine="0"/>
+              <w:jc w:val="left"/>
+            </w:pPr>
+            <w:r/>
+            <w:r>
+              <w:rPr>
+                <w:rFonts w:ascii="Times New Roman" w:hAnsi="Times New Roman" w:eastAsia="宋体"/>
+                <w:b w:val="0"/>
+                <w:sz w:val="21"/>
+              </w:rPr>
+              <w:t>返回课程信息，列表可查询到该课程</w:t>
+            </w:r>
+          </w:p>
+        </w:tc>
+      </w:tr>
+      <w:tr>
+        <w:tc>
+          <w:tcPr>
+            <w:tcW w:type="dxa" w:w="971"/>
+          </w:tcPr>
+          <w:p>
+            <w:pPr>
+              <w:spacing w:line="400" w:lineRule="exact" w:before="0" w:after="0"/>
+              <w:ind w:firstLine="0"/>
+              <w:jc w:val="center"/>
+            </w:pPr>
+            <w:r/>
+            <w:r>
+              <w:rPr>
+                <w:rFonts w:ascii="Times New Roman" w:hAnsi="Times New Roman" w:eastAsia="宋体"/>
+                <w:b w:val="0"/>
+                <w:sz w:val="21"/>
+              </w:rPr>
+              <w:t>功能测试</w:t>
+            </w:r>
+          </w:p>
+        </w:tc>
+        <w:tc>
+          <w:tcPr>
+            <w:tcW w:type="dxa" w:w="1726"/>
+          </w:tcPr>
+          <w:p>
+            <w:pPr>
+              <w:spacing w:line="400" w:lineRule="exact" w:before="0" w:after="0"/>
+              <w:ind w:firstLine="0"/>
+              <w:jc w:val="left"/>
+            </w:pPr>
+            <w:r/>
+            <w:r>
+              <w:rPr>
+                <w:rFonts w:ascii="Times New Roman" w:hAnsi="Times New Roman" w:eastAsia="宋体"/>
+                <w:b w:val="0"/>
+                <w:sz w:val="21"/>
+              </w:rPr>
+              <w:t>文档上传与入库</w:t>
+            </w:r>
+          </w:p>
+        </w:tc>
+        <w:tc>
+          <w:tcPr>
+            <w:tcW w:type="dxa" w:w="3236"/>
+          </w:tcPr>
+          <w:p>
+            <w:pPr>
+              <w:spacing w:line="400" w:lineRule="exact" w:before="0" w:after="0"/>
+              <w:ind w:firstLine="0"/>
+              <w:jc w:val="left"/>
+            </w:pPr>
+            <w:r/>
+            <w:r>
+              <w:rPr>
+                <w:rFonts w:ascii="Times New Roman" w:hAnsi="Times New Roman" w:eastAsia="宋体"/>
+                <w:b w:val="0"/>
+                <w:sz w:val="21"/>
+              </w:rPr>
+              <w:t>上传 PDF/DOCX/MD/TXT 文档</w:t>
+            </w:r>
+          </w:p>
+        </w:tc>
+        <w:tc>
+          <w:tcPr>
+            <w:tcW w:type="dxa" w:w="2373"/>
+          </w:tcPr>
+          <w:p>
+            <w:pPr>
+              <w:spacing w:line="400" w:lineRule="exact" w:before="0" w:after="0"/>
+              <w:ind w:firstLine="0"/>
+              <w:jc w:val="left"/>
+            </w:pPr>
+            <w:r/>
+            <w:r>
+              <w:rPr>
+                <w:rFonts w:ascii="Times New Roman" w:hAnsi="Times New Roman" w:eastAsia="宋体"/>
+                <w:b w:val="0"/>
+                <w:sz w:val="21"/>
+              </w:rPr>
+              <w:t>返回切分块数，状态变为 completed，可进行问答</w:t>
+            </w:r>
+          </w:p>
+        </w:tc>
+      </w:tr>
+      <w:tr>
+        <w:tc>
+          <w:tcPr>
+            <w:tcW w:type="dxa" w:w="971"/>
+          </w:tcPr>
+          <w:p>
+            <w:pPr>
+              <w:spacing w:line="400" w:lineRule="exact" w:before="0" w:after="0"/>
+              <w:ind w:firstLine="0"/>
+              <w:jc w:val="center"/>
+            </w:pPr>
+            <w:r/>
+            <w:r>
+              <w:rPr>
+                <w:rFonts w:ascii="Times New Roman" w:hAnsi="Times New Roman" w:eastAsia="宋体"/>
+                <w:b w:val="0"/>
+                <w:sz w:val="21"/>
+              </w:rPr>
+              <w:t>功能测试</w:t>
+            </w:r>
+          </w:p>
+        </w:tc>
+        <w:tc>
+          <w:tcPr>
+            <w:tcW w:type="dxa" w:w="1726"/>
+          </w:tcPr>
+          <w:p>
+            <w:pPr>
+              <w:spacing w:line="400" w:lineRule="exact" w:before="0" w:after="0"/>
+              <w:ind w:firstLine="0"/>
+              <w:jc w:val="left"/>
+            </w:pPr>
+            <w:r/>
+            <w:r>
+              <w:rPr>
+                <w:rFonts w:ascii="Times New Roman" w:hAnsi="Times New Roman" w:eastAsia="宋体"/>
+                <w:b w:val="0"/>
+                <w:sz w:val="21"/>
+              </w:rPr>
+              <w:t>文档类型校验</w:t>
+            </w:r>
+          </w:p>
+        </w:tc>
+        <w:tc>
+          <w:tcPr>
+            <w:tcW w:type="dxa" w:w="3236"/>
+          </w:tcPr>
+          <w:p>
+            <w:pPr>
+              <w:spacing w:line="400" w:lineRule="exact" w:before="0" w:after="0"/>
+              <w:ind w:firstLine="0"/>
+              <w:jc w:val="left"/>
+            </w:pPr>
+            <w:r/>
+            <w:r>
+              <w:rPr>
+                <w:rFonts w:ascii="Times New Roman" w:hAnsi="Times New Roman" w:eastAsia="宋体"/>
+                <w:b w:val="0"/>
+                <w:sz w:val="21"/>
+              </w:rPr>
+              <w:t>上传非白名单格式文件</w:t>
+            </w:r>
+          </w:p>
+        </w:tc>
+        <w:tc>
+          <w:tcPr>
+            <w:tcW w:type="dxa" w:w="2373"/>
+          </w:tcPr>
+          <w:p>
+            <w:pPr>
+              <w:spacing w:line="400" w:lineRule="exact" w:before="0" w:after="0"/>
+              <w:ind w:firstLine="0"/>
+              <w:jc w:val="left"/>
+            </w:pPr>
+            <w:r/>
+            <w:r>
+              <w:rPr>
+                <w:rFonts w:ascii="Times New Roman" w:hAnsi="Times New Roman" w:eastAsia="宋体"/>
+                <w:b w:val="0"/>
+                <w:sz w:val="21"/>
+              </w:rPr>
+              <w:t>拒绝上传并提示支持的文件类型</w:t>
+            </w:r>
+          </w:p>
+        </w:tc>
+      </w:tr>
+      <w:tr>
+        <w:tc>
+          <w:tcPr>
+            <w:tcW w:type="dxa" w:w="971"/>
+          </w:tcPr>
+          <w:p>
+            <w:pPr>
+              <w:spacing w:line="400" w:lineRule="exact" w:before="0" w:after="0"/>
+              <w:ind w:firstLine="0"/>
+              <w:jc w:val="center"/>
+            </w:pPr>
+            <w:r/>
+            <w:r>
+              <w:rPr>
+                <w:rFonts w:ascii="Times New Roman" w:hAnsi="Times New Roman" w:eastAsia="宋体"/>
+                <w:b w:val="0"/>
+                <w:sz w:val="21"/>
+              </w:rPr>
+              <w:t>功能测试</w:t>
+            </w:r>
+          </w:p>
+        </w:tc>
+        <w:tc>
+          <w:tcPr>
+            <w:tcW w:type="dxa" w:w="1726"/>
+          </w:tcPr>
+          <w:p>
+            <w:pPr>
+              <w:spacing w:line="400" w:lineRule="exact" w:before="0" w:after="0"/>
+              <w:ind w:firstLine="0"/>
+              <w:jc w:val="left"/>
+            </w:pPr>
+            <w:r/>
+            <w:r>
+              <w:rPr>
+                <w:rFonts w:ascii="Times New Roman" w:hAnsi="Times New Roman" w:eastAsia="宋体"/>
+                <w:b w:val="0"/>
+                <w:sz w:val="21"/>
+              </w:rPr>
+              <w:t>智能问答</w:t>
+            </w:r>
+          </w:p>
+        </w:tc>
+        <w:tc>
+          <w:tcPr>
+            <w:tcW w:type="dxa" w:w="3236"/>
+          </w:tcPr>
+          <w:p>
+            <w:pPr>
+              <w:spacing w:line="400" w:lineRule="exact" w:before="0" w:after="0"/>
+              <w:ind w:firstLine="0"/>
+              <w:jc w:val="left"/>
+            </w:pPr>
+            <w:r/>
+            <w:r>
+              <w:rPr>
+                <w:rFonts w:ascii="Times New Roman" w:hAnsi="Times New Roman" w:eastAsia="宋体"/>
+                <w:b w:val="0"/>
+                <w:sz w:val="21"/>
+              </w:rPr>
+              <w:t>在已建知识库的课程下提问</w:t>
+            </w:r>
+          </w:p>
+        </w:tc>
+        <w:tc>
+          <w:tcPr>
+            <w:tcW w:type="dxa" w:w="2373"/>
+          </w:tcPr>
+          <w:p>
+            <w:pPr>
+              <w:spacing w:line="400" w:lineRule="exact" w:before="0" w:after="0"/>
+              <w:ind w:firstLine="0"/>
+              <w:jc w:val="left"/>
+            </w:pPr>
+            <w:r/>
+            <w:r>
+              <w:rPr>
+                <w:rFonts w:ascii="Times New Roman" w:hAnsi="Times New Roman" w:eastAsia="宋体"/>
+                <w:b w:val="0"/>
+                <w:sz w:val="21"/>
+              </w:rPr>
+              <w:t>返回基于资料的回答，并附引用来源</w:t>
+            </w:r>
+          </w:p>
+        </w:tc>
+      </w:tr>
+      <w:tr>
+        <w:tc>
+          <w:tcPr>
+            <w:tcW w:type="dxa" w:w="971"/>
+          </w:tcPr>
+          <w:p>
+            <w:pPr>
+              <w:spacing w:line="400" w:lineRule="exact" w:before="0" w:after="0"/>
+              <w:ind w:firstLine="0"/>
+              <w:jc w:val="center"/>
+            </w:pPr>
+            <w:r/>
+            <w:r>
+              <w:rPr>
+                <w:rFonts w:ascii="Times New Roman" w:hAnsi="Times New Roman" w:eastAsia="宋体"/>
+                <w:b w:val="0"/>
+                <w:sz w:val="21"/>
+              </w:rPr>
+              <w:t>功能测试</w:t>
+            </w:r>
+          </w:p>
+        </w:tc>
+        <w:tc>
+          <w:tcPr>
+            <w:tcW w:type="dxa" w:w="1726"/>
+          </w:tcPr>
+          <w:p>
+            <w:pPr>
+              <w:spacing w:line="400" w:lineRule="exact" w:before="0" w:after="0"/>
+              <w:ind w:firstLine="0"/>
+              <w:jc w:val="left"/>
+            </w:pPr>
+            <w:r/>
+            <w:r>
+              <w:rPr>
+                <w:rFonts w:ascii="Times New Roman" w:hAnsi="Times New Roman" w:eastAsia="宋体"/>
+                <w:b w:val="0"/>
+                <w:sz w:val="21"/>
+              </w:rPr>
+              <w:t>空库提问</w:t>
+            </w:r>
+          </w:p>
+        </w:tc>
+        <w:tc>
+          <w:tcPr>
+            <w:tcW w:type="dxa" w:w="3236"/>
+          </w:tcPr>
+          <w:p>
+            <w:pPr>
+              <w:spacing w:line="400" w:lineRule="exact" w:before="0" w:after="0"/>
+              <w:ind w:firstLine="0"/>
+              <w:jc w:val="left"/>
+            </w:pPr>
+            <w:r/>
+            <w:r>
+              <w:rPr>
+                <w:rFonts w:ascii="Times New Roman" w:hAnsi="Times New Roman" w:eastAsia="宋体"/>
+                <w:b w:val="0"/>
+                <w:sz w:val="21"/>
+              </w:rPr>
+              <w:t>在未有文档的课程下提问</w:t>
+            </w:r>
+          </w:p>
+        </w:tc>
+        <w:tc>
+          <w:tcPr>
+            <w:tcW w:type="dxa" w:w="2373"/>
+          </w:tcPr>
+          <w:p>
+            <w:pPr>
+              <w:spacing w:line="400" w:lineRule="exact" w:before="0" w:after="0"/>
+              <w:ind w:firstLine="0"/>
+              <w:jc w:val="left"/>
+            </w:pPr>
+            <w:r/>
+            <w:r>
+              <w:rPr>
+                <w:rFonts w:ascii="Times New Roman" w:hAnsi="Times New Roman" w:eastAsia="宋体"/>
+                <w:b w:val="0"/>
+                <w:sz w:val="21"/>
+              </w:rPr>
+              <w:t>返回友好提示，引导先上传文档</w:t>
+            </w:r>
+          </w:p>
+        </w:tc>
+      </w:tr>
+      <w:tr>
+        <w:tc>
+          <w:tcPr>
+            <w:tcW w:type="dxa" w:w="971"/>
+          </w:tcPr>
+          <w:p>
+            <w:pPr>
+              <w:spacing w:line="400" w:lineRule="exact" w:before="0" w:after="0"/>
+              <w:ind w:firstLine="0"/>
+              <w:jc w:val="center"/>
+            </w:pPr>
+            <w:r/>
+            <w:r>
+              <w:rPr>
+                <w:rFonts w:ascii="Times New Roman" w:hAnsi="Times New Roman" w:eastAsia="宋体"/>
+                <w:b w:val="0"/>
+                <w:sz w:val="21"/>
+              </w:rPr>
+              <w:t>功能测试</w:t>
+            </w:r>
+          </w:p>
+        </w:tc>
+        <w:tc>
+          <w:tcPr>
+            <w:tcW w:type="dxa" w:w="1726"/>
+          </w:tcPr>
+          <w:p>
+            <w:pPr>
+              <w:spacing w:line="400" w:lineRule="exact" w:before="0" w:after="0"/>
+              <w:ind w:firstLine="0"/>
+              <w:jc w:val="left"/>
+            </w:pPr>
+            <w:r/>
+            <w:r>
+              <w:rPr>
+                <w:rFonts w:ascii="Times New Roman" w:hAnsi="Times New Roman" w:eastAsia="宋体"/>
+                <w:b w:val="0"/>
+                <w:sz w:val="21"/>
+              </w:rPr>
+              <w:t>自动出题</w:t>
+            </w:r>
+          </w:p>
+        </w:tc>
+        <w:tc>
+          <w:tcPr>
+            <w:tcW w:type="dxa" w:w="3236"/>
+          </w:tcPr>
+          <w:p>
+            <w:pPr>
+              <w:spacing w:line="400" w:lineRule="exact" w:before="0" w:after="0"/>
+              <w:ind w:firstLine="0"/>
+              <w:jc w:val="left"/>
+            </w:pPr>
+            <w:r/>
+            <w:r>
+              <w:rPr>
+                <w:rFonts w:ascii="Times New Roman" w:hAnsi="Times New Roman" w:eastAsia="宋体"/>
+                <w:b w:val="0"/>
+                <w:sz w:val="21"/>
+              </w:rPr>
+              <w:t>指定题型、难度与数量生成题目</w:t>
+            </w:r>
+          </w:p>
+        </w:tc>
+        <w:tc>
+          <w:tcPr>
+            <w:tcW w:type="dxa" w:w="2373"/>
+          </w:tcPr>
+          <w:p>
+            <w:pPr>
+              <w:spacing w:line="400" w:lineRule="exact" w:before="0" w:after="0"/>
+              <w:ind w:firstLine="0"/>
+              <w:jc w:val="left"/>
+            </w:pPr>
+            <w:r/>
+            <w:r>
+              <w:rPr>
+                <w:rFonts w:ascii="Times New Roman" w:hAnsi="Times New Roman" w:eastAsia="宋体"/>
+                <w:b w:val="0"/>
+                <w:sz w:val="21"/>
+              </w:rPr>
+              <w:t>返回指定数量的结构化题目，含选项、答案与解析</w:t>
+            </w:r>
+          </w:p>
+        </w:tc>
+      </w:tr>
+      <w:tr>
+        <w:tc>
+          <w:tcPr>
+            <w:tcW w:type="dxa" w:w="971"/>
+          </w:tcPr>
+          <w:p>
+            <w:pPr>
+              <w:spacing w:line="400" w:lineRule="exact" w:before="0" w:after="0"/>
+              <w:ind w:firstLine="0"/>
+              <w:jc w:val="center"/>
+            </w:pPr>
+            <w:r/>
+            <w:r>
+              <w:rPr>
+                <w:rFonts w:ascii="Times New Roman" w:hAnsi="Times New Roman" w:eastAsia="宋体"/>
+                <w:b w:val="0"/>
+                <w:sz w:val="21"/>
+              </w:rPr>
+              <w:t>功能测试</w:t>
+            </w:r>
+          </w:p>
+        </w:tc>
+        <w:tc>
+          <w:tcPr>
+            <w:tcW w:type="dxa" w:w="1726"/>
+          </w:tcPr>
+          <w:p>
+            <w:pPr>
+              <w:spacing w:line="400" w:lineRule="exact" w:before="0" w:after="0"/>
+              <w:ind w:firstLine="0"/>
+              <w:jc w:val="left"/>
+            </w:pPr>
+            <w:r/>
+            <w:r>
+              <w:rPr>
+                <w:rFonts w:ascii="Times New Roman" w:hAnsi="Times New Roman" w:eastAsia="宋体"/>
+                <w:b w:val="0"/>
+                <w:sz w:val="21"/>
+              </w:rPr>
+              <w:t>客观题判题</w:t>
+            </w:r>
+          </w:p>
+        </w:tc>
+        <w:tc>
+          <w:tcPr>
+            <w:tcW w:type="dxa" w:w="3236"/>
+          </w:tcPr>
+          <w:p>
+            <w:pPr>
+              <w:spacing w:line="400" w:lineRule="exact" w:before="0" w:after="0"/>
+              <w:ind w:firstLine="0"/>
+              <w:jc w:val="left"/>
+            </w:pPr>
+            <w:r/>
+            <w:r>
+              <w:rPr>
+                <w:rFonts w:ascii="Times New Roman" w:hAnsi="Times New Roman" w:eastAsia="宋体"/>
+                <w:b w:val="0"/>
+                <w:sz w:val="21"/>
+              </w:rPr>
+              <w:t>提交正确/错误答案</w:t>
+            </w:r>
+          </w:p>
+        </w:tc>
+        <w:tc>
+          <w:tcPr>
+            <w:tcW w:type="dxa" w:w="2373"/>
+          </w:tcPr>
+          <w:p>
+            <w:pPr>
+              <w:spacing w:line="400" w:lineRule="exact" w:before="0" w:after="0"/>
+              <w:ind w:firstLine="0"/>
+              <w:jc w:val="left"/>
+            </w:pPr>
+            <w:r/>
+            <w:r>
+              <w:rPr>
+                <w:rFonts w:ascii="Times New Roman" w:hAnsi="Times New Roman" w:eastAsia="宋体"/>
+                <w:b w:val="0"/>
+                <w:sz w:val="21"/>
+              </w:rPr>
+              <w:t>正确时不写入错题本，错误时自动沉淀错题</w:t>
+            </w:r>
+          </w:p>
+        </w:tc>
+      </w:tr>
+      <w:tr>
+        <w:tc>
+          <w:tcPr>
+            <w:tcW w:type="dxa" w:w="971"/>
+          </w:tcPr>
+          <w:p>
+            <w:pPr>
+              <w:spacing w:line="400" w:lineRule="exact" w:before="0" w:after="0"/>
+              <w:ind w:firstLine="0"/>
+              <w:jc w:val="center"/>
+            </w:pPr>
+            <w:r/>
+            <w:r>
+              <w:rPr>
+                <w:rFonts w:ascii="Times New Roman" w:hAnsi="Times New Roman" w:eastAsia="宋体"/>
+                <w:b w:val="0"/>
+                <w:sz w:val="21"/>
+              </w:rPr>
+              <w:t>功能测试</w:t>
+            </w:r>
+          </w:p>
+        </w:tc>
+        <w:tc>
+          <w:tcPr>
+            <w:tcW w:type="dxa" w:w="1726"/>
+          </w:tcPr>
+          <w:p>
+            <w:pPr>
+              <w:spacing w:line="400" w:lineRule="exact" w:before="0" w:after="0"/>
+              <w:ind w:firstLine="0"/>
+              <w:jc w:val="left"/>
+            </w:pPr>
+            <w:r/>
+            <w:r>
+              <w:rPr>
+                <w:rFonts w:ascii="Times New Roman" w:hAnsi="Times New Roman" w:eastAsia="宋体"/>
+                <w:b w:val="0"/>
+                <w:sz w:val="21"/>
+              </w:rPr>
+              <w:t>简答题判分</w:t>
+            </w:r>
+          </w:p>
+        </w:tc>
+        <w:tc>
+          <w:tcPr>
+            <w:tcW w:type="dxa" w:w="3236"/>
+          </w:tcPr>
+          <w:p>
+            <w:pPr>
+              <w:spacing w:line="400" w:lineRule="exact" w:before="0" w:after="0"/>
+              <w:ind w:firstLine="0"/>
+              <w:jc w:val="left"/>
+            </w:pPr>
+            <w:r/>
+            <w:r>
+              <w:rPr>
+                <w:rFonts w:ascii="Times New Roman" w:hAnsi="Times New Roman" w:eastAsia="宋体"/>
+                <w:b w:val="0"/>
+                <w:sz w:val="21"/>
+              </w:rPr>
+              <w:t>提交语义相近的作答</w:t>
+            </w:r>
+          </w:p>
+        </w:tc>
+        <w:tc>
+          <w:tcPr>
+            <w:tcW w:type="dxa" w:w="2373"/>
+          </w:tcPr>
+          <w:p>
+            <w:pPr>
+              <w:spacing w:line="400" w:lineRule="exact" w:before="0" w:after="0"/>
+              <w:ind w:firstLine="0"/>
+              <w:jc w:val="left"/>
+            </w:pPr>
+            <w:r/>
+            <w:r>
+              <w:rPr>
+                <w:rFonts w:ascii="Times New Roman" w:hAnsi="Times New Roman" w:eastAsia="宋体"/>
+                <w:b w:val="0"/>
+                <w:sz w:val="21"/>
+              </w:rPr>
+              <w:t>判为正确，返回评分与批改理由</w:t>
+            </w:r>
+          </w:p>
+        </w:tc>
+      </w:tr>
+      <w:tr>
+        <w:tc>
+          <w:tcPr>
+            <w:tcW w:type="dxa" w:w="971"/>
+          </w:tcPr>
+          <w:p>
+            <w:pPr>
+              <w:spacing w:line="400" w:lineRule="exact" w:before="0" w:after="0"/>
+              <w:ind w:firstLine="0"/>
+              <w:jc w:val="center"/>
+            </w:pPr>
+            <w:r/>
+            <w:r>
+              <w:rPr>
+                <w:rFonts w:ascii="Times New Roman" w:hAnsi="Times New Roman" w:eastAsia="宋体"/>
+                <w:b w:val="0"/>
+                <w:sz w:val="21"/>
+              </w:rPr>
+              <w:t>功能测试</w:t>
+            </w:r>
+          </w:p>
+        </w:tc>
+        <w:tc>
+          <w:tcPr>
+            <w:tcW w:type="dxa" w:w="1726"/>
+          </w:tcPr>
+          <w:p>
+            <w:pPr>
+              <w:spacing w:line="400" w:lineRule="exact" w:before="0" w:after="0"/>
+              <w:ind w:firstLine="0"/>
+              <w:jc w:val="left"/>
+            </w:pPr>
+            <w:r/>
+            <w:r>
+              <w:rPr>
+                <w:rFonts w:ascii="Times New Roman" w:hAnsi="Times New Roman" w:eastAsia="宋体"/>
+                <w:b w:val="0"/>
+                <w:sz w:val="21"/>
+              </w:rPr>
+              <w:t>复习计划生成</w:t>
+            </w:r>
+          </w:p>
+        </w:tc>
+        <w:tc>
+          <w:tcPr>
+            <w:tcW w:type="dxa" w:w="3236"/>
+          </w:tcPr>
+          <w:p>
+            <w:pPr>
+              <w:spacing w:line="400" w:lineRule="exact" w:before="0" w:after="0"/>
+              <w:ind w:firstLine="0"/>
+              <w:jc w:val="left"/>
+            </w:pPr>
+            <w:r/>
+            <w:r>
+              <w:rPr>
+                <w:rFonts w:ascii="Times New Roman" w:hAnsi="Times New Roman" w:eastAsia="宋体"/>
+                <w:b w:val="0"/>
+                <w:sz w:val="21"/>
+              </w:rPr>
+              <w:t>存在未掌握错题时生成计划</w:t>
+            </w:r>
+          </w:p>
+        </w:tc>
+        <w:tc>
+          <w:tcPr>
+            <w:tcW w:type="dxa" w:w="2373"/>
+          </w:tcPr>
+          <w:p>
+            <w:pPr>
+              <w:spacing w:line="400" w:lineRule="exact" w:before="0" w:after="0"/>
+              <w:ind w:firstLine="0"/>
+              <w:jc w:val="left"/>
+            </w:pPr>
+            <w:r/>
+            <w:r>
+              <w:rPr>
+                <w:rFonts w:ascii="Times New Roman" w:hAnsi="Times New Roman" w:eastAsia="宋体"/>
+                <w:b w:val="0"/>
+                <w:sz w:val="21"/>
+              </w:rPr>
+              <w:t>返回七天的复习条目，日期自当天起算</w:t>
+            </w:r>
+          </w:p>
+        </w:tc>
+      </w:tr>
+      <w:tr>
+        <w:tc>
+          <w:tcPr>
+            <w:tcW w:type="dxa" w:w="971"/>
+          </w:tcPr>
+          <w:p>
+            <w:pPr>
+              <w:spacing w:line="400" w:lineRule="exact" w:before="0" w:after="0"/>
+              <w:ind w:firstLine="0"/>
+              <w:jc w:val="center"/>
+            </w:pPr>
+            <w:r/>
+            <w:r>
+              <w:rPr>
+                <w:rFonts w:ascii="Times New Roman" w:hAnsi="Times New Roman" w:eastAsia="宋体"/>
+                <w:b w:val="0"/>
+                <w:sz w:val="21"/>
+              </w:rPr>
+              <w:t>功能测试</w:t>
+            </w:r>
+          </w:p>
+        </w:tc>
+        <w:tc>
+          <w:tcPr>
+            <w:tcW w:type="dxa" w:w="1726"/>
+          </w:tcPr>
+          <w:p>
+            <w:pPr>
+              <w:spacing w:line="400" w:lineRule="exact" w:before="0" w:after="0"/>
+              <w:ind w:firstLine="0"/>
+              <w:jc w:val="left"/>
+            </w:pPr>
+            <w:r/>
+            <w:r>
+              <w:rPr>
+                <w:rFonts w:ascii="Times New Roman" w:hAnsi="Times New Roman" w:eastAsia="宋体"/>
+                <w:b w:val="0"/>
+                <w:sz w:val="21"/>
+              </w:rPr>
+              <w:t>无错题生成计划</w:t>
+            </w:r>
+          </w:p>
+        </w:tc>
+        <w:tc>
+          <w:tcPr>
+            <w:tcW w:type="dxa" w:w="3236"/>
+          </w:tcPr>
+          <w:p>
+            <w:pPr>
+              <w:spacing w:line="400" w:lineRule="exact" w:before="0" w:after="0"/>
+              <w:ind w:firstLine="0"/>
+              <w:jc w:val="left"/>
+            </w:pPr>
+            <w:r/>
+            <w:r>
+              <w:rPr>
+                <w:rFonts w:ascii="Times New Roman" w:hAnsi="Times New Roman" w:eastAsia="宋体"/>
+                <w:b w:val="0"/>
+                <w:sz w:val="21"/>
+              </w:rPr>
+              <w:t>无未掌握错题时生成计划</w:t>
+            </w:r>
+          </w:p>
+        </w:tc>
+        <w:tc>
+          <w:tcPr>
+            <w:tcW w:type="dxa" w:w="2373"/>
+          </w:tcPr>
+          <w:p>
+            <w:pPr>
+              <w:spacing w:line="400" w:lineRule="exact" w:before="0" w:after="0"/>
+              <w:ind w:firstLine="0"/>
+              <w:jc w:val="left"/>
+            </w:pPr>
+            <w:r/>
+            <w:r>
+              <w:rPr>
+                <w:rFonts w:ascii="Times New Roman" w:hAnsi="Times New Roman" w:eastAsia="宋体"/>
+                <w:b w:val="0"/>
+                <w:sz w:val="21"/>
+              </w:rPr>
+              <w:t>返回提示，说明暂无需要复习的内容</w:t>
+            </w:r>
+          </w:p>
+        </w:tc>
+      </w:tr>
+      <w:tr>
+        <w:tc>
+          <w:tcPr>
+            <w:tcW w:type="dxa" w:w="971"/>
+          </w:tcPr>
+          <w:p>
+            <w:pPr>
+              <w:spacing w:line="400" w:lineRule="exact" w:before="0" w:after="0"/>
+              <w:ind w:firstLine="0"/>
+              <w:jc w:val="center"/>
+            </w:pPr>
+            <w:r/>
+            <w:r>
+              <w:rPr>
+                <w:rFonts w:ascii="Times New Roman" w:hAnsi="Times New Roman" w:eastAsia="宋体"/>
+                <w:b w:val="0"/>
+                <w:sz w:val="21"/>
+              </w:rPr>
+              <w:t>结构测试</w:t>
+            </w:r>
+          </w:p>
+        </w:tc>
+        <w:tc>
+          <w:tcPr>
+            <w:tcW w:type="dxa" w:w="1726"/>
+          </w:tcPr>
+          <w:p>
+            <w:pPr>
+              <w:spacing w:line="400" w:lineRule="exact" w:before="0" w:after="0"/>
+              <w:ind w:firstLine="0"/>
+              <w:jc w:val="left"/>
+            </w:pPr>
+            <w:r/>
+            <w:r>
+              <w:rPr>
+                <w:rFonts w:ascii="Times New Roman" w:hAnsi="Times New Roman" w:eastAsia="宋体"/>
+                <w:b w:val="0"/>
+                <w:sz w:val="21"/>
+              </w:rPr>
+              <w:t>多选题答案比对</w:t>
+            </w:r>
+          </w:p>
+        </w:tc>
+        <w:tc>
+          <w:tcPr>
+            <w:tcW w:type="dxa" w:w="3236"/>
+          </w:tcPr>
+          <w:p>
+            <w:pPr>
+              <w:spacing w:line="400" w:lineRule="exact" w:before="0" w:after="0"/>
+              <w:ind w:firstLine="0"/>
+              <w:jc w:val="left"/>
+            </w:pPr>
+            <w:r/>
+            <w:r>
+              <w:rPr>
+                <w:rFonts w:ascii="Times New Roman" w:hAnsi="Times New Roman" w:eastAsia="宋体"/>
+                <w:b w:val="0"/>
+                <w:sz w:val="21"/>
+              </w:rPr>
+              <w:t>用户答案“BA”，正确答案“AB”</w:t>
+            </w:r>
+          </w:p>
+        </w:tc>
+        <w:tc>
+          <w:tcPr>
+            <w:tcW w:type="dxa" w:w="2373"/>
+          </w:tcPr>
+          <w:p>
+            <w:pPr>
+              <w:spacing w:line="400" w:lineRule="exact" w:before="0" w:after="0"/>
+              <w:ind w:firstLine="0"/>
+              <w:jc w:val="left"/>
+            </w:pPr>
+            <w:r/>
+            <w:r>
+              <w:rPr>
+                <w:rFonts w:ascii="Times New Roman" w:hAnsi="Times New Roman" w:eastAsia="宋体"/>
+                <w:b w:val="0"/>
+                <w:sz w:val="21"/>
+              </w:rPr>
+              <w:t>排序后比对一致，判为正确</w:t>
+            </w:r>
+          </w:p>
+        </w:tc>
+      </w:tr>
+      <w:tr>
+        <w:tc>
+          <w:tcPr>
+            <w:tcW w:type="dxa" w:w="971"/>
+          </w:tcPr>
+          <w:p>
+            <w:pPr>
+              <w:spacing w:line="400" w:lineRule="exact" w:before="0" w:after="0"/>
+              <w:ind w:firstLine="0"/>
+              <w:jc w:val="center"/>
+            </w:pPr>
+            <w:r/>
+            <w:r>
+              <w:rPr>
+                <w:rFonts w:ascii="Times New Roman" w:hAnsi="Times New Roman" w:eastAsia="宋体"/>
+                <w:b w:val="0"/>
+                <w:sz w:val="21"/>
+              </w:rPr>
+              <w:t>结构测试</w:t>
+            </w:r>
+          </w:p>
+        </w:tc>
+        <w:tc>
+          <w:tcPr>
+            <w:tcW w:type="dxa" w:w="1726"/>
+          </w:tcPr>
+          <w:p>
+            <w:pPr>
+              <w:spacing w:line="400" w:lineRule="exact" w:before="0" w:after="0"/>
+              <w:ind w:firstLine="0"/>
+              <w:jc w:val="left"/>
+            </w:pPr>
+            <w:r/>
+            <w:r>
+              <w:rPr>
+                <w:rFonts w:ascii="Times New Roman" w:hAnsi="Times New Roman" w:eastAsia="宋体"/>
+                <w:b w:val="0"/>
+                <w:sz w:val="21"/>
+              </w:rPr>
+              <w:t>文本切分</w:t>
+            </w:r>
+          </w:p>
+        </w:tc>
+        <w:tc>
+          <w:tcPr>
+            <w:tcW w:type="dxa" w:w="3236"/>
+          </w:tcPr>
+          <w:p>
+            <w:pPr>
+              <w:spacing w:line="400" w:lineRule="exact" w:before="0" w:after="0"/>
+              <w:ind w:firstLine="0"/>
+              <w:jc w:val="left"/>
+            </w:pPr>
+            <w:r/>
+            <w:r>
+              <w:rPr>
+                <w:rFonts w:ascii="Times New Roman" w:hAnsi="Times New Roman" w:eastAsia="宋体"/>
+                <w:b w:val="0"/>
+                <w:sz w:val="21"/>
+              </w:rPr>
+              <w:t>输入长文本，块长 500、重叠 50</w:t>
+            </w:r>
+          </w:p>
+        </w:tc>
+        <w:tc>
+          <w:tcPr>
+            <w:tcW w:type="dxa" w:w="2373"/>
+          </w:tcPr>
+          <w:p>
+            <w:pPr>
+              <w:spacing w:line="400" w:lineRule="exact" w:before="0" w:after="0"/>
+              <w:ind w:firstLine="0"/>
+              <w:jc w:val="left"/>
+            </w:pPr>
+            <w:r/>
+            <w:r>
+              <w:rPr>
+                <w:rFonts w:ascii="Times New Roman" w:hAnsi="Times New Roman" w:eastAsia="宋体"/>
+                <w:b w:val="0"/>
+                <w:sz w:val="21"/>
+              </w:rPr>
+              <w:t>切分结果为若干块，相邻块存在 50 字符重叠</w:t>
+            </w:r>
+          </w:p>
+        </w:tc>
+      </w:tr>
+      <w:tr>
+        <w:tc>
+          <w:tcPr>
+            <w:tcW w:type="dxa" w:w="971"/>
+          </w:tcPr>
+          <w:p>
+            <w:pPr>
+              <w:spacing w:line="400" w:lineRule="exact" w:before="0" w:after="0"/>
+              <w:ind w:firstLine="0"/>
+              <w:jc w:val="center"/>
+            </w:pPr>
+            <w:r/>
+            <w:r>
+              <w:rPr>
+                <w:rFonts w:ascii="Times New Roman" w:hAnsi="Times New Roman" w:eastAsia="宋体"/>
+                <w:b w:val="0"/>
+                <w:sz w:val="21"/>
+              </w:rPr>
+              <w:t>结构测试</w:t>
+            </w:r>
+          </w:p>
+        </w:tc>
+        <w:tc>
+          <w:tcPr>
+            <w:tcW w:type="dxa" w:w="1726"/>
+          </w:tcPr>
+          <w:p>
+            <w:pPr>
+              <w:spacing w:line="400" w:lineRule="exact" w:before="0" w:after="0"/>
+              <w:ind w:firstLine="0"/>
+              <w:jc w:val="left"/>
+            </w:pPr>
+            <w:r/>
+            <w:r>
+              <w:rPr>
+                <w:rFonts w:ascii="Times New Roman" w:hAnsi="Times New Roman" w:eastAsia="宋体"/>
+                <w:b w:val="0"/>
+                <w:sz w:val="21"/>
+              </w:rPr>
+              <w:t>JSON 解析</w:t>
+            </w:r>
+          </w:p>
+        </w:tc>
+        <w:tc>
+          <w:tcPr>
+            <w:tcW w:type="dxa" w:w="3236"/>
+          </w:tcPr>
+          <w:p>
+            <w:pPr>
+              <w:spacing w:line="400" w:lineRule="exact" w:before="0" w:after="0"/>
+              <w:ind w:firstLine="0"/>
+              <w:jc w:val="left"/>
+            </w:pPr>
+            <w:r/>
+            <w:r>
+              <w:rPr>
+                <w:rFonts w:ascii="Times New Roman" w:hAnsi="Times New Roman" w:eastAsia="宋体"/>
+                <w:b w:val="0"/>
+                <w:sz w:val="21"/>
+              </w:rPr>
+              <w:t>模型输出含代码块标记的 JSON</w:t>
+            </w:r>
+          </w:p>
+        </w:tc>
+        <w:tc>
+          <w:tcPr>
+            <w:tcW w:type="dxa" w:w="2373"/>
+          </w:tcPr>
+          <w:p>
+            <w:pPr>
+              <w:spacing w:line="400" w:lineRule="exact" w:before="0" w:after="0"/>
+              <w:ind w:firstLine="0"/>
+              <w:jc w:val="left"/>
+            </w:pPr>
+            <w:r/>
+            <w:r>
+              <w:rPr>
+                <w:rFonts w:ascii="Times New Roman" w:hAnsi="Times New Roman" w:eastAsia="宋体"/>
+                <w:b w:val="0"/>
+                <w:sz w:val="21"/>
+              </w:rPr>
+              <w:t>去除标记后解析成功，取出题目列表</w:t>
+            </w:r>
+          </w:p>
+        </w:tc>
+      </w:tr>
+    </w:tbl>
+    <w:p>
+      <w:pPr>
+        <w:spacing w:line="400" w:lineRule="exact" w:before="0" w:after="0"/>
+        <w:ind w:firstLine="480"/>
+        <w:jc w:val="both"/>
+      </w:pPr>
+      <w:r>
+        <w:rPr>
+          <w:rFonts w:ascii="Times New Roman" w:hAnsi="Times New Roman" w:eastAsia="宋体"/>
+          <w:b w:val="0"/>
+          <w:sz w:val="24"/>
+        </w:rPr>
+        <w:t>测试结果表明，课程管理、文档上传与入库、智能问答、自动出题、判题与错题沉淀、复习计划生成六项核心功能均能按预期工作；边界场景（空库提问、非法文件类型、无错题生成计划）均能返回明确提示而不产生异常。多选题顺序无关比对与简答题降级判分两项结构测试验证了核心逻辑在各种输入下的正确性。</w:t>
       </w:r>
     </w:p>
     <w:p>

</xml_diff>

<commit_message>
docs: complete process discussion section and add UI showcase slide
- report: add fig3 (architecture), fig4 (ingest/QA flow), fig5 (quiz/grading/review flow)

- report: add key code snippets for ingest, QA, quiz gen, grading, review plan

- report: add section 11 UI description with 5 screenshot placeholders (fig6-10)

- ppt: add slide 13 system UI showcase with 5 screenshot placeholders; renumber to 17 pages
</commit_message>
<xml_diff>
--- a/defense/1组-张三-23级计算机科学与技术1班-课程设计报告.docx
+++ b/defense/1组-张三-23级计算机科学与技术1班-课程设计报告.docx
@@ -10737,6 +10737,62 @@
         <w:t>表 12  系统功能模块划分</w:t>
       </w:r>
     </w:p>
+    <w:p>
+      <w:pPr>
+        <w:spacing w:before="0" w:after="0"/>
+        <w:ind w:firstLine="0"/>
+        <w:jc w:val="center"/>
+      </w:pPr>
+      <w:r>
+        <w:drawing>
+          <wp:inline xmlns:a="http://schemas.openxmlformats.org/drawingml/2006/main" xmlns:pic="http://schemas.openxmlformats.org/drawingml/2006/picture">
+            <wp:extent cx="5472000" cy="2904767"/>
+            <wp:docPr id="23" name="Picture 23"/>
+            <wp:cNvGraphicFramePr>
+              <a:graphicFrameLocks noChangeAspect="1"/>
+            </wp:cNvGraphicFramePr>
+            <a:graphic>
+              <a:graphicData uri="http://schemas.openxmlformats.org/drawingml/2006/picture">
+                <pic:pic>
+                  <pic:nvPicPr>
+                    <pic:cNvPr id="0" name="fig3_arch.png"/>
+                    <pic:cNvPicPr/>
+                  </pic:nvPicPr>
+                  <pic:blipFill>
+                    <a:blip r:embed="rId10"/>
+                    <a:stretch>
+                      <a:fillRect/>
+                    </a:stretch>
+                  </pic:blipFill>
+                  <pic:spPr>
+                    <a:xfrm>
+                      <a:off x="0" y="0"/>
+                      <a:ext cx="5472000" cy="2904767"/>
+                    </a:xfrm>
+                    <a:prstGeom prst="rect"/>
+                  </pic:spPr>
+                </pic:pic>
+              </a:graphicData>
+            </a:graphic>
+          </wp:inline>
+        </w:drawing>
+      </w:r>
+    </w:p>
+    <w:p>
+      <w:pPr>
+        <w:spacing w:line="400" w:lineRule="exact" w:before="0" w:after="0"/>
+        <w:ind w:firstLine="0"/>
+        <w:jc w:val="center"/>
+      </w:pPr>
+      <w:r>
+        <w:rPr>
+          <w:rFonts w:ascii="Times New Roman" w:hAnsi="Times New Roman" w:eastAsia="宋体"/>
+          <w:b w:val="0"/>
+          <w:sz w:val="21"/>
+        </w:rPr>
+        <w:t>图 3  智学助手系统功能结构图</w:t>
+      </w:r>
+    </w:p>
     <w:tbl>
       <w:tblPr>
         <w:tblStyle w:val="5"/>
@@ -11277,7 +11333,63 @@
           <w:b w:val="0"/>
           <w:sz w:val="24"/>
         </w:rPr>
-        <w:t>复习计划的生成同样复用大模型能力：读取该课程所有未掌握的错题及其解析，交由大模型将涉及的知识点分配到七天之内，输出的条目仅含“第几天”与知识点描述，具体日期由服务端以当天为基准计算后写入，避免因模型不了解当前日期而产生错误。</w:t>
+        <w:t>系统的核心业务链路分为两条：一是文档入库链路，二是智能问答链路。采用流程图的主要作用是：清晰呈现各处理步骤的先后顺序以及关键判断分支的处理方式，便于理解系统的执行过程与异常路径。文档入库与智能问答的流程如图 4 所示。</w:t>
+      </w:r>
+    </w:p>
+    <w:p>
+      <w:pPr>
+        <w:spacing w:before="0" w:after="0"/>
+        <w:ind w:firstLine="0"/>
+        <w:jc w:val="center"/>
+      </w:pPr>
+      <w:r>
+        <w:drawing>
+          <wp:inline xmlns:a="http://schemas.openxmlformats.org/drawingml/2006/main" xmlns:pic="http://schemas.openxmlformats.org/drawingml/2006/picture">
+            <wp:extent cx="4824000" cy="4601211"/>
+            <wp:docPr id="24" name="Picture 24"/>
+            <wp:cNvGraphicFramePr>
+              <a:graphicFrameLocks noChangeAspect="1"/>
+            </wp:cNvGraphicFramePr>
+            <a:graphic>
+              <a:graphicData uri="http://schemas.openxmlformats.org/drawingml/2006/picture">
+                <pic:pic>
+                  <pic:nvPicPr>
+                    <pic:cNvPr id="0" name="fig4_flow.png"/>
+                    <pic:cNvPicPr/>
+                  </pic:nvPicPr>
+                  <pic:blipFill>
+                    <a:blip r:embed="rId11"/>
+                    <a:stretch>
+                      <a:fillRect/>
+                    </a:stretch>
+                  </pic:blipFill>
+                  <pic:spPr>
+                    <a:xfrm>
+                      <a:off x="0" y="0"/>
+                      <a:ext cx="4824000" cy="4601211"/>
+                    </a:xfrm>
+                    <a:prstGeom prst="rect"/>
+                  </pic:spPr>
+                </pic:pic>
+              </a:graphicData>
+            </a:graphic>
+          </wp:inline>
+        </w:drawing>
+      </w:r>
+    </w:p>
+    <w:p>
+      <w:pPr>
+        <w:spacing w:line="400" w:lineRule="exact" w:before="0" w:after="0"/>
+        <w:ind w:firstLine="0"/>
+        <w:jc w:val="center"/>
+      </w:pPr>
+      <w:r>
+        <w:rPr>
+          <w:rFonts w:ascii="Times New Roman" w:hAnsi="Times New Roman" w:eastAsia="宋体"/>
+          <w:b w:val="0"/>
+          <w:sz w:val="21"/>
+        </w:rPr>
+        <w:t>图 4  文档入库与智能问答流程图</w:t>
       </w:r>
     </w:p>
     <w:p>
@@ -11289,10 +11401,1531 @@
       <w:r>
         <w:rPr>
           <w:rFonts w:ascii="Times New Roman" w:hAnsi="Times New Roman" w:eastAsia="宋体"/>
+          <w:b w:val="0"/>
+          <w:sz w:val="24"/>
+        </w:rPr>
+        <w:t>图 4 中，上半部分为文档入库流程：文档上传后先经过类型与大小校验，不通过则拒绝并提示；通过后由 LangChain 的文档加载器解析为纯文本，再按 500 字符、重叠 50 字符的策略切分；切分结果经 Embedding 模型向量化后写入 Chroma，同时在 MySQL 的文档表中创建记录，最终将状态置为 completed 并返回切分块数。下半部分为智能问答流程：用户提问后问题被向量化，在向量库中按相似度检索若干片段；若无结果则提示先上传文档；有结果时将片段拼接为上下文填入提示词，交由大模型生成回答，最终返回回答与引用来源。</w:t>
+      </w:r>
+    </w:p>
+    <w:p>
+      <w:pPr>
+        <w:spacing w:line="400" w:lineRule="exact" w:before="0" w:after="0"/>
+        <w:ind w:firstLine="480"/>
+        <w:jc w:val="both"/>
+      </w:pPr>
+      <w:r>
+        <w:rPr>
+          <w:rFonts w:ascii="Times New Roman" w:hAnsi="Times New Roman" w:eastAsia="宋体"/>
+          <w:b w:val="0"/>
+          <w:sz w:val="24"/>
+        </w:rPr>
+        <w:t>文档入库环节的关键代码如下，其职责是解析、切分、向量化并回写状态：</w:t>
+      </w:r>
+    </w:p>
+    <w:p>
+      <w:pPr>
+        <w:spacing w:line="400" w:lineRule="exact" w:before="0" w:after="0"/>
+        <w:ind w:firstLine="0"/>
+        <w:jc w:val="both"/>
+      </w:pPr>
+      <w:r>
+        <w:rPr>
+          <w:rFonts w:ascii="Times New Roman" w:hAnsi="Times New Roman" w:eastAsia="宋体"/>
           <w:b/>
+          <w:sz w:val="22"/>
+        </w:rPr>
+        <w:t>核心代码：</w:t>
+      </w:r>
+    </w:p>
+    <w:p>
+      <w:pPr>
+        <w:spacing w:line="260" w:lineRule="exact" w:before="0" w:after="0"/>
+        <w:ind w:firstLine="0" w:left="120"/>
+        <w:jc w:val="left"/>
+        <w:shd w:val="clear" w:fill="F5F5F5"/>
+      </w:pPr>
+      <w:r>
+        <w:rPr>
+          <w:rFonts w:ascii="Consolas" w:hAnsi="Consolas" w:eastAsia="宋体"/>
+          <w:b w:val="0"/>
+          <w:sz w:val="18"/>
+        </w:rPr>
+        <w:t># app/services/document_service.py</w:t>
+      </w:r>
+    </w:p>
+    <w:p>
+      <w:pPr>
+        <w:spacing w:line="260" w:lineRule="exact" w:before="0" w:after="0"/>
+        <w:ind w:firstLine="0" w:left="120"/>
+        <w:jc w:val="left"/>
+        <w:shd w:val="clear" w:fill="F5F5F5"/>
+      </w:pPr>
+      <w:r>
+        <w:rPr>
+          <w:rFonts w:ascii="Consolas" w:hAnsi="Consolas" w:eastAsia="宋体"/>
+          <w:b w:val="0"/>
+          <w:sz w:val="18"/>
+        </w:rPr>
+        <w:t>loader = _select_loader(file_path)               # 按扩展名选择 Loader</w:t>
+      </w:r>
+    </w:p>
+    <w:p>
+      <w:pPr>
+        <w:spacing w:line="260" w:lineRule="exact" w:before="0" w:after="0"/>
+        <w:ind w:firstLine="0" w:left="120"/>
+        <w:jc w:val="left"/>
+        <w:shd w:val="clear" w:fill="F5F5F5"/>
+      </w:pPr>
+      <w:r>
+        <w:rPr>
+          <w:rFonts w:ascii="Consolas" w:hAnsi="Consolas" w:eastAsia="宋体"/>
+          <w:b w:val="0"/>
+          <w:sz w:val="18"/>
+        </w:rPr>
+        <w:t>raw_docs = loader.load()                         # 解析为纯文本</w:t>
+      </w:r>
+    </w:p>
+    <w:p>
+      <w:pPr>
+        <w:spacing w:line="260" w:lineRule="exact" w:before="0" w:after="0"/>
+        <w:ind w:firstLine="0" w:left="120"/>
+        <w:jc w:val="left"/>
+        <w:shd w:val="clear" w:fill="F5F5F5"/>
+      </w:pPr>
+      <w:r>
+        <w:rPr>
+          <w:rFonts w:ascii="Consolas" w:hAnsi="Consolas" w:eastAsia="宋体"/>
+          <w:b w:val="0"/>
+          <w:sz w:val="18"/>
+        </w:rPr>
+        <w:t>chunks = split_documents(raw_docs, file_type)    # 切分（md 走两层策略）</w:t>
+      </w:r>
+    </w:p>
+    <w:p>
+      <w:pPr>
+        <w:spacing w:line="260" w:lineRule="exact" w:before="0" w:after="0"/>
+        <w:ind w:firstLine="0" w:left="120"/>
+        <w:jc w:val="left"/>
+        <w:shd w:val="clear" w:fill="F5F5F5"/>
+      </w:pPr>
+      <w:r>
+        <w:rPr>
+          <w:rFonts w:ascii="Consolas" w:hAnsi="Consolas" w:eastAsia="宋体"/>
+          <w:b w:val="0"/>
+          <w:sz w:val="18"/>
+        </w:rPr>
+        <w:t xml:space="preserve"> </w:t>
+      </w:r>
+    </w:p>
+    <w:p>
+      <w:pPr>
+        <w:spacing w:line="260" w:lineRule="exact" w:before="0" w:after="0"/>
+        <w:ind w:firstLine="0" w:left="120"/>
+        <w:jc w:val="left"/>
+        <w:shd w:val="clear" w:fill="F5F5F5"/>
+      </w:pPr>
+      <w:r>
+        <w:rPr>
+          <w:rFonts w:ascii="Consolas" w:hAnsi="Consolas" w:eastAsia="宋体"/>
+          <w:b w:val="0"/>
+          <w:sz w:val="18"/>
+        </w:rPr>
+        <w:t>vectorstore = get_vectorstore(f"course_{course_id}")</w:t>
+      </w:r>
+    </w:p>
+    <w:p>
+      <w:pPr>
+        <w:spacing w:line="260" w:lineRule="exact" w:before="0" w:after="0"/>
+        <w:ind w:firstLine="0" w:left="120"/>
+        <w:jc w:val="left"/>
+        <w:shd w:val="clear" w:fill="F5F5F5"/>
+      </w:pPr>
+      <w:r>
+        <w:rPr>
+          <w:rFonts w:ascii="Consolas" w:hAnsi="Consolas" w:eastAsia="宋体"/>
+          <w:b w:val="0"/>
+          <w:sz w:val="18"/>
+        </w:rPr>
+        <w:t>vectorstore.add_texts(texts, metadatas)          # 向量化并写入 Chroma</w:t>
+      </w:r>
+    </w:p>
+    <w:p>
+      <w:pPr>
+        <w:spacing w:line="260" w:lineRule="exact" w:before="0" w:after="0"/>
+        <w:ind w:firstLine="0" w:left="120"/>
+        <w:jc w:val="left"/>
+        <w:shd w:val="clear" w:fill="F5F5F5"/>
+      </w:pPr>
+      <w:r>
+        <w:rPr>
+          <w:rFonts w:ascii="Consolas" w:hAnsi="Consolas" w:eastAsia="宋体"/>
+          <w:b w:val="0"/>
+          <w:sz w:val="18"/>
+        </w:rPr>
+        <w:t xml:space="preserve"> </w:t>
+      </w:r>
+    </w:p>
+    <w:p>
+      <w:pPr>
+        <w:spacing w:line="260" w:lineRule="exact" w:before="0" w:after="0"/>
+        <w:ind w:firstLine="0" w:left="120"/>
+        <w:jc w:val="left"/>
+        <w:shd w:val="clear" w:fill="F5F5F5"/>
+      </w:pPr>
+      <w:r>
+        <w:rPr>
+          <w:rFonts w:ascii="Consolas" w:hAnsi="Consolas" w:eastAsia="宋体"/>
+          <w:b w:val="0"/>
+          <w:sz w:val="18"/>
+        </w:rPr>
+        <w:t>doc.chunk_count = len(chunks)</w:t>
+      </w:r>
+    </w:p>
+    <w:p>
+      <w:pPr>
+        <w:spacing w:line="260" w:lineRule="exact" w:before="0" w:after="0"/>
+        <w:ind w:firstLine="0" w:left="120"/>
+        <w:jc w:val="left"/>
+        <w:shd w:val="clear" w:fill="F5F5F5"/>
+      </w:pPr>
+      <w:r>
+        <w:rPr>
+          <w:rFonts w:ascii="Consolas" w:hAnsi="Consolas" w:eastAsia="宋体"/>
+          <w:b w:val="0"/>
+          <w:sz w:val="18"/>
+        </w:rPr>
+        <w:t>doc.status = "completed"                         # 回写入库状态</w:t>
+      </w:r>
+    </w:p>
+    <w:p>
+      <w:pPr>
+        <w:spacing w:line="260" w:lineRule="exact" w:before="0" w:after="0"/>
+        <w:ind w:firstLine="0" w:left="120"/>
+        <w:jc w:val="left"/>
+        <w:shd w:val="clear" w:fill="F5F5F5"/>
+      </w:pPr>
+      <w:r>
+        <w:rPr>
+          <w:rFonts w:ascii="Consolas" w:hAnsi="Consolas" w:eastAsia="宋体"/>
+          <w:b w:val="0"/>
+          <w:sz w:val="18"/>
+        </w:rPr>
+        <w:t>db.commit()</w:t>
+      </w:r>
+    </w:p>
+    <w:p>
+      <w:pPr>
+        <w:spacing w:line="400" w:lineRule="exact" w:before="0" w:after="0"/>
+        <w:ind w:firstLine="480"/>
+        <w:jc w:val="both"/>
+      </w:pPr>
+      <w:r>
+        <w:rPr>
+          <w:rFonts w:ascii="Times New Roman" w:hAnsi="Times New Roman" w:eastAsia="宋体"/>
+          <w:b w:val="0"/>
+          <w:sz w:val="24"/>
+        </w:rPr>
+        <w:t>智能问答环节的关键代码如下，检索与生成分离，回答附带可溯源的引用片段：</w:t>
+      </w:r>
+    </w:p>
+    <w:p>
+      <w:pPr>
+        <w:spacing w:line="400" w:lineRule="exact" w:before="0" w:after="0"/>
+        <w:ind w:firstLine="0"/>
+        <w:jc w:val="both"/>
+      </w:pPr>
+      <w:r>
+        <w:rPr>
+          <w:rFonts w:ascii="Times New Roman" w:hAnsi="Times New Roman" w:eastAsia="宋体"/>
+          <w:b/>
+          <w:sz w:val="22"/>
+        </w:rPr>
+        <w:t>核心代码：</w:t>
+      </w:r>
+    </w:p>
+    <w:p>
+      <w:pPr>
+        <w:spacing w:line="260" w:lineRule="exact" w:before="0" w:after="0"/>
+        <w:ind w:firstLine="0" w:left="120"/>
+        <w:jc w:val="left"/>
+        <w:shd w:val="clear" w:fill="F5F5F5"/>
+      </w:pPr>
+      <w:r>
+        <w:rPr>
+          <w:rFonts w:ascii="Consolas" w:hAnsi="Consolas" w:eastAsia="宋体"/>
+          <w:b w:val="0"/>
+          <w:sz w:val="18"/>
+        </w:rPr>
+        <w:t># app/services/rag_service.py</w:t>
+      </w:r>
+    </w:p>
+    <w:p>
+      <w:pPr>
+        <w:spacing w:line="260" w:lineRule="exact" w:before="0" w:after="0"/>
+        <w:ind w:firstLine="0" w:left="120"/>
+        <w:jc w:val="left"/>
+        <w:shd w:val="clear" w:fill="F5F5F5"/>
+      </w:pPr>
+      <w:r>
+        <w:rPr>
+          <w:rFonts w:ascii="Consolas" w:hAnsi="Consolas" w:eastAsia="宋体"/>
+          <w:b w:val="0"/>
+          <w:sz w:val="18"/>
+        </w:rPr>
+        <w:t>def retrieve_documents(course_id, query, top_k=None):</w:t>
+      </w:r>
+    </w:p>
+    <w:p>
+      <w:pPr>
+        <w:spacing w:line="260" w:lineRule="exact" w:before="0" w:after="0"/>
+        <w:ind w:firstLine="0" w:left="120"/>
+        <w:jc w:val="left"/>
+        <w:shd w:val="clear" w:fill="F5F5F5"/>
+      </w:pPr>
+      <w:r>
+        <w:rPr>
+          <w:rFonts w:ascii="Consolas" w:hAnsi="Consolas" w:eastAsia="宋体"/>
+          <w:b w:val="0"/>
+          <w:sz w:val="18"/>
+        </w:rPr>
+        <w:t xml:space="preserve">    vs = get_vectorstore(f"course_{course_id}")      # 按课程隔离</w:t>
+      </w:r>
+    </w:p>
+    <w:p>
+      <w:pPr>
+        <w:spacing w:line="260" w:lineRule="exact" w:before="0" w:after="0"/>
+        <w:ind w:firstLine="0" w:left="120"/>
+        <w:jc w:val="left"/>
+        <w:shd w:val="clear" w:fill="F5F5F5"/>
+      </w:pPr>
+      <w:r>
+        <w:rPr>
+          <w:rFonts w:ascii="Consolas" w:hAnsi="Consolas" w:eastAsia="宋体"/>
+          <w:b w:val="0"/>
+          <w:sz w:val="18"/>
+        </w:rPr>
+        <w:t xml:space="preserve">    q = f"{BGE_QUERY_PREFIX}{query}"                 # bge-m3 查询前缀</w:t>
+      </w:r>
+    </w:p>
+    <w:p>
+      <w:pPr>
+        <w:spacing w:line="260" w:lineRule="exact" w:before="0" w:after="0"/>
+        <w:ind w:firstLine="0" w:left="120"/>
+        <w:jc w:val="left"/>
+        <w:shd w:val="clear" w:fill="F5F5F5"/>
+      </w:pPr>
+      <w:r>
+        <w:rPr>
+          <w:rFonts w:ascii="Consolas" w:hAnsi="Consolas" w:eastAsia="宋体"/>
+          <w:b w:val="0"/>
+          <w:sz w:val="18"/>
+        </w:rPr>
+        <w:t xml:space="preserve">    return vs.similarity_search(q, k=top_k or settings.top_k,</w:t>
+      </w:r>
+    </w:p>
+    <w:p>
+      <w:pPr>
+        <w:spacing w:line="260" w:lineRule="exact" w:before="0" w:after="0"/>
+        <w:ind w:firstLine="0" w:left="120"/>
+        <w:jc w:val="left"/>
+        <w:shd w:val="clear" w:fill="F5F5F5"/>
+      </w:pPr>
+      <w:r>
+        <w:rPr>
+          <w:rFonts w:ascii="Consolas" w:hAnsi="Consolas" w:eastAsia="宋体"/>
+          <w:b w:val="0"/>
+          <w:sz w:val="18"/>
+        </w:rPr>
+        <w:t xml:space="preserve">                                filter={"course_id": course_id})</w:t>
+      </w:r>
+    </w:p>
+    <w:p>
+      <w:pPr>
+        <w:spacing w:line="260" w:lineRule="exact" w:before="0" w:after="0"/>
+        <w:ind w:firstLine="0" w:left="120"/>
+        <w:jc w:val="left"/>
+        <w:shd w:val="clear" w:fill="F5F5F5"/>
+      </w:pPr>
+      <w:r>
+        <w:rPr>
+          <w:rFonts w:ascii="Consolas" w:hAnsi="Consolas" w:eastAsia="宋体"/>
+          <w:b w:val="0"/>
+          <w:sz w:val="18"/>
+        </w:rPr>
+        <w:t xml:space="preserve"> </w:t>
+      </w:r>
+    </w:p>
+    <w:p>
+      <w:pPr>
+        <w:spacing w:line="260" w:lineRule="exact" w:before="0" w:after="0"/>
+        <w:ind w:firstLine="0" w:left="120"/>
+        <w:jc w:val="left"/>
+        <w:shd w:val="clear" w:fill="F5F5F5"/>
+      </w:pPr>
+      <w:r>
+        <w:rPr>
+          <w:rFonts w:ascii="Consolas" w:hAnsi="Consolas" w:eastAsia="宋体"/>
+          <w:b w:val="0"/>
+          <w:sz w:val="18"/>
+        </w:rPr>
+        <w:t># 拼接上下文 -&gt; 填充 Prompt -&gt; 调用大模型 -&gt; 返回回答与来源</w:t>
+      </w:r>
+    </w:p>
+    <w:p>
+      <w:pPr>
+        <w:spacing w:line="260" w:lineRule="exact" w:before="0" w:after="0"/>
+        <w:ind w:firstLine="0" w:left="120"/>
+        <w:jc w:val="left"/>
+        <w:shd w:val="clear" w:fill="F5F5F5"/>
+      </w:pPr>
+      <w:r>
+        <w:rPr>
+          <w:rFonts w:ascii="Consolas" w:hAnsi="Consolas" w:eastAsia="宋体"/>
+          <w:b w:val="0"/>
+          <w:sz w:val="18"/>
+        </w:rPr>
+        <w:t>messages = build_rag_messages(context=context, question=question)</w:t>
+      </w:r>
+    </w:p>
+    <w:p>
+      <w:pPr>
+        <w:spacing w:line="260" w:lineRule="exact" w:before="0" w:after="0"/>
+        <w:ind w:firstLine="0" w:left="120"/>
+        <w:jc w:val="left"/>
+        <w:shd w:val="clear" w:fill="F5F5F5"/>
+      </w:pPr>
+      <w:r>
+        <w:rPr>
+          <w:rFonts w:ascii="Consolas" w:hAnsi="Consolas" w:eastAsia="宋体"/>
+          <w:b w:val="0"/>
+          <w:sz w:val="18"/>
+        </w:rPr>
+        <w:t>answer = get_chat_model().invoke(messages).content</w:t>
+      </w:r>
+    </w:p>
+    <w:p>
+      <w:pPr>
+        <w:spacing w:line="260" w:lineRule="exact" w:before="0" w:after="0"/>
+        <w:ind w:firstLine="0" w:left="120"/>
+        <w:jc w:val="left"/>
+        <w:shd w:val="clear" w:fill="F5F5F5"/>
+      </w:pPr>
+      <w:r>
+        <w:rPr>
+          <w:rFonts w:ascii="Consolas" w:hAnsi="Consolas" w:eastAsia="宋体"/>
+          <w:b w:val="0"/>
+          <w:sz w:val="18"/>
+        </w:rPr>
+        <w:t>sources = [Source(filename=d.metadata.get("filename", "未知"),</w:t>
+      </w:r>
+    </w:p>
+    <w:p>
+      <w:pPr>
+        <w:spacing w:line="260" w:lineRule="exact" w:before="0" w:after="0"/>
+        <w:ind w:firstLine="0" w:left="120"/>
+        <w:jc w:val="left"/>
+        <w:shd w:val="clear" w:fill="F5F5F5"/>
+      </w:pPr>
+      <w:r>
+        <w:rPr>
+          <w:rFonts w:ascii="Consolas" w:hAnsi="Consolas" w:eastAsia="宋体"/>
+          <w:b w:val="0"/>
+          <w:sz w:val="18"/>
+        </w:rPr>
+        <w:t xml:space="preserve">                  text=d.page_content) for d in docs]</w:t>
+      </w:r>
+    </w:p>
+    <w:p>
+      <w:pPr>
+        <w:spacing w:line="400" w:lineRule="exact" w:before="0" w:after="0"/>
+        <w:ind w:firstLine="480"/>
+        <w:jc w:val="both"/>
+      </w:pPr>
+      <w:r>
+        <w:rPr>
+          <w:rFonts w:ascii="Times New Roman" w:hAnsi="Times New Roman" w:eastAsia="宋体"/>
+          <w:b w:val="0"/>
+          <w:sz w:val="24"/>
+        </w:rPr>
+        <w:t>除问答之外，自动出题、判题与复习计划也构成一条闭环链路，其流程如图 5 所示。采用该图的主要作用是：展示三个模块之间的数据传递关系，说明前一环节的产出如何成为后一环节的输入。</w:t>
+      </w:r>
+    </w:p>
+    <w:p>
+      <w:pPr>
+        <w:spacing w:before="0" w:after="0"/>
+        <w:ind w:firstLine="0"/>
+        <w:jc w:val="center"/>
+      </w:pPr>
+      <w:r>
+        <w:drawing>
+          <wp:inline xmlns:a="http://schemas.openxmlformats.org/drawingml/2006/main" xmlns:pic="http://schemas.openxmlformats.org/drawingml/2006/picture">
+            <wp:extent cx="5472000" cy="3485589"/>
+            <wp:docPr id="25" name="Picture 25"/>
+            <wp:cNvGraphicFramePr>
+              <a:graphicFrameLocks noChangeAspect="1"/>
+            </wp:cNvGraphicFramePr>
+            <a:graphic>
+              <a:graphicData uri="http://schemas.openxmlformats.org/drawingml/2006/picture">
+                <pic:pic>
+                  <pic:nvPicPr>
+                    <pic:cNvPr id="0" name="fig5_flow.png"/>
+                    <pic:cNvPicPr/>
+                  </pic:nvPicPr>
+                  <pic:blipFill>
+                    <a:blip r:embed="rId12"/>
+                    <a:stretch>
+                      <a:fillRect/>
+                    </a:stretch>
+                  </pic:blipFill>
+                  <pic:spPr>
+                    <a:xfrm>
+                      <a:off x="0" y="0"/>
+                      <a:ext cx="5472000" cy="3485589"/>
+                    </a:xfrm>
+                    <a:prstGeom prst="rect"/>
+                  </pic:spPr>
+                </pic:pic>
+              </a:graphicData>
+            </a:graphic>
+          </wp:inline>
+        </w:drawing>
+      </w:r>
+    </w:p>
+    <w:p>
+      <w:pPr>
+        <w:spacing w:line="400" w:lineRule="exact" w:before="0" w:after="0"/>
+        <w:ind w:firstLine="0"/>
+        <w:jc w:val="center"/>
+      </w:pPr>
+      <w:r>
+        <w:rPr>
+          <w:rFonts w:ascii="Times New Roman" w:hAnsi="Times New Roman" w:eastAsia="宋体"/>
+          <w:b w:val="0"/>
+          <w:sz w:val="21"/>
+        </w:rPr>
+        <w:t>图 5  自动出题、判题与复习计划流程图</w:t>
+      </w:r>
+    </w:p>
+    <w:p>
+      <w:pPr>
+        <w:spacing w:line="400" w:lineRule="exact" w:before="0" w:after="0"/>
+        <w:ind w:firstLine="480"/>
+        <w:jc w:val="both"/>
+      </w:pPr>
+      <w:r>
+        <w:rPr>
+          <w:rFonts w:ascii="Times New Roman" w:hAnsi="Times New Roman" w:eastAsia="宋体"/>
+          <w:b w:val="0"/>
+          <w:sz w:val="24"/>
+        </w:rPr>
+        <w:t>图 5 采用三条泳道分别表示出题、判题与复习三个模块。出题泳道依次完成设置参数、按主题检索片段、填入提示词交由大模型生成、解析 JSON 并校验重试、写入批次与题目表；判题泳道在用户作答后先判断题型，客观题直接比对、简答题做语义打分，答错则写入错题本，并支持标记掌握或移除；复习泳道以未掌握的错题为输入，由大模型将知识点分配到七天，具体日期由服务端计算后写入计划与复习条目。图中虚线表示跨模块的数据传递，即生成的题目供用户作答、错题作为复习计划的输入，三者串联形成“出题—判题—错题—复习”的完整闭环。</w:t>
+      </w:r>
+    </w:p>
+    <w:p>
+      <w:pPr>
+        <w:spacing w:line="400" w:lineRule="exact" w:before="0" w:after="0"/>
+        <w:ind w:firstLine="480"/>
+        <w:jc w:val="both"/>
+      </w:pPr>
+      <w:r>
+        <w:rPr>
+          <w:rFonts w:ascii="Times New Roman" w:hAnsi="Times New Roman" w:eastAsia="宋体"/>
+          <w:b w:val="0"/>
+          <w:sz w:val="24"/>
+        </w:rPr>
+        <w:t>自动出题的关键在于对大模型输出的结构化解析与重试，关键代码如下：</w:t>
+      </w:r>
+    </w:p>
+    <w:p>
+      <w:pPr>
+        <w:spacing w:line="400" w:lineRule="exact" w:before="0" w:after="0"/>
+        <w:ind w:firstLine="0"/>
+        <w:jc w:val="both"/>
+      </w:pPr>
+      <w:r>
+        <w:rPr>
+          <w:rFonts w:ascii="Times New Roman" w:hAnsi="Times New Roman" w:eastAsia="宋体"/>
+          <w:b/>
+          <w:sz w:val="22"/>
+        </w:rPr>
+        <w:t>核心代码：</w:t>
+      </w:r>
+    </w:p>
+    <w:p>
+      <w:pPr>
+        <w:spacing w:line="260" w:lineRule="exact" w:before="0" w:after="0"/>
+        <w:ind w:firstLine="0" w:left="120"/>
+        <w:jc w:val="left"/>
+        <w:shd w:val="clear" w:fill="F5F5F5"/>
+      </w:pPr>
+      <w:r>
+        <w:rPr>
+          <w:rFonts w:ascii="Consolas" w:hAnsi="Consolas" w:eastAsia="宋体"/>
+          <w:b w:val="0"/>
+          <w:sz w:val="18"/>
+        </w:rPr>
+        <w:t># app/services/quiz_service.py</w:t>
+      </w:r>
+    </w:p>
+    <w:p>
+      <w:pPr>
+        <w:spacing w:line="260" w:lineRule="exact" w:before="0" w:after="0"/>
+        <w:ind w:firstLine="0" w:left="120"/>
+        <w:jc w:val="left"/>
+        <w:shd w:val="clear" w:fill="F5F5F5"/>
+      </w:pPr>
+      <w:r>
+        <w:rPr>
+          <w:rFonts w:ascii="Consolas" w:hAnsi="Consolas" w:eastAsia="宋体"/>
+          <w:b w:val="0"/>
+          <w:sz w:val="18"/>
+        </w:rPr>
+        <w:t>for attempt in range(MAX_ATTEMPTS):        # 最多 3 次（1 次初始 + 2 次重试）</w:t>
+      </w:r>
+    </w:p>
+    <w:p>
+      <w:pPr>
+        <w:spacing w:line="260" w:lineRule="exact" w:before="0" w:after="0"/>
+        <w:ind w:firstLine="0" w:left="120"/>
+        <w:jc w:val="left"/>
+        <w:shd w:val="clear" w:fill="F5F5F5"/>
+      </w:pPr>
+      <w:r>
+        <w:rPr>
+          <w:rFonts w:ascii="Consolas" w:hAnsi="Consolas" w:eastAsia="宋体"/>
+          <w:b w:val="0"/>
+          <w:sz w:val="18"/>
+        </w:rPr>
+        <w:t xml:space="preserve">    response = get_chat_model().invoke(messages)</w:t>
+      </w:r>
+    </w:p>
+    <w:p>
+      <w:pPr>
+        <w:spacing w:line="260" w:lineRule="exact" w:before="0" w:after="0"/>
+        <w:ind w:firstLine="0" w:left="120"/>
+        <w:jc w:val="left"/>
+        <w:shd w:val="clear" w:fill="F5F5F5"/>
+      </w:pPr>
+      <w:r>
+        <w:rPr>
+          <w:rFonts w:ascii="Consolas" w:hAnsi="Consolas" w:eastAsia="宋体"/>
+          <w:b w:val="0"/>
+          <w:sz w:val="18"/>
+        </w:rPr>
+        <w:t xml:space="preserve">    try:</w:t>
+      </w:r>
+    </w:p>
+    <w:p>
+      <w:pPr>
+        <w:spacing w:line="260" w:lineRule="exact" w:before="0" w:after="0"/>
+        <w:ind w:firstLine="0" w:left="120"/>
+        <w:jc w:val="left"/>
+        <w:shd w:val="clear" w:fill="F5F5F5"/>
+      </w:pPr>
+      <w:r>
+        <w:rPr>
+          <w:rFonts w:ascii="Consolas" w:hAnsi="Consolas" w:eastAsia="宋体"/>
+          <w:b w:val="0"/>
+          <w:sz w:val="18"/>
+        </w:rPr>
+        <w:t xml:space="preserve">        return _parse_quiz_json(response.content, count)</w:t>
+      </w:r>
+    </w:p>
+    <w:p>
+      <w:pPr>
+        <w:spacing w:line="260" w:lineRule="exact" w:before="0" w:after="0"/>
+        <w:ind w:firstLine="0" w:left="120"/>
+        <w:jc w:val="left"/>
+        <w:shd w:val="clear" w:fill="F5F5F5"/>
+      </w:pPr>
+      <w:r>
+        <w:rPr>
+          <w:rFonts w:ascii="Consolas" w:hAnsi="Consolas" w:eastAsia="宋体"/>
+          <w:b w:val="0"/>
+          <w:sz w:val="18"/>
+        </w:rPr>
+        <w:t xml:space="preserve">    except Exception as exc:</w:t>
+      </w:r>
+    </w:p>
+    <w:p>
+      <w:pPr>
+        <w:spacing w:line="260" w:lineRule="exact" w:before="0" w:after="0"/>
+        <w:ind w:firstLine="0" w:left="120"/>
+        <w:jc w:val="left"/>
+        <w:shd w:val="clear" w:fill="F5F5F5"/>
+      </w:pPr>
+      <w:r>
+        <w:rPr>
+          <w:rFonts w:ascii="Consolas" w:hAnsi="Consolas" w:eastAsia="宋体"/>
+          <w:b w:val="0"/>
+          <w:sz w:val="18"/>
+        </w:rPr>
+        <w:t xml:space="preserve">        logger.warning("出题生成第 %d 次失败: %s", attempt + 1, exc)</w:t>
+      </w:r>
+    </w:p>
+    <w:p>
+      <w:pPr>
+        <w:spacing w:line="260" w:lineRule="exact" w:before="0" w:after="0"/>
+        <w:ind w:firstLine="0" w:left="120"/>
+        <w:jc w:val="left"/>
+        <w:shd w:val="clear" w:fill="F5F5F5"/>
+      </w:pPr>
+      <w:r>
+        <w:rPr>
+          <w:rFonts w:ascii="Consolas" w:hAnsi="Consolas" w:eastAsia="宋体"/>
+          <w:b w:val="0"/>
+          <w:sz w:val="18"/>
+        </w:rPr>
+        <w:t>raise BusinessException(code=500, message="题目生成失败")</w:t>
+      </w:r>
+    </w:p>
+    <w:p>
+      <w:pPr>
+        <w:spacing w:line="260" w:lineRule="exact" w:before="0" w:after="0"/>
+        <w:ind w:firstLine="0" w:left="120"/>
+        <w:jc w:val="left"/>
+        <w:shd w:val="clear" w:fill="F5F5F5"/>
+      </w:pPr>
+      <w:r>
+        <w:rPr>
+          <w:rFonts w:ascii="Consolas" w:hAnsi="Consolas" w:eastAsia="宋体"/>
+          <w:b w:val="0"/>
+          <w:sz w:val="18"/>
+        </w:rPr>
+        <w:t xml:space="preserve"> </w:t>
+      </w:r>
+    </w:p>
+    <w:p>
+      <w:pPr>
+        <w:spacing w:line="260" w:lineRule="exact" w:before="0" w:after="0"/>
+        <w:ind w:firstLine="0" w:left="120"/>
+        <w:jc w:val="left"/>
+        <w:shd w:val="clear" w:fill="F5F5F5"/>
+      </w:pPr>
+      <w:r>
+        <w:rPr>
+          <w:rFonts w:ascii="Consolas" w:hAnsi="Consolas" w:eastAsia="宋体"/>
+          <w:b w:val="0"/>
+          <w:sz w:val="18"/>
+        </w:rPr>
+        <w:t>def _parse_quiz_json(text, count):</w:t>
+      </w:r>
+    </w:p>
+    <w:p>
+      <w:pPr>
+        <w:spacing w:line="260" w:lineRule="exact" w:before="0" w:after="0"/>
+        <w:ind w:firstLine="0" w:left="120"/>
+        <w:jc w:val="left"/>
+        <w:shd w:val="clear" w:fill="F5F5F5"/>
+      </w:pPr>
+      <w:r>
+        <w:rPr>
+          <w:rFonts w:ascii="Consolas" w:hAnsi="Consolas" w:eastAsia="宋体"/>
+          <w:b w:val="0"/>
+          <w:sz w:val="18"/>
+        </w:rPr>
+        <w:t xml:space="preserve">    cleaned = _strip_markdown_fence(text)  # 去掉 ```json 标记</w:t>
+      </w:r>
+    </w:p>
+    <w:p>
+      <w:pPr>
+        <w:spacing w:line="260" w:lineRule="exact" w:before="0" w:after="0"/>
+        <w:ind w:firstLine="0" w:left="120"/>
+        <w:jc w:val="left"/>
+        <w:shd w:val="clear" w:fill="F5F5F5"/>
+      </w:pPr>
+      <w:r>
+        <w:rPr>
+          <w:rFonts w:ascii="Consolas" w:hAnsi="Consolas" w:eastAsia="宋体"/>
+          <w:b w:val="0"/>
+          <w:sz w:val="18"/>
+        </w:rPr>
+        <w:t xml:space="preserve">    questions = json.loads(cleaned)["questions"]</w:t>
+      </w:r>
+    </w:p>
+    <w:p>
+      <w:pPr>
+        <w:spacing w:line="260" w:lineRule="exact" w:before="0" w:after="0"/>
+        <w:ind w:firstLine="0" w:left="120"/>
+        <w:jc w:val="left"/>
+        <w:shd w:val="clear" w:fill="F5F5F5"/>
+      </w:pPr>
+      <w:r>
+        <w:rPr>
+          <w:rFonts w:ascii="Consolas" w:hAnsi="Consolas" w:eastAsia="宋体"/>
+          <w:b w:val="0"/>
+          <w:sz w:val="18"/>
+        </w:rPr>
+        <w:t xml:space="preserve">    return questions[:count]</w:t>
+      </w:r>
+    </w:p>
+    <w:p>
+      <w:pPr>
+        <w:spacing w:line="400" w:lineRule="exact" w:before="0" w:after="0"/>
+        <w:ind w:firstLine="480"/>
+        <w:jc w:val="both"/>
+      </w:pPr>
+      <w:r>
+        <w:rPr>
+          <w:rFonts w:ascii="Times New Roman" w:hAnsi="Times New Roman" w:eastAsia="宋体"/>
+          <w:b w:val="0"/>
+          <w:sz w:val="24"/>
+        </w:rPr>
+        <w:t>判题环节的关键在于按题型采用不同策略，并为简答题提供降级方案，关键代码如下：</w:t>
+      </w:r>
+    </w:p>
+    <w:p>
+      <w:pPr>
+        <w:spacing w:line="400" w:lineRule="exact" w:before="0" w:after="0"/>
+        <w:ind w:firstLine="0"/>
+        <w:jc w:val="both"/>
+      </w:pPr>
+      <w:r>
+        <w:rPr>
+          <w:rFonts w:ascii="Times New Roman" w:hAnsi="Times New Roman" w:eastAsia="宋体"/>
+          <w:b/>
+          <w:sz w:val="22"/>
+        </w:rPr>
+        <w:t>核心代码：</w:t>
+      </w:r>
+    </w:p>
+    <w:p>
+      <w:pPr>
+        <w:spacing w:line="260" w:lineRule="exact" w:before="0" w:after="0"/>
+        <w:ind w:firstLine="0" w:left="120"/>
+        <w:jc w:val="left"/>
+        <w:shd w:val="clear" w:fill="F5F5F5"/>
+      </w:pPr>
+      <w:r>
+        <w:rPr>
+          <w:rFonts w:ascii="Consolas" w:hAnsi="Consolas" w:eastAsia="宋体"/>
+          <w:b w:val="0"/>
+          <w:sz w:val="18"/>
+        </w:rPr>
+        <w:t># app/services/mistake_service.py</w:t>
+      </w:r>
+    </w:p>
+    <w:p>
+      <w:pPr>
+        <w:spacing w:line="260" w:lineRule="exact" w:before="0" w:after="0"/>
+        <w:ind w:firstLine="0" w:left="120"/>
+        <w:jc w:val="left"/>
+        <w:shd w:val="clear" w:fill="F5F5F5"/>
+      </w:pPr>
+      <w:r>
+        <w:rPr>
+          <w:rFonts w:ascii="Consolas" w:hAnsi="Consolas" w:eastAsia="宋体"/>
+          <w:b w:val="0"/>
+          <w:sz w:val="18"/>
+        </w:rPr>
+        <w:t>def _grade_objective(question, user_answer):</w:t>
+      </w:r>
+    </w:p>
+    <w:p>
+      <w:pPr>
+        <w:spacing w:line="260" w:lineRule="exact" w:before="0" w:after="0"/>
+        <w:ind w:firstLine="0" w:left="120"/>
+        <w:jc w:val="left"/>
+        <w:shd w:val="clear" w:fill="F5F5F5"/>
+      </w:pPr>
+      <w:r>
+        <w:rPr>
+          <w:rFonts w:ascii="Consolas" w:hAnsi="Consolas" w:eastAsia="宋体"/>
+          <w:b w:val="0"/>
+          <w:sz w:val="18"/>
+        </w:rPr>
+        <w:t xml:space="preserve">    if question.type == "multiple":</w:t>
+      </w:r>
+    </w:p>
+    <w:p>
+      <w:pPr>
+        <w:spacing w:line="260" w:lineRule="exact" w:before="0" w:after="0"/>
+        <w:ind w:firstLine="0" w:left="120"/>
+        <w:jc w:val="left"/>
+        <w:shd w:val="clear" w:fill="F5F5F5"/>
+      </w:pPr>
+      <w:r>
+        <w:rPr>
+          <w:rFonts w:ascii="Consolas" w:hAnsi="Consolas" w:eastAsia="宋体"/>
+          <w:b w:val="0"/>
+          <w:sz w:val="18"/>
+        </w:rPr>
+        <w:t xml:space="preserve">        return _normalize(user_answer) == _normalize(question.answer)  # 排序后比对</w:t>
+      </w:r>
+    </w:p>
+    <w:p>
+      <w:pPr>
+        <w:spacing w:line="260" w:lineRule="exact" w:before="0" w:after="0"/>
+        <w:ind w:firstLine="0" w:left="120"/>
+        <w:jc w:val="left"/>
+        <w:shd w:val="clear" w:fill="F5F5F5"/>
+      </w:pPr>
+      <w:r>
+        <w:rPr>
+          <w:rFonts w:ascii="Consolas" w:hAnsi="Consolas" w:eastAsia="宋体"/>
+          <w:b w:val="0"/>
+          <w:sz w:val="18"/>
+        </w:rPr>
+        <w:t xml:space="preserve">    return user_answer.strip() == question.answer.strip()              # 单选/判断</w:t>
+      </w:r>
+    </w:p>
+    <w:p>
+      <w:pPr>
+        <w:spacing w:line="260" w:lineRule="exact" w:before="0" w:after="0"/>
+        <w:ind w:firstLine="0" w:left="120"/>
+        <w:jc w:val="left"/>
+        <w:shd w:val="clear" w:fill="F5F5F5"/>
+      </w:pPr>
+      <w:r>
+        <w:rPr>
+          <w:rFonts w:ascii="Consolas" w:hAnsi="Consolas" w:eastAsia="宋体"/>
+          <w:b w:val="0"/>
+          <w:sz w:val="18"/>
+        </w:rPr>
+        <w:t xml:space="preserve"> </w:t>
+      </w:r>
+    </w:p>
+    <w:p>
+      <w:pPr>
+        <w:spacing w:line="260" w:lineRule="exact" w:before="0" w:after="0"/>
+        <w:ind w:firstLine="0" w:left="120"/>
+        <w:jc w:val="left"/>
+        <w:shd w:val="clear" w:fill="F5F5F5"/>
+      </w:pPr>
+      <w:r>
+        <w:rPr>
+          <w:rFonts w:ascii="Consolas" w:hAnsi="Consolas" w:eastAsia="宋体"/>
+          <w:b w:val="0"/>
+          <w:sz w:val="18"/>
+        </w:rPr>
+        <w:t>def _grade_short_answer(question, user_answer):</w:t>
+      </w:r>
+    </w:p>
+    <w:p>
+      <w:pPr>
+        <w:spacing w:line="260" w:lineRule="exact" w:before="0" w:after="0"/>
+        <w:ind w:firstLine="0" w:left="120"/>
+        <w:jc w:val="left"/>
+        <w:shd w:val="clear" w:fill="F5F5F5"/>
+      </w:pPr>
+      <w:r>
+        <w:rPr>
+          <w:rFonts w:ascii="Consolas" w:hAnsi="Consolas" w:eastAsia="宋体"/>
+          <w:b w:val="0"/>
+          <w:sz w:val="18"/>
+        </w:rPr>
+        <w:t xml:space="preserve">    try:                                     # 优先 LLM 语义打分</w:t>
+      </w:r>
+    </w:p>
+    <w:p>
+      <w:pPr>
+        <w:spacing w:line="260" w:lineRule="exact" w:before="0" w:after="0"/>
+        <w:ind w:firstLine="0" w:left="120"/>
+        <w:jc w:val="left"/>
+        <w:shd w:val="clear" w:fill="F5F5F5"/>
+      </w:pPr>
+      <w:r>
+        <w:rPr>
+          <w:rFonts w:ascii="Consolas" w:hAnsi="Consolas" w:eastAsia="宋体"/>
+          <w:b w:val="0"/>
+          <w:sz w:val="18"/>
+        </w:rPr>
+        <w:t xml:space="preserve">        data = _parse_grading_json(get_chat_model().invoke(msgs).content)</w:t>
+      </w:r>
+    </w:p>
+    <w:p>
+      <w:pPr>
+        <w:spacing w:line="260" w:lineRule="exact" w:before="0" w:after="0"/>
+        <w:ind w:firstLine="0" w:left="120"/>
+        <w:jc w:val="left"/>
+        <w:shd w:val="clear" w:fill="F5F5F5"/>
+      </w:pPr>
+      <w:r>
+        <w:rPr>
+          <w:rFonts w:ascii="Consolas" w:hAnsi="Consolas" w:eastAsia="宋体"/>
+          <w:b w:val="0"/>
+          <w:sz w:val="18"/>
+        </w:rPr>
+        <w:t xml:space="preserve">        return {"correct": bool(data["correct"]), "score": int(data["score"]),</w:t>
+      </w:r>
+    </w:p>
+    <w:p>
+      <w:pPr>
+        <w:spacing w:line="260" w:lineRule="exact" w:before="0" w:after="0"/>
+        <w:ind w:firstLine="0" w:left="120"/>
+        <w:jc w:val="left"/>
+        <w:shd w:val="clear" w:fill="F5F5F5"/>
+      </w:pPr>
+      <w:r>
+        <w:rPr>
+          <w:rFonts w:ascii="Consolas" w:hAnsi="Consolas" w:eastAsia="宋体"/>
+          <w:b w:val="0"/>
+          <w:sz w:val="18"/>
+        </w:rPr>
+        <w:t xml:space="preserve">                "reason": data.get("reason", "")}</w:t>
+      </w:r>
+    </w:p>
+    <w:p>
+      <w:pPr>
+        <w:spacing w:line="260" w:lineRule="exact" w:before="0" w:after="0"/>
+        <w:ind w:firstLine="0" w:left="120"/>
+        <w:jc w:val="left"/>
+        <w:shd w:val="clear" w:fill="F5F5F5"/>
+      </w:pPr>
+      <w:r>
+        <w:rPr>
+          <w:rFonts w:ascii="Consolas" w:hAnsi="Consolas" w:eastAsia="宋体"/>
+          <w:b w:val="0"/>
+          <w:sz w:val="18"/>
+        </w:rPr>
+        <w:t xml:space="preserve">    except Exception:                        # 失败降级为关键词匹配</w:t>
+      </w:r>
+    </w:p>
+    <w:p>
+      <w:pPr>
+        <w:spacing w:line="260" w:lineRule="exact" w:before="0" w:after="0"/>
+        <w:ind w:firstLine="0" w:left="120"/>
+        <w:jc w:val="left"/>
+        <w:shd w:val="clear" w:fill="F5F5F5"/>
+      </w:pPr>
+      <w:r>
+        <w:rPr>
+          <w:rFonts w:ascii="Consolas" w:hAnsi="Consolas" w:eastAsia="宋体"/>
+          <w:b w:val="0"/>
+          <w:sz w:val="18"/>
+        </w:rPr>
+        <w:t xml:space="preserve">        keywords = _extract_keywords(question.answer)</w:t>
+      </w:r>
+    </w:p>
+    <w:p>
+      <w:pPr>
+        <w:spacing w:line="260" w:lineRule="exact" w:before="0" w:after="0"/>
+        <w:ind w:firstLine="0" w:left="120"/>
+        <w:jc w:val="left"/>
+        <w:shd w:val="clear" w:fill="F5F5F5"/>
+      </w:pPr>
+      <w:r>
+        <w:rPr>
+          <w:rFonts w:ascii="Consolas" w:hAnsi="Consolas" w:eastAsia="宋体"/>
+          <w:b w:val="0"/>
+          <w:sz w:val="18"/>
+        </w:rPr>
+        <w:t xml:space="preserve">        matched = sum(1 for kw in keywords if kw in user_answer)</w:t>
+      </w:r>
+    </w:p>
+    <w:p>
+      <w:pPr>
+        <w:spacing w:line="260" w:lineRule="exact" w:before="0" w:after="0"/>
+        <w:ind w:firstLine="0" w:left="120"/>
+        <w:jc w:val="left"/>
+        <w:shd w:val="clear" w:fill="F5F5F5"/>
+      </w:pPr>
+      <w:r>
+        <w:rPr>
+          <w:rFonts w:ascii="Consolas" w:hAnsi="Consolas" w:eastAsia="宋体"/>
+          <w:b w:val="0"/>
+          <w:sz w:val="18"/>
+        </w:rPr>
+        <w:t xml:space="preserve">        return {"correct": matched / len(keywords) &gt;= KEYWORD_MATCH_THRESHOLD,</w:t>
+      </w:r>
+    </w:p>
+    <w:p>
+      <w:pPr>
+        <w:spacing w:line="260" w:lineRule="exact" w:before="0" w:after="0"/>
+        <w:ind w:firstLine="0" w:left="120"/>
+        <w:jc w:val="left"/>
+        <w:shd w:val="clear" w:fill="F5F5F5"/>
+      </w:pPr>
+      <w:r>
+        <w:rPr>
+          <w:rFonts w:ascii="Consolas" w:hAnsi="Consolas" w:eastAsia="宋体"/>
+          <w:b w:val="0"/>
+          <w:sz w:val="18"/>
+        </w:rPr>
+        <w:t xml:space="preserve">                "score": 0, "reason": "已降级为关键词匹配"}</w:t>
+      </w:r>
+    </w:p>
+    <w:p>
+      <w:pPr>
+        <w:spacing w:line="400" w:lineRule="exact" w:before="0" w:after="0"/>
+        <w:ind w:firstLine="480"/>
+        <w:jc w:val="both"/>
+      </w:pPr>
+      <w:r>
+        <w:rPr>
+          <w:rFonts w:ascii="Times New Roman" w:hAnsi="Times New Roman" w:eastAsia="宋体"/>
+          <w:b w:val="0"/>
+          <w:sz w:val="24"/>
+        </w:rPr>
+        <w:t>复习计划的关键在于由服务端计算真实日期，避免模型不了解当前日期，关键代码如下：</w:t>
+      </w:r>
+    </w:p>
+    <w:p>
+      <w:pPr>
+        <w:spacing w:line="400" w:lineRule="exact" w:before="0" w:after="0"/>
+        <w:ind w:firstLine="0"/>
+        <w:jc w:val="both"/>
+      </w:pPr>
+      <w:r>
+        <w:rPr>
+          <w:rFonts w:ascii="Times New Roman" w:hAnsi="Times New Roman" w:eastAsia="宋体"/>
+          <w:b/>
+          <w:sz w:val="22"/>
+        </w:rPr>
+        <w:t>核心代码：</w:t>
+      </w:r>
+    </w:p>
+    <w:p>
+      <w:pPr>
+        <w:spacing w:line="260" w:lineRule="exact" w:before="0" w:after="0"/>
+        <w:ind w:firstLine="0" w:left="120"/>
+        <w:jc w:val="left"/>
+        <w:shd w:val="clear" w:fill="F5F5F5"/>
+      </w:pPr>
+      <w:r>
+        <w:rPr>
+          <w:rFonts w:ascii="Consolas" w:hAnsi="Consolas" w:eastAsia="宋体"/>
+          <w:b w:val="0"/>
+          <w:sz w:val="18"/>
+        </w:rPr>
+        <w:t># app/services/review_service.py</w:t>
+      </w:r>
+    </w:p>
+    <w:p>
+      <w:pPr>
+        <w:spacing w:line="260" w:lineRule="exact" w:before="0" w:after="0"/>
+        <w:ind w:firstLine="0" w:left="120"/>
+        <w:jc w:val="left"/>
+        <w:shd w:val="clear" w:fill="F5F5F5"/>
+      </w:pPr>
+      <w:r>
+        <w:rPr>
+          <w:rFonts w:ascii="Consolas" w:hAnsi="Consolas" w:eastAsia="宋体"/>
+          <w:b w:val="0"/>
+          <w:sz w:val="18"/>
+        </w:rPr>
+        <w:t>plan = ReviewPlan(course_id=course_id, name=plan_data.get("plan_name"),</w:t>
+      </w:r>
+    </w:p>
+    <w:p>
+      <w:pPr>
+        <w:spacing w:line="260" w:lineRule="exact" w:before="0" w:after="0"/>
+        <w:ind w:firstLine="0" w:left="120"/>
+        <w:jc w:val="left"/>
+        <w:shd w:val="clear" w:fill="F5F5F5"/>
+      </w:pPr>
+      <w:r>
+        <w:rPr>
+          <w:rFonts w:ascii="Consolas" w:hAnsi="Consolas" w:eastAsia="宋体"/>
+          <w:b w:val="0"/>
+          <w:sz w:val="18"/>
+        </w:rPr>
+        <w:t xml:space="preserve">                  description=f"基于 {len(mistakes)} 道错题生成", status="active")</w:t>
+      </w:r>
+    </w:p>
+    <w:p>
+      <w:pPr>
+        <w:spacing w:line="260" w:lineRule="exact" w:before="0" w:after="0"/>
+        <w:ind w:firstLine="0" w:left="120"/>
+        <w:jc w:val="left"/>
+        <w:shd w:val="clear" w:fill="F5F5F5"/>
+      </w:pPr>
+      <w:r>
+        <w:rPr>
+          <w:rFonts w:ascii="Consolas" w:hAnsi="Consolas" w:eastAsia="宋体"/>
+          <w:b w:val="0"/>
+          <w:sz w:val="18"/>
+        </w:rPr>
+        <w:t>db.add(plan); db.flush()                            # 获取 plan.id</w:t>
+      </w:r>
+    </w:p>
+    <w:p>
+      <w:pPr>
+        <w:spacing w:line="260" w:lineRule="exact" w:before="0" w:after="0"/>
+        <w:ind w:firstLine="0" w:left="120"/>
+        <w:jc w:val="left"/>
+        <w:shd w:val="clear" w:fill="F5F5F5"/>
+      </w:pPr>
+      <w:r>
+        <w:rPr>
+          <w:rFonts w:ascii="Consolas" w:hAnsi="Consolas" w:eastAsia="宋体"/>
+          <w:b w:val="0"/>
+          <w:sz w:val="18"/>
+        </w:rPr>
+        <w:t xml:space="preserve"> </w:t>
+      </w:r>
+    </w:p>
+    <w:p>
+      <w:pPr>
+        <w:spacing w:line="260" w:lineRule="exact" w:before="0" w:after="0"/>
+        <w:ind w:firstLine="0" w:left="120"/>
+        <w:jc w:val="left"/>
+        <w:shd w:val="clear" w:fill="F5F5F5"/>
+      </w:pPr>
+      <w:r>
+        <w:rPr>
+          <w:rFonts w:ascii="Consolas" w:hAnsi="Consolas" w:eastAsia="宋体"/>
+          <w:b w:val="0"/>
+          <w:sz w:val="18"/>
+        </w:rPr>
+        <w:t>today = date.today()</w:t>
+      </w:r>
+    </w:p>
+    <w:p>
+      <w:pPr>
+        <w:spacing w:line="260" w:lineRule="exact" w:before="0" w:after="0"/>
+        <w:ind w:firstLine="0" w:left="120"/>
+        <w:jc w:val="left"/>
+        <w:shd w:val="clear" w:fill="F5F5F5"/>
+      </w:pPr>
+      <w:r>
+        <w:rPr>
+          <w:rFonts w:ascii="Consolas" w:hAnsi="Consolas" w:eastAsia="宋体"/>
+          <w:b w:val="0"/>
+          <w:sz w:val="18"/>
+        </w:rPr>
+        <w:t>for item in plan_data.get("items", []):             # 模型只给出“第几天”</w:t>
+      </w:r>
+    </w:p>
+    <w:p>
+      <w:pPr>
+        <w:spacing w:line="260" w:lineRule="exact" w:before="0" w:after="0"/>
+        <w:ind w:firstLine="0" w:left="120"/>
+        <w:jc w:val="left"/>
+        <w:shd w:val="clear" w:fill="F5F5F5"/>
+      </w:pPr>
+      <w:r>
+        <w:rPr>
+          <w:rFonts w:ascii="Consolas" w:hAnsi="Consolas" w:eastAsia="宋体"/>
+          <w:b w:val="0"/>
+          <w:sz w:val="18"/>
+        </w:rPr>
+        <w:t xml:space="preserve">    day = int(item.get("day", 1))</w:t>
+      </w:r>
+    </w:p>
+    <w:p>
+      <w:pPr>
+        <w:spacing w:line="260" w:lineRule="exact" w:before="0" w:after="0"/>
+        <w:ind w:firstLine="0" w:left="120"/>
+        <w:jc w:val="left"/>
+        <w:shd w:val="clear" w:fill="F5F5F5"/>
+      </w:pPr>
+      <w:r>
+        <w:rPr>
+          <w:rFonts w:ascii="Consolas" w:hAnsi="Consolas" w:eastAsia="宋体"/>
+          <w:b w:val="0"/>
+          <w:sz w:val="18"/>
+        </w:rPr>
+        <w:t xml:space="preserve">    review_date = today + timedelta(days=day - 1)    # 服务端计算真实日期</w:t>
+      </w:r>
+    </w:p>
+    <w:p>
+      <w:pPr>
+        <w:spacing w:line="260" w:lineRule="exact" w:before="0" w:after="0"/>
+        <w:ind w:firstLine="0" w:left="120"/>
+        <w:jc w:val="left"/>
+        <w:shd w:val="clear" w:fill="F5F5F5"/>
+      </w:pPr>
+      <w:r>
+        <w:rPr>
+          <w:rFonts w:ascii="Consolas" w:hAnsi="Consolas" w:eastAsia="宋体"/>
+          <w:b w:val="0"/>
+          <w:sz w:val="18"/>
+        </w:rPr>
+        <w:t xml:space="preserve">    db.add(ReviewItem(plan_id=plan.id,</w:t>
+      </w:r>
+    </w:p>
+    <w:p>
+      <w:pPr>
+        <w:spacing w:line="260" w:lineRule="exact" w:before="0" w:after="0"/>
+        <w:ind w:firstLine="0" w:left="120"/>
+        <w:jc w:val="left"/>
+        <w:shd w:val="clear" w:fill="F5F5F5"/>
+      </w:pPr>
+      <w:r>
+        <w:rPr>
+          <w:rFonts w:ascii="Consolas" w:hAnsi="Consolas" w:eastAsia="宋体"/>
+          <w:b w:val="0"/>
+          <w:sz w:val="18"/>
+        </w:rPr>
+        <w:t xml:space="preserve">                      knowledge_point=str(item.get("knowledge_point", "")),</w:t>
+      </w:r>
+    </w:p>
+    <w:p>
+      <w:pPr>
+        <w:spacing w:line="260" w:lineRule="exact" w:before="0" w:after="0"/>
+        <w:ind w:firstLine="0" w:left="120"/>
+        <w:jc w:val="left"/>
+        <w:shd w:val="clear" w:fill="F5F5F5"/>
+      </w:pPr>
+      <w:r>
+        <w:rPr>
+          <w:rFonts w:ascii="Consolas" w:hAnsi="Consolas" w:eastAsia="宋体"/>
+          <w:b w:val="0"/>
+          <w:sz w:val="18"/>
+        </w:rPr>
+        <w:t xml:space="preserve">                      review_date=review_date, completed=False))</w:t>
+      </w:r>
+    </w:p>
+    <w:p>
+      <w:pPr>
+        <w:spacing w:line="260" w:lineRule="exact" w:before="0" w:after="0"/>
+        <w:ind w:firstLine="0" w:left="120"/>
+        <w:jc w:val="left"/>
+        <w:shd w:val="clear" w:fill="F5F5F5"/>
+      </w:pPr>
+      <w:r>
+        <w:rPr>
+          <w:rFonts w:ascii="Consolas" w:hAnsi="Consolas" w:eastAsia="宋体"/>
+          <w:b w:val="0"/>
+          <w:sz w:val="18"/>
+        </w:rPr>
+        <w:t>db.commit()</w:t>
+      </w:r>
+    </w:p>
+    <w:p>
+      <w:pPr>
+        <w:spacing w:line="400" w:lineRule="exact" w:before="0" w:after="0"/>
+        <w:ind w:firstLine="480"/>
+        <w:jc w:val="both"/>
+      </w:pPr>
+      <w:r>
+        <w:rPr>
+          <w:rFonts w:ascii="Times New Roman" w:hAnsi="Times New Roman" w:eastAsia="宋体"/>
+          <w:b w:val="0"/>
+          <w:sz w:val="24"/>
+        </w:rPr>
+        <w:t>复习计划的生成同样复用大模型能力：读取该课程所有未掌握的错题及其解析，交由大模型将涉及的知识点分配到七天之内，输出的条目仅含“第几天”与知识点描述，具体日期由服务端以当天为基准计算后写入，避免因模型不了解当前日期而产生错误。</w:t>
+      </w:r>
+    </w:p>
+    <w:p>
+      <w:pPr>
+        <w:spacing w:line="400" w:lineRule="exact" w:before="0" w:after="0"/>
+        <w:ind w:firstLine="480"/>
+        <w:jc w:val="both"/>
+      </w:pPr>
+      <w:r>
+        <w:rPr>
+          <w:rFonts w:ascii="Times New Roman" w:hAnsi="Times New Roman" w:eastAsia="宋体"/>
+          <w:b/>
           <w:sz w:val="24"/>
         </w:rPr>
         <w:t>10．系统测试</w:t>
+      </w:r>
+    </w:p>
+    <w:p>
+      <w:pPr>
+        <w:spacing w:line="400" w:lineRule="exact" w:before="0" w:after="0"/>
+        <w:ind w:firstLine="480"/>
+        <w:jc w:val="both"/>
+      </w:pPr>
+      <w:r>
+        <w:rPr>
+          <w:rFonts w:ascii="Times New Roman" w:hAnsi="Times New Roman" w:eastAsia="宋体"/>
+          <w:b/>
+          <w:sz w:val="24"/>
+        </w:rPr>
+        <w:t>11．实现的界面</w:t>
+      </w:r>
+    </w:p>
+    <w:p>
+      <w:pPr>
+        <w:spacing w:line="400" w:lineRule="exact" w:before="0" w:after="0"/>
+        <w:ind w:firstLine="480"/>
+        <w:jc w:val="both"/>
+      </w:pPr>
+      <w:r>
+        <w:rPr>
+          <w:rFonts w:ascii="Times New Roman" w:hAnsi="Times New Roman" w:eastAsia="宋体"/>
+          <w:b w:val="0"/>
+          <w:sz w:val="24"/>
+        </w:rPr>
+        <w:t>系统的前端采用原生 HTML、CSS 与 JavaScript 实现，无需构建工具，由后端以静态资源方式挂载。页面整体为左右两栏布局：左侧固定显示课程列表与新建课程入口，右侧为主内容区，顶部提供五个功能标签页，依次为文档管理、智能问答、自动出题、错题本与复习计划，切换标签不刷新页面，由脚本控制面板的显隐。</w:t>
+      </w:r>
+    </w:p>
+    <w:p>
+      <w:pPr>
+        <w:spacing w:line="400" w:lineRule="exact" w:before="0" w:after="0"/>
+        <w:ind w:firstLine="480"/>
+        <w:jc w:val="both"/>
+      </w:pPr>
+      <w:r>
+        <w:rPr>
+          <w:rFonts w:ascii="Times New Roman" w:hAnsi="Times New Roman" w:eastAsia="宋体"/>
+          <w:b w:val="0"/>
+          <w:sz w:val="24"/>
+        </w:rPr>
+        <w:t>各页面的功能与操作方式如下：文档管理页提供上传按钮与文档列表，展示文件名、切分块数与入库状态，上传过程中显示加载提示；智能问答页为聊天式布局，问题与回答分区展示，回答下方以卡片形式内联显示引用来源；自动出题页上方为参数表单（题型、难度、数量），下方为生成的题目卡片，客观题可直接点击选项作答并即时判分；错题本页以卡片列表展示错题，显示题干、用户答案与正确答案的对比以及解析，支持标记掌握与移除；复习计划页以日期分组展示复习条目，支持一键标记完成。</w:t>
+      </w:r>
+    </w:p>
+    <w:p>
+      <w:pPr>
+        <w:spacing w:line="400" w:lineRule="exact" w:before="0" w:after="0"/>
+        <w:ind w:firstLine="480"/>
+        <w:jc w:val="both"/>
+      </w:pPr>
+      <w:r>
+        <w:rPr>
+          <w:rFonts w:ascii="Times New Roman" w:hAnsi="Times New Roman" w:eastAsia="宋体"/>
+          <w:b w:val="0"/>
+          <w:sz w:val="24"/>
+        </w:rPr>
+        <w:t>为体现系统的实际运行效果，需在下列位置补充界面截图。</w:t>
+      </w:r>
+    </w:p>
+    <w:p>
+      <w:pPr>
+        <w:spacing w:line="400" w:lineRule="exact" w:before="0" w:after="0"/>
+        <w:ind w:firstLine="0"/>
+        <w:jc w:val="center"/>
+      </w:pPr>
+      <w:r>
+        <w:rPr>
+          <w:rFonts w:ascii="Times New Roman" w:hAnsi="Times New Roman" w:eastAsia="宋体"/>
+          <w:b w:val="0"/>
+          <w:sz w:val="21"/>
+        </w:rPr>
+        <w:t>图 6  文档管理页面（上传文档与文档列表）</w:t>
+      </w:r>
+    </w:p>
+    <w:p>
+      <w:pPr>
+        <w:spacing w:line="400" w:lineRule="exact" w:before="0" w:after="0"/>
+        <w:ind w:firstLine="0"/>
+        <w:jc w:val="center"/>
+      </w:pPr>
+      <w:r>
+        <w:rPr>
+          <w:rFonts w:ascii="Times New Roman" w:hAnsi="Times New Roman" w:eastAsia="宋体"/>
+          <w:b w:val="0"/>
+          <w:color w:val="C00000"/>
+          <w:sz w:val="21"/>
+        </w:rPr>
+        <w:t>【此处插入截图 1】截图要求：左侧显示课程列表且已选中一门课程；右侧展示文档管理页，列表中至少有一份状态为 completed 的文档，能看到文件名与切分块数。</w:t>
+      </w:r>
+    </w:p>
+    <w:p>
+      <w:pPr>
+        <w:spacing w:line="400" w:lineRule="exact" w:before="0" w:after="0"/>
+        <w:ind w:firstLine="0"/>
+        <w:jc w:val="center"/>
+      </w:pPr>
+      <w:r>
+        <w:rPr>
+          <w:rFonts w:ascii="Times New Roman" w:hAnsi="Times New Roman" w:eastAsia="宋体"/>
+          <w:b w:val="0"/>
+          <w:sz w:val="21"/>
+        </w:rPr>
+        <w:t>图 7  智能问答页面（回答与引用来源）</w:t>
+      </w:r>
+    </w:p>
+    <w:p>
+      <w:pPr>
+        <w:spacing w:line="400" w:lineRule="exact" w:before="0" w:after="0"/>
+        <w:ind w:firstLine="0"/>
+        <w:jc w:val="center"/>
+      </w:pPr>
+      <w:r>
+        <w:rPr>
+          <w:rFonts w:ascii="Times New Roman" w:hAnsi="Times New Roman" w:eastAsia="宋体"/>
+          <w:b w:val="0"/>
+          <w:color w:val="C00000"/>
+          <w:sz w:val="21"/>
+        </w:rPr>
+        <w:t>【此处插入截图 2】截图要求：输入框内已提出问题，页面显示 AI 回答内容，且回答下方能看到引用来源卡片（包含文件名与原文片段摘要）。</w:t>
+      </w:r>
+    </w:p>
+    <w:p>
+      <w:pPr>
+        <w:spacing w:line="400" w:lineRule="exact" w:before="0" w:after="0"/>
+        <w:ind w:firstLine="0"/>
+        <w:jc w:val="center"/>
+      </w:pPr>
+      <w:r>
+        <w:rPr>
+          <w:rFonts w:ascii="Times New Roman" w:hAnsi="Times New Roman" w:eastAsia="宋体"/>
+          <w:b w:val="0"/>
+          <w:sz w:val="21"/>
+        </w:rPr>
+        <w:t>图 8  自动出题页面（出题参数与题目卡片）</w:t>
+      </w:r>
+    </w:p>
+    <w:p>
+      <w:pPr>
+        <w:spacing w:line="400" w:lineRule="exact" w:before="0" w:after="0"/>
+        <w:ind w:firstLine="0"/>
+        <w:jc w:val="center"/>
+      </w:pPr>
+      <w:r>
+        <w:rPr>
+          <w:rFonts w:ascii="Times New Roman" w:hAnsi="Times New Roman" w:eastAsia="宋体"/>
+          <w:b w:val="0"/>
+          <w:color w:val="C00000"/>
+          <w:sz w:val="21"/>
+        </w:rPr>
+        <w:t>【此处插入截图 3】截图要求：上方参数表单已选择题型与数量，下方显示生成的题目卡片，其中一道客观题已选择某个选项并显示出正确或错误的判分结果。</w:t>
+      </w:r>
+    </w:p>
+    <w:p>
+      <w:pPr>
+        <w:spacing w:line="400" w:lineRule="exact" w:before="0" w:after="0"/>
+        <w:ind w:firstLine="0"/>
+        <w:jc w:val="center"/>
+      </w:pPr>
+      <w:r>
+        <w:rPr>
+          <w:rFonts w:ascii="Times New Roman" w:hAnsi="Times New Roman" w:eastAsia="宋体"/>
+          <w:b w:val="0"/>
+          <w:sz w:val="21"/>
+        </w:rPr>
+        <w:t>图 9  错题本页面（错题卡片与答案对比）</w:t>
+      </w:r>
+    </w:p>
+    <w:p>
+      <w:pPr>
+        <w:spacing w:line="400" w:lineRule="exact" w:before="0" w:after="0"/>
+        <w:ind w:firstLine="0"/>
+        <w:jc w:val="center"/>
+      </w:pPr>
+      <w:r>
+        <w:rPr>
+          <w:rFonts w:ascii="Times New Roman" w:hAnsi="Times New Roman" w:eastAsia="宋体"/>
+          <w:b w:val="0"/>
+          <w:color w:val="C00000"/>
+          <w:sz w:val="21"/>
+        </w:rPr>
+        <w:t>【此处插入截图 4】截图要求：显示至少一道错题卡片，能同时看到用户答案与正确答案的对比、解析内容，以及“标记掌握”按钮。</w:t>
+      </w:r>
+    </w:p>
+    <w:p>
+      <w:pPr>
+        <w:spacing w:line="400" w:lineRule="exact" w:before="0" w:after="0"/>
+        <w:ind w:firstLine="0"/>
+        <w:jc w:val="center"/>
+      </w:pPr>
+      <w:r>
+        <w:rPr>
+          <w:rFonts w:ascii="Times New Roman" w:hAnsi="Times New Roman" w:eastAsia="宋体"/>
+          <w:b w:val="0"/>
+          <w:sz w:val="21"/>
+        </w:rPr>
+        <w:t>图 10  复习计划页面（按日期展示复习条目）</w:t>
+      </w:r>
+    </w:p>
+    <w:p>
+      <w:pPr>
+        <w:spacing w:line="400" w:lineRule="exact" w:before="0" w:after="0"/>
+        <w:ind w:firstLine="0"/>
+        <w:jc w:val="center"/>
+      </w:pPr>
+      <w:r>
+        <w:rPr>
+          <w:rFonts w:ascii="Times New Roman" w:hAnsi="Times New Roman" w:eastAsia="宋体"/>
+          <w:b w:val="0"/>
+          <w:color w:val="C00000"/>
+          <w:sz w:val="21"/>
+        </w:rPr>
+        <w:t>【此处插入截图 5】截图要求：展示一份已生成的复习计划，条目按日期分组显示并标注知识点，其中至少一条已勾选完成。</w:t>
       </w:r>
     </w:p>
     <w:p>

</xml_diff>

<commit_message>
docs: fill member info and complete section 4 (result analysis)
- report: fill topic name, 5 members (name/ID), project division table

- report: complete section 4 with test statistics, quantitative analysis, issues and conclusion (table 14)

- ppt: fill defense members on cover, populate division table, assign slide owners, renumber page numbers
</commit_message>
<xml_diff>
--- a/defense/1组-张三-23级计算机科学与技术1班-课程设计报告.docx
+++ b/defense/1组-张三-23级计算机科学与技术1班-课程设计报告.docx
@@ -113,8 +113,9 @@
     </w:p>
     <w:p>
       <w:pPr>
-        <w:spacing w:line="360" w:lineRule="auto"/>
-        <w:ind w:firstLine="1608" w:firstLineChars="445"/>
+        <w:spacing w:line="400" w:lineRule="exact" w:before="0" w:after="0"/>
+        <w:ind w:firstLineChars="445" w:firstLine="0"/>
+        <w:jc w:val="center"/>
         <w:rPr>
           <w:rFonts w:hint="eastAsia" w:ascii="黑体" w:hAnsi="Calibri" w:eastAsia="黑体" w:cs="黑体"/>
           <w:b/>
@@ -126,24 +127,11 @@
       </w:pPr>
       <w:r>
         <w:rPr>
-          <w:rFonts w:hint="eastAsia" w:ascii="黑体" w:hAnsi="Calibri" w:eastAsia="黑体" w:cs="黑体"/>
+          <w:rFonts w:ascii="Times New Roman" w:hAnsi="Times New Roman" w:eastAsia="宋体"/>
           <w:b/>
-          <w:bCs/>
-          <w:sz w:val="36"/>
-          <w:szCs w:val="36"/>
-        </w:rPr>
-        <w:t>题目：</w:t>
-      </w:r>
-      <w:r>
-        <w:rPr>
-          <w:rFonts w:hint="eastAsia" w:ascii="黑体" w:hAnsi="Calibri" w:eastAsia="黑体" w:cs="黑体"/>
-          <w:b/>
-          <w:bCs/>
-          <w:sz w:val="36"/>
-          <w:szCs w:val="36"/>
-          <w:lang w:val="en-US" w:eastAsia="zh-CN"/>
-        </w:rPr>
-        <w:t>小二，黑体，加粗，居中</w:t>
+          <w:sz w:val="28"/>
+        </w:rPr>
+        <w:t>题目：智学助手——基于 LangChain 的课程知识库问答与出题系统</w:t>
       </w:r>
     </w:p>
     <w:p>
@@ -451,8 +439,9 @@
     </w:p>
     <w:p>
       <w:pPr>
-        <w:spacing w:line="560" w:lineRule="exact"/>
-        <w:ind w:firstLine="1556" w:firstLineChars="646"/>
+        <w:spacing w:line="400" w:lineRule="exact" w:before="0" w:after="0"/>
+        <w:ind w:firstLineChars="646" w:firstLine="0"/>
+        <w:jc w:val="both"/>
         <w:rPr>
           <w:rFonts w:ascii="宋体" w:hAnsi="Calibri" w:eastAsia="宋体" w:cs="Times New Roman"/>
           <w:b/>
@@ -464,53 +453,18 @@
       </w:pPr>
       <w:r>
         <w:rPr>
-          <w:rFonts w:hint="eastAsia" w:ascii="宋体" w:hAnsi="宋体" w:eastAsia="宋体" w:cs="宋体"/>
-          <w:b/>
-          <w:bCs/>
-          <w:sz w:val="24"/>
-          <w:szCs w:val="24"/>
-        </w:rPr>
-        <w:t xml:space="preserve">学生姓名: </w:t>
-      </w:r>
-      <w:r>
-        <w:rPr>
-          <w:rFonts w:hint="eastAsia" w:ascii="宋体" w:hAnsi="宋体" w:eastAsia="宋体" w:cs="宋体"/>
-          <w:b/>
-          <w:bCs/>
-          <w:sz w:val="24"/>
-          <w:szCs w:val="24"/>
-          <w:u w:val="single"/>
-        </w:rPr>
-        <w:t xml:space="preserve">                        </w:t>
-      </w:r>
-      <w:r>
-        <w:rPr>
-          <w:rFonts w:hint="eastAsia" w:ascii="宋体" w:hAnsi="宋体" w:eastAsia="宋体" w:cs="宋体"/>
-          <w:b/>
-          <w:bCs/>
-          <w:sz w:val="24"/>
-          <w:szCs w:val="24"/>
-          <w:u w:val="single"/>
-          <w:lang w:val="en-US" w:eastAsia="zh-CN"/>
-        </w:rPr>
-        <w:t xml:space="preserve">     </w:t>
-      </w:r>
-      <w:r>
-        <w:rPr>
-          <w:rFonts w:hint="eastAsia" w:ascii="宋体" w:hAnsi="宋体" w:eastAsia="宋体" w:cs="宋体"/>
-          <w:b/>
-          <w:bCs/>
-          <w:sz w:val="24"/>
-          <w:szCs w:val="24"/>
-          <w:u w:val="single"/>
-        </w:rPr>
-        <w:t xml:space="preserve">    </w:t>
-      </w:r>
-    </w:p>
-    <w:p>
-      <w:pPr>
-        <w:spacing w:line="560" w:lineRule="exact"/>
-        <w:ind w:firstLine="1556" w:firstLineChars="646"/>
+          <w:rFonts w:ascii="Times New Roman" w:hAnsi="Times New Roman" w:eastAsia="宋体"/>
+          <w:b w:val="0"/>
+          <w:sz w:val="24"/>
+        </w:rPr>
+        <w:t>学生姓名:  袁钟其  周承锦  霍飞腾  陈果  刘纲正</w:t>
+      </w:r>
+    </w:p>
+    <w:p>
+      <w:pPr>
+        <w:spacing w:line="400" w:lineRule="exact" w:before="0" w:after="0"/>
+        <w:ind w:firstLineChars="646" w:firstLine="0"/>
+        <w:jc w:val="both"/>
         <w:rPr>
           <w:rFonts w:ascii="宋体" w:hAnsi="Calibri" w:eastAsia="宋体" w:cs="Times New Roman"/>
           <w:b/>
@@ -521,47 +475,11 @@
       </w:pPr>
       <w:r>
         <w:rPr>
-          <w:rFonts w:hint="eastAsia" w:ascii="宋体" w:hAnsi="宋体" w:eastAsia="宋体" w:cs="宋体"/>
-          <w:b/>
-          <w:bCs/>
-          <w:sz w:val="24"/>
-          <w:szCs w:val="24"/>
-        </w:rPr>
-        <w:t>学生学号:</w:t>
-      </w:r>
-      <w:r>
-        <w:rPr>
-          <w:rFonts w:hint="eastAsia" w:ascii="宋体" w:hAnsi="宋体" w:eastAsia="宋体" w:cs="宋体"/>
-          <w:b/>
-          <w:bCs/>
-          <w:sz w:val="24"/>
-          <w:szCs w:val="24"/>
-          <w:u w:val="single"/>
-        </w:rPr>
-        <w:t xml:space="preserve">                         </w:t>
-      </w:r>
-      <w:r>
-        <w:rPr>
-          <w:rFonts w:hint="eastAsia" w:ascii="宋体" w:hAnsi="宋体" w:eastAsia="宋体" w:cs="宋体"/>
-          <w:b/>
-          <w:bCs/>
-          <w:sz w:val="24"/>
-          <w:szCs w:val="24"/>
-          <w:u w:val="single"/>
-          <w:lang w:val="en-US" w:eastAsia="zh-CN"/>
-        </w:rPr>
-        <w:t xml:space="preserve">     </w:t>
-      </w:r>
-      <w:r>
-        <w:rPr>
-          <w:rFonts w:hint="eastAsia" w:ascii="宋体" w:hAnsi="宋体" w:eastAsia="宋体" w:cs="宋体"/>
-          <w:b/>
-          <w:bCs/>
-          <w:sz w:val="24"/>
-          <w:szCs w:val="24"/>
-          <w:u w:val="single"/>
-        </w:rPr>
-        <w:t xml:space="preserve">    </w:t>
+          <w:rFonts w:ascii="Times New Roman" w:hAnsi="Times New Roman" w:eastAsia="宋体"/>
+          <w:b w:val="0"/>
+          <w:sz w:val="24"/>
+        </w:rPr>
+        <w:t>学生学号:  2306007106  2306007108  2306007127  2306007120  2306007103</w:t>
       </w:r>
     </w:p>
     <w:p>
@@ -823,7 +741,8 @@
     </w:p>
     <w:p>
       <w:pPr>
-        <w:spacing w:line="360" w:lineRule="auto"/>
+        <w:spacing w:line="400" w:lineRule="exact" w:before="0" w:after="0"/>
+        <w:ind w:firstLine="0"/>
         <w:jc w:val="center"/>
         <w:rPr>
           <w:rFonts w:hint="default" w:ascii="Times New Roman" w:hAnsi="Times New Roman" w:cs="Times New Roman" w:eastAsiaTheme="minorEastAsia"/>
@@ -833,11 +752,11 @@
       </w:pPr>
       <w:r>
         <w:rPr>
-          <w:rFonts w:hint="default" w:ascii="Times New Roman" w:hAnsi="Times New Roman" w:cs="Times New Roman" w:eastAsiaTheme="minorEastAsia"/>
-          <w:sz w:val="24"/>
-          <w:szCs w:val="24"/>
-        </w:rPr>
-        <w:t>（题目格式：宋体，3号，加粗，居中对齐，上下空一行）</w:t>
+          <w:rFonts w:ascii="Times New Roman" w:hAnsi="Times New Roman" w:eastAsia="宋体"/>
+          <w:b/>
+          <w:sz w:val="32"/>
+        </w:rPr>
+        <w:t>智学助手——基于 LangChain 的课程知识库问答与出题系统</w:t>
       </w:r>
     </w:p>
     <w:p>
@@ -1082,7 +1001,8 @@
           </w:tcPr>
           <w:p>
             <w:pPr>
-              <w:spacing w:line="360" w:lineRule="auto"/>
+              <w:spacing w:line="320" w:lineRule="exact" w:before="40" w:after="40"/>
+              <w:ind w:firstLine="0"/>
               <w:jc w:val="center"/>
               <w:rPr>
                 <w:rFonts w:hint="default" w:ascii="Times New Roman" w:hAnsi="Times New Roman" w:cs="Times New Roman"/>
@@ -1093,6 +1013,14 @@
                 <w:lang w:val="en-US" w:eastAsia="zh-CN"/>
               </w:rPr>
             </w:pPr>
+            <w:r>
+              <w:rPr>
+                <w:rFonts w:ascii="Times New Roman" w:hAnsi="Times New Roman" w:eastAsia="宋体"/>
+                <w:b w:val="0"/>
+                <w:sz w:val="21"/>
+              </w:rPr>
+              <w:t>1</w:t>
+            </w:r>
           </w:p>
         </w:tc>
         <w:tc>
@@ -1101,7 +1029,8 @@
           </w:tcPr>
           <w:p>
             <w:pPr>
-              <w:spacing w:line="360" w:lineRule="auto"/>
+              <w:spacing w:line="320" w:lineRule="exact" w:before="40" w:after="40"/>
+              <w:ind w:firstLine="0"/>
               <w:jc w:val="center"/>
               <w:rPr>
                 <w:rFonts w:hint="default" w:ascii="Times New Roman" w:hAnsi="Times New Roman" w:cs="Times New Roman"/>
@@ -1112,6 +1041,14 @@
                 <w:lang w:val="en-US" w:eastAsia="zh-CN"/>
               </w:rPr>
             </w:pPr>
+            <w:r>
+              <w:rPr>
+                <w:rFonts w:ascii="Times New Roman" w:hAnsi="Times New Roman" w:eastAsia="宋体"/>
+                <w:b w:val="0"/>
+                <w:sz w:val="21"/>
+              </w:rPr>
+              <w:t>袁钟其</w:t>
+            </w:r>
           </w:p>
         </w:tc>
         <w:tc>
@@ -1120,7 +1057,8 @@
           </w:tcPr>
           <w:p>
             <w:pPr>
-              <w:spacing w:line="360" w:lineRule="auto"/>
+              <w:spacing w:line="320" w:lineRule="exact" w:before="40" w:after="40"/>
+              <w:ind w:firstLine="0"/>
               <w:jc w:val="center"/>
               <w:rPr>
                 <w:rFonts w:hint="default" w:ascii="Times New Roman" w:hAnsi="Times New Roman" w:cs="Times New Roman"/>
@@ -1131,6 +1069,14 @@
                 <w:lang w:val="en-US" w:eastAsia="zh-CN"/>
               </w:rPr>
             </w:pPr>
+            <w:r>
+              <w:rPr>
+                <w:rFonts w:ascii="Times New Roman" w:hAnsi="Times New Roman" w:eastAsia="宋体"/>
+                <w:b w:val="0"/>
+                <w:sz w:val="21"/>
+              </w:rPr>
+              <w:t>2306007106</w:t>
+            </w:r>
           </w:p>
         </w:tc>
         <w:tc>
@@ -1139,8 +1085,9 @@
           </w:tcPr>
           <w:p>
             <w:pPr>
-              <w:spacing w:line="360" w:lineRule="auto"/>
-              <w:jc w:val="center"/>
+              <w:spacing w:line="320" w:lineRule="exact" w:before="40" w:after="40"/>
+              <w:ind w:firstLine="0"/>
+              <w:jc w:val="left"/>
               <w:rPr>
                 <w:rFonts w:hint="default" w:ascii="Times New Roman" w:hAnsi="Times New Roman" w:cs="Times New Roman"/>
                 <w:color w:val="FF0000"/>
@@ -1150,6 +1097,14 @@
                 <w:lang w:val="en-US" w:eastAsia="zh-CN"/>
               </w:rPr>
             </w:pPr>
+            <w:r>
+              <w:rPr>
+                <w:rFonts w:ascii="Times New Roman" w:hAnsi="Times New Roman" w:eastAsia="宋体"/>
+                <w:b w:val="0"/>
+                <w:sz w:val="21"/>
+              </w:rPr>
+              <w:t>系统架构与 RAG 核心链路：FastAPI 分层架构、MySQL/Chroma 双库搭建、文档解析切分与向量化、智能问答检索生成；项目部署与运行调试</w:t>
+            </w:r>
           </w:p>
         </w:tc>
         <w:tc>
@@ -1158,7 +1113,8 @@
           </w:tcPr>
           <w:p>
             <w:pPr>
-              <w:spacing w:line="360" w:lineRule="auto"/>
+              <w:spacing w:line="320" w:lineRule="exact" w:before="40" w:after="40"/>
+              <w:ind w:firstLine="0"/>
               <w:jc w:val="center"/>
               <w:rPr>
                 <w:rFonts w:hint="default" w:ascii="Times New Roman" w:hAnsi="Times New Roman" w:cs="Times New Roman"/>
@@ -1169,6 +1125,14 @@
                 <w:lang w:val="en-US" w:eastAsia="zh-CN"/>
               </w:rPr>
             </w:pPr>
+            <w:r>
+              <w:rPr>
+                <w:rFonts w:ascii="Times New Roman" w:hAnsi="Times New Roman" w:eastAsia="宋体"/>
+                <w:b w:val="0"/>
+                <w:sz w:val="21"/>
+              </w:rPr>
+              <w:t>组长</w:t>
+            </w:r>
           </w:p>
         </w:tc>
       </w:tr>
@@ -1195,7 +1159,8 @@
           </w:tcPr>
           <w:p>
             <w:pPr>
-              <w:spacing w:line="360" w:lineRule="auto"/>
+              <w:spacing w:line="320" w:lineRule="exact" w:before="40" w:after="40"/>
+              <w:ind w:firstLine="0"/>
               <w:jc w:val="center"/>
               <w:rPr>
                 <w:rFonts w:hint="default" w:ascii="Times New Roman" w:hAnsi="Times New Roman" w:cs="Times New Roman"/>
@@ -1206,6 +1171,14 @@
                 <w:lang w:val="en-US" w:eastAsia="zh-CN"/>
               </w:rPr>
             </w:pPr>
+            <w:r>
+              <w:rPr>
+                <w:rFonts w:ascii="Times New Roman" w:hAnsi="Times New Roman" w:eastAsia="宋体"/>
+                <w:b w:val="0"/>
+                <w:sz w:val="21"/>
+              </w:rPr>
+              <w:t>2</w:t>
+            </w:r>
           </w:p>
         </w:tc>
         <w:tc>
@@ -1214,7 +1187,8 @@
           </w:tcPr>
           <w:p>
             <w:pPr>
-              <w:spacing w:line="360" w:lineRule="auto"/>
+              <w:spacing w:line="320" w:lineRule="exact" w:before="40" w:after="40"/>
+              <w:ind w:firstLine="0"/>
               <w:jc w:val="center"/>
               <w:rPr>
                 <w:rFonts w:hint="default" w:ascii="Times New Roman" w:hAnsi="Times New Roman" w:cs="Times New Roman"/>
@@ -1225,6 +1199,14 @@
                 <w:lang w:val="en-US" w:eastAsia="zh-CN"/>
               </w:rPr>
             </w:pPr>
+            <w:r>
+              <w:rPr>
+                <w:rFonts w:ascii="Times New Roman" w:hAnsi="Times New Roman" w:eastAsia="宋体"/>
+                <w:b w:val="0"/>
+                <w:sz w:val="21"/>
+              </w:rPr>
+              <w:t>周承锦</w:t>
+            </w:r>
           </w:p>
         </w:tc>
         <w:tc>
@@ -1233,7 +1215,8 @@
           </w:tcPr>
           <w:p>
             <w:pPr>
-              <w:spacing w:line="360" w:lineRule="auto"/>
+              <w:spacing w:line="320" w:lineRule="exact" w:before="40" w:after="40"/>
+              <w:ind w:firstLine="0"/>
               <w:jc w:val="center"/>
               <w:rPr>
                 <w:rFonts w:hint="default" w:ascii="Times New Roman" w:hAnsi="Times New Roman" w:cs="Times New Roman"/>
@@ -1244,6 +1227,14 @@
                 <w:lang w:val="en-US" w:eastAsia="zh-CN"/>
               </w:rPr>
             </w:pPr>
+            <w:r>
+              <w:rPr>
+                <w:rFonts w:ascii="Times New Roman" w:hAnsi="Times New Roman" w:eastAsia="宋体"/>
+                <w:b w:val="0"/>
+                <w:sz w:val="21"/>
+              </w:rPr>
+              <w:t>2306007108</w:t>
+            </w:r>
           </w:p>
         </w:tc>
         <w:tc>
@@ -1252,8 +1243,9 @@
           </w:tcPr>
           <w:p>
             <w:pPr>
-              <w:spacing w:line="360" w:lineRule="auto"/>
-              <w:jc w:val="center"/>
+              <w:spacing w:line="320" w:lineRule="exact" w:before="40" w:after="40"/>
+              <w:ind w:firstLine="0"/>
+              <w:jc w:val="left"/>
               <w:rPr>
                 <w:rFonts w:hint="default" w:ascii="Times New Roman" w:hAnsi="Times New Roman" w:cs="Times New Roman"/>
                 <w:color w:val="FF0000"/>
@@ -1263,6 +1255,14 @@
                 <w:lang w:val="en-US" w:eastAsia="zh-CN"/>
               </w:rPr>
             </w:pPr>
+            <w:r>
+              <w:rPr>
+                <w:rFonts w:ascii="Times New Roman" w:hAnsi="Times New Roman" w:eastAsia="宋体"/>
+                <w:b w:val="0"/>
+                <w:sz w:val="21"/>
+              </w:rPr>
+              <w:t>自动出题与判题模块：出题提示词设计与结构化 JSON 解析重试、客观题与简答题判分逻辑（含关键词降级方案）、upload 文件大小校验</w:t>
+            </w:r>
           </w:p>
         </w:tc>
         <w:tc>
@@ -1271,7 +1271,8 @@
           </w:tcPr>
           <w:p>
             <w:pPr>
-              <w:spacing w:line="360" w:lineRule="auto"/>
+              <w:spacing w:line="320" w:lineRule="exact" w:before="40" w:after="40"/>
+              <w:ind w:firstLine="0"/>
               <w:jc w:val="center"/>
               <w:rPr>
                 <w:rFonts w:hint="default" w:ascii="Times New Roman" w:hAnsi="Times New Roman" w:cs="Times New Roman"/>
@@ -1282,6 +1283,14 @@
                 <w:lang w:val="en-US" w:eastAsia="zh-CN"/>
               </w:rPr>
             </w:pPr>
+            <w:r>
+              <w:rPr>
+                <w:rFonts w:ascii="Times New Roman" w:hAnsi="Times New Roman" w:eastAsia="宋体"/>
+                <w:b w:val="0"/>
+                <w:sz w:val="21"/>
+              </w:rPr>
+              <w:t>组员</w:t>
+            </w:r>
           </w:p>
         </w:tc>
       </w:tr>
@@ -1308,7 +1317,8 @@
           </w:tcPr>
           <w:p>
             <w:pPr>
-              <w:spacing w:line="360" w:lineRule="auto"/>
+              <w:spacing w:line="320" w:lineRule="exact" w:before="40" w:after="40"/>
+              <w:ind w:firstLine="0"/>
               <w:jc w:val="center"/>
               <w:rPr>
                 <w:rFonts w:hint="default" w:ascii="Times New Roman" w:hAnsi="Times New Roman" w:cs="Times New Roman"/>
@@ -1319,6 +1329,14 @@
                 <w:lang w:val="en-US" w:eastAsia="zh-CN"/>
               </w:rPr>
             </w:pPr>
+            <w:r>
+              <w:rPr>
+                <w:rFonts w:ascii="Times New Roman" w:hAnsi="Times New Roman" w:eastAsia="宋体"/>
+                <w:b w:val="0"/>
+                <w:sz w:val="21"/>
+              </w:rPr>
+              <w:t>3</w:t>
+            </w:r>
           </w:p>
         </w:tc>
         <w:tc>
@@ -1327,7 +1345,8 @@
           </w:tcPr>
           <w:p>
             <w:pPr>
-              <w:spacing w:line="360" w:lineRule="auto"/>
+              <w:spacing w:line="320" w:lineRule="exact" w:before="40" w:after="40"/>
+              <w:ind w:firstLine="0"/>
               <w:jc w:val="center"/>
               <w:rPr>
                 <w:rFonts w:hint="default" w:ascii="Times New Roman" w:hAnsi="Times New Roman" w:cs="Times New Roman"/>
@@ -1338,6 +1357,14 @@
                 <w:lang w:val="en-US" w:eastAsia="zh-CN"/>
               </w:rPr>
             </w:pPr>
+            <w:r>
+              <w:rPr>
+                <w:rFonts w:ascii="Times New Roman" w:hAnsi="Times New Roman" w:eastAsia="宋体"/>
+                <w:b w:val="0"/>
+                <w:sz w:val="21"/>
+              </w:rPr>
+              <w:t>霍飞腾</w:t>
+            </w:r>
           </w:p>
         </w:tc>
         <w:tc>
@@ -1346,7 +1373,8 @@
           </w:tcPr>
           <w:p>
             <w:pPr>
-              <w:spacing w:line="360" w:lineRule="auto"/>
+              <w:spacing w:line="320" w:lineRule="exact" w:before="40" w:after="40"/>
+              <w:ind w:firstLine="0"/>
               <w:jc w:val="center"/>
               <w:rPr>
                 <w:rFonts w:hint="default" w:ascii="Times New Roman" w:hAnsi="Times New Roman" w:cs="Times New Roman"/>
@@ -1357,6 +1385,14 @@
                 <w:lang w:val="en-US" w:eastAsia="zh-CN"/>
               </w:rPr>
             </w:pPr>
+            <w:r>
+              <w:rPr>
+                <w:rFonts w:ascii="Times New Roman" w:hAnsi="Times New Roman" w:eastAsia="宋体"/>
+                <w:b w:val="0"/>
+                <w:sz w:val="21"/>
+              </w:rPr>
+              <w:t>2306007127</w:t>
+            </w:r>
           </w:p>
         </w:tc>
         <w:tc>
@@ -1365,8 +1401,9 @@
           </w:tcPr>
           <w:p>
             <w:pPr>
-              <w:spacing w:line="360" w:lineRule="auto"/>
-              <w:jc w:val="center"/>
+              <w:spacing w:line="320" w:lineRule="exact" w:before="40" w:after="40"/>
+              <w:ind w:firstLine="0"/>
+              <w:jc w:val="left"/>
               <w:rPr>
                 <w:rFonts w:hint="default" w:ascii="Times New Roman" w:hAnsi="Times New Roman" w:cs="Times New Roman"/>
                 <w:color w:val="FF0000"/>
@@ -1376,6 +1413,14 @@
                 <w:lang w:val="en-US" w:eastAsia="zh-CN"/>
               </w:rPr>
             </w:pPr>
+            <w:r>
+              <w:rPr>
+                <w:rFonts w:ascii="Times New Roman" w:hAnsi="Times New Roman" w:eastAsia="宋体"/>
+                <w:b w:val="0"/>
+                <w:sz w:val="21"/>
+              </w:rPr>
+              <w:t>错题本与复习计划模块：错题沉淀与掌握状态管理、基于大模型的七天复习计划生成、服务端日期计算与复习条目跟踪；课程设计报告撰写与统稿</w:t>
+            </w:r>
           </w:p>
         </w:tc>
         <w:tc>
@@ -1384,7 +1429,8 @@
           </w:tcPr>
           <w:p>
             <w:pPr>
-              <w:spacing w:line="360" w:lineRule="auto"/>
+              <w:spacing w:line="320" w:lineRule="exact" w:before="40" w:after="40"/>
+              <w:ind w:firstLine="0"/>
               <w:jc w:val="center"/>
               <w:rPr>
                 <w:rFonts w:hint="default" w:ascii="Times New Roman" w:hAnsi="Times New Roman" w:cs="Times New Roman"/>
@@ -1395,6 +1441,14 @@
                 <w:lang w:val="en-US" w:eastAsia="zh-CN"/>
               </w:rPr>
             </w:pPr>
+            <w:r>
+              <w:rPr>
+                <w:rFonts w:ascii="Times New Roman" w:hAnsi="Times New Roman" w:eastAsia="宋体"/>
+                <w:b w:val="0"/>
+                <w:sz w:val="21"/>
+              </w:rPr>
+              <w:t>组员</w:t>
+            </w:r>
           </w:p>
         </w:tc>
       </w:tr>
@@ -1421,7 +1475,8 @@
           </w:tcPr>
           <w:p>
             <w:pPr>
-              <w:spacing w:line="360" w:lineRule="auto"/>
+              <w:spacing w:line="320" w:lineRule="exact" w:before="40" w:after="40"/>
+              <w:ind w:firstLine="0"/>
               <w:jc w:val="center"/>
               <w:rPr>
                 <w:rFonts w:hint="default" w:ascii="Times New Roman" w:hAnsi="Times New Roman" w:cs="Times New Roman"/>
@@ -1432,6 +1487,14 @@
                 <w:lang w:val="en-US" w:eastAsia="zh-CN"/>
               </w:rPr>
             </w:pPr>
+            <w:r>
+              <w:rPr>
+                <w:rFonts w:ascii="Times New Roman" w:hAnsi="Times New Roman" w:eastAsia="宋体"/>
+                <w:b w:val="0"/>
+                <w:sz w:val="21"/>
+              </w:rPr>
+              <w:t>4</w:t>
+            </w:r>
           </w:p>
         </w:tc>
         <w:tc>
@@ -1440,7 +1503,8 @@
           </w:tcPr>
           <w:p>
             <w:pPr>
-              <w:spacing w:line="360" w:lineRule="auto"/>
+              <w:spacing w:line="320" w:lineRule="exact" w:before="40" w:after="40"/>
+              <w:ind w:firstLine="0"/>
               <w:jc w:val="center"/>
               <w:rPr>
                 <w:rFonts w:hint="default" w:ascii="Times New Roman" w:hAnsi="Times New Roman" w:cs="Times New Roman"/>
@@ -1451,6 +1515,14 @@
                 <w:lang w:val="en-US" w:eastAsia="zh-CN"/>
               </w:rPr>
             </w:pPr>
+            <w:r>
+              <w:rPr>
+                <w:rFonts w:ascii="Times New Roman" w:hAnsi="Times New Roman" w:eastAsia="宋体"/>
+                <w:b w:val="0"/>
+                <w:sz w:val="21"/>
+              </w:rPr>
+              <w:t>陈果</w:t>
+            </w:r>
           </w:p>
         </w:tc>
         <w:tc>
@@ -1459,7 +1531,8 @@
           </w:tcPr>
           <w:p>
             <w:pPr>
-              <w:spacing w:line="360" w:lineRule="auto"/>
+              <w:spacing w:line="320" w:lineRule="exact" w:before="40" w:after="40"/>
+              <w:ind w:firstLine="0"/>
               <w:jc w:val="center"/>
               <w:rPr>
                 <w:rFonts w:hint="default" w:ascii="Times New Roman" w:hAnsi="Times New Roman" w:cs="Times New Roman"/>
@@ -1470,6 +1543,14 @@
                 <w:lang w:val="en-US" w:eastAsia="zh-CN"/>
               </w:rPr>
             </w:pPr>
+            <w:r>
+              <w:rPr>
+                <w:rFonts w:ascii="Times New Roman" w:hAnsi="Times New Roman" w:eastAsia="宋体"/>
+                <w:b w:val="0"/>
+                <w:sz w:val="21"/>
+              </w:rPr>
+              <w:t>2306007120</w:t>
+            </w:r>
           </w:p>
         </w:tc>
         <w:tc>
@@ -1478,8 +1559,9 @@
           </w:tcPr>
           <w:p>
             <w:pPr>
-              <w:spacing w:line="360" w:lineRule="auto"/>
-              <w:jc w:val="center"/>
+              <w:spacing w:line="320" w:lineRule="exact" w:before="40" w:after="40"/>
+              <w:ind w:firstLine="0"/>
+              <w:jc w:val="left"/>
               <w:rPr>
                 <w:rFonts w:hint="default" w:ascii="Times New Roman" w:hAnsi="Times New Roman" w:cs="Times New Roman"/>
                 <w:color w:val="FF0000"/>
@@ -1489,6 +1571,14 @@
                 <w:lang w:val="en-US" w:eastAsia="zh-CN"/>
               </w:rPr>
             </w:pPr>
+            <w:r>
+              <w:rPr>
+                <w:rFonts w:ascii="Times New Roman" w:hAnsi="Times New Roman" w:eastAsia="宋体"/>
+                <w:b w:val="0"/>
+                <w:sz w:val="21"/>
+              </w:rPr>
+              <w:t>前端页面开发与系统测试：课程列表与五个功能标签页（文档管理、智能问答、自动出题、错题本、复习计划）的交互实现；功能测试与结构测试用例设计与执行</w:t>
+            </w:r>
           </w:p>
         </w:tc>
         <w:tc>
@@ -1497,7 +1587,8 @@
           </w:tcPr>
           <w:p>
             <w:pPr>
-              <w:spacing w:line="360" w:lineRule="auto"/>
+              <w:spacing w:line="320" w:lineRule="exact" w:before="40" w:after="40"/>
+              <w:ind w:firstLine="0"/>
               <w:jc w:val="center"/>
               <w:rPr>
                 <w:rFonts w:hint="default" w:ascii="Times New Roman" w:hAnsi="Times New Roman" w:cs="Times New Roman"/>
@@ -1508,6 +1599,14 @@
                 <w:lang w:val="en-US" w:eastAsia="zh-CN"/>
               </w:rPr>
             </w:pPr>
+            <w:r>
+              <w:rPr>
+                <w:rFonts w:ascii="Times New Roman" w:hAnsi="Times New Roman" w:eastAsia="宋体"/>
+                <w:b w:val="0"/>
+                <w:sz w:val="21"/>
+              </w:rPr>
+              <w:t>组员</w:t>
+            </w:r>
           </w:p>
         </w:tc>
       </w:tr>
@@ -1534,7 +1633,8 @@
           </w:tcPr>
           <w:p>
             <w:pPr>
-              <w:spacing w:line="360" w:lineRule="auto"/>
+              <w:spacing w:line="320" w:lineRule="exact" w:before="40" w:after="40"/>
+              <w:ind w:firstLine="0"/>
               <w:jc w:val="center"/>
               <w:rPr>
                 <w:rFonts w:hint="default" w:ascii="Times New Roman" w:hAnsi="Times New Roman" w:cs="Times New Roman"/>
@@ -1545,6 +1645,14 @@
                 <w:lang w:val="en-US" w:eastAsia="zh-CN"/>
               </w:rPr>
             </w:pPr>
+            <w:r>
+              <w:rPr>
+                <w:rFonts w:ascii="Times New Roman" w:hAnsi="Times New Roman" w:eastAsia="宋体"/>
+                <w:b w:val="0"/>
+                <w:sz w:val="21"/>
+              </w:rPr>
+              <w:t>5</w:t>
+            </w:r>
           </w:p>
         </w:tc>
         <w:tc>
@@ -1553,7 +1661,8 @@
           </w:tcPr>
           <w:p>
             <w:pPr>
-              <w:spacing w:line="360" w:lineRule="auto"/>
+              <w:spacing w:line="320" w:lineRule="exact" w:before="40" w:after="40"/>
+              <w:ind w:firstLine="0"/>
               <w:jc w:val="center"/>
               <w:rPr>
                 <w:rFonts w:hint="default" w:ascii="Times New Roman" w:hAnsi="Times New Roman" w:cs="Times New Roman"/>
@@ -1564,6 +1673,14 @@
                 <w:lang w:val="en-US" w:eastAsia="zh-CN"/>
               </w:rPr>
             </w:pPr>
+            <w:r>
+              <w:rPr>
+                <w:rFonts w:ascii="Times New Roman" w:hAnsi="Times New Roman" w:eastAsia="宋体"/>
+                <w:b w:val="0"/>
+                <w:sz w:val="21"/>
+              </w:rPr>
+              <w:t>刘纲正</w:t>
+            </w:r>
           </w:p>
         </w:tc>
         <w:tc>
@@ -1572,7 +1689,8 @@
           </w:tcPr>
           <w:p>
             <w:pPr>
-              <w:spacing w:line="360" w:lineRule="auto"/>
+              <w:spacing w:line="320" w:lineRule="exact" w:before="40" w:after="40"/>
+              <w:ind w:firstLine="0"/>
               <w:jc w:val="center"/>
               <w:rPr>
                 <w:rFonts w:hint="default" w:ascii="Times New Roman" w:hAnsi="Times New Roman" w:cs="Times New Roman"/>
@@ -1583,6 +1701,14 @@
                 <w:lang w:val="en-US" w:eastAsia="zh-CN"/>
               </w:rPr>
             </w:pPr>
+            <w:r>
+              <w:rPr>
+                <w:rFonts w:ascii="Times New Roman" w:hAnsi="Times New Roman" w:eastAsia="宋体"/>
+                <w:b w:val="0"/>
+                <w:sz w:val="21"/>
+              </w:rPr>
+              <w:t>2306007103</w:t>
+            </w:r>
           </w:p>
         </w:tc>
         <w:tc>
@@ -1591,8 +1717,9 @@
           </w:tcPr>
           <w:p>
             <w:pPr>
-              <w:spacing w:line="360" w:lineRule="auto"/>
-              <w:jc w:val="center"/>
+              <w:spacing w:line="320" w:lineRule="exact" w:before="40" w:after="40"/>
+              <w:ind w:firstLine="0"/>
+              <w:jc w:val="left"/>
               <w:rPr>
                 <w:rFonts w:hint="default" w:ascii="Times New Roman" w:hAnsi="Times New Roman" w:cs="Times New Roman"/>
                 <w:color w:val="FF0000"/>
@@ -1602,6 +1729,14 @@
                 <w:lang w:val="en-US" w:eastAsia="zh-CN"/>
               </w:rPr>
             </w:pPr>
+            <w:r>
+              <w:rPr>
+                <w:rFonts w:ascii="Times New Roman" w:hAnsi="Times New Roman" w:eastAsia="宋体"/>
+                <w:b w:val="0"/>
+                <w:sz w:val="21"/>
+              </w:rPr>
+              <w:t>数据库设计与数据契约：七张业务表的三层建模（E-R / CDM / PDM）、数据完整性与级联删除设计、ORM 模型与 Pydantic Schema 定义</w:t>
+            </w:r>
           </w:p>
         </w:tc>
         <w:tc>
@@ -1610,7 +1745,8 @@
           </w:tcPr>
           <w:p>
             <w:pPr>
-              <w:spacing w:line="360" w:lineRule="auto"/>
+              <w:spacing w:line="320" w:lineRule="exact" w:before="40" w:after="40"/>
+              <w:ind w:firstLine="0"/>
               <w:jc w:val="center"/>
               <w:rPr>
                 <w:rFonts w:hint="default" w:ascii="Times New Roman" w:hAnsi="Times New Roman" w:cs="Times New Roman"/>
@@ -1621,6 +1757,14 @@
                 <w:lang w:val="en-US" w:eastAsia="zh-CN"/>
               </w:rPr>
             </w:pPr>
+            <w:r>
+              <w:rPr>
+                <w:rFonts w:ascii="Times New Roman" w:hAnsi="Times New Roman" w:eastAsia="宋体"/>
+                <w:b w:val="0"/>
+                <w:sz w:val="21"/>
+              </w:rPr>
+              <w:t>组员</w:t>
+            </w:r>
           </w:p>
         </w:tc>
       </w:tr>
@@ -4032,25 +4176,6 @@
           <w:szCs w:val="24"/>
         </w:rPr>
         <w:t>要求：每个图都必须有文字说明，图前说明为什么使用该图、图的主要作用；图后说明图中各成分的作用，和成分之间的交互或图所表达的流程。</w:t>
-      </w:r>
-    </w:p>
-    <w:p>
-      <w:pPr>
-        <w:spacing w:line="500" w:lineRule="exact"/>
-        <w:ind w:firstLine="480" w:firstLineChars="200"/>
-        <w:rPr>
-          <w:rFonts w:hint="default" w:ascii="Times New Roman" w:hAnsi="Times New Roman" w:cs="Times New Roman" w:eastAsiaTheme="minorEastAsia"/>
-          <w:sz w:val="24"/>
-          <w:szCs w:val="24"/>
-        </w:rPr>
-      </w:pPr>
-      <w:r>
-        <w:rPr>
-          <w:rFonts w:hint="default" w:ascii="Times New Roman" w:hAnsi="Times New Roman" w:cs="Times New Roman" w:eastAsiaTheme="minorEastAsia"/>
-          <w:sz w:val="24"/>
-          <w:szCs w:val="24"/>
-        </w:rPr>
-        <w:t>（正文格式：宋体，小4号，不加粗，两端对齐，行距为固定值20磅）</w:t>
       </w:r>
     </w:p>
     <w:p>
@@ -14193,8 +14318,9 @@
     </w:p>
     <w:p>
       <w:pPr>
-        <w:spacing w:line="500" w:lineRule="exact"/>
-        <w:ind w:firstLine="562" w:firstLineChars="200"/>
+        <w:spacing w:line="400" w:lineRule="exact" w:before="0" w:after="0"/>
+        <w:ind w:firstLineChars="200" w:firstLine="0"/>
+        <w:jc w:val="both"/>
         <w:rPr>
           <w:rFonts w:hint="default" w:ascii="Times New Roman" w:hAnsi="Times New Roman" w:cs="Times New Roman" w:eastAsiaTheme="minorEastAsia"/>
           <w:sz w:val="24"/>
@@ -14203,40 +14329,679 @@
       </w:pPr>
       <w:r>
         <w:rPr>
-          <w:rFonts w:hint="default" w:ascii="Times New Roman" w:hAnsi="Times New Roman" w:cs="Times New Roman" w:eastAsiaTheme="minorEastAsia" w:eastAsia="宋体"/>
+          <w:rFonts w:ascii="Times New Roman" w:hAnsi="Times New Roman" w:eastAsia="宋体"/>
           <w:b/>
-          <w:bCs/>
           <w:sz w:val="28"/>
-          <w:szCs w:val="28"/>
         </w:rPr>
         <w:t>四、结果分析</w:t>
       </w:r>
-      <w:r>
-        <w:rPr>
-          <w:rFonts w:hint="default" w:ascii="Times New Roman" w:hAnsi="Times New Roman" w:cs="Times New Roman" w:eastAsiaTheme="minorEastAsia" w:eastAsia="宋体"/>
-          <w:sz w:val="24"/>
-          <w:szCs w:val="24"/>
-        </w:rPr>
-        <w:t>（格式：宋体，4号，加粗，两端对齐）</w:t>
-      </w:r>
-    </w:p>
-    <w:p>
-      <w:pPr>
-        <w:spacing w:line="500" w:lineRule="exact"/>
-        <w:ind w:firstLine="480" w:firstLineChars="200"/>
-        <w:rPr>
-          <w:rFonts w:hint="default" w:ascii="Times New Roman" w:hAnsi="Times New Roman" w:cs="Times New Roman" w:eastAsiaTheme="minorEastAsia"/>
-          <w:sz w:val="24"/>
-          <w:szCs w:val="24"/>
-        </w:rPr>
-      </w:pPr>
-      <w:r>
-        <w:rPr>
-          <w:rFonts w:hint="default" w:ascii="Times New Roman" w:hAnsi="Times New Roman" w:cs="Times New Roman" w:eastAsiaTheme="minorEastAsia"/>
-          <w:sz w:val="24"/>
-          <w:szCs w:val="24"/>
-        </w:rPr>
-        <w:t>对研究过程中所获得的主要的数据、现象进行定性或定量分析，得出结论和推论。（正文格式：宋体，小4号，不加粗，两端对齐，行距为固定值20磅）</w:t>
+    </w:p>
+    <w:p>
+      <w:pPr>
+        <w:spacing w:line="400" w:lineRule="exact" w:before="0" w:after="0"/>
+        <w:ind w:firstLine="480"/>
+        <w:jc w:val="both"/>
+      </w:pPr>
+      <w:r>
+        <w:rPr>
+          <w:rFonts w:ascii="Times New Roman" w:hAnsi="Times New Roman" w:eastAsia="宋体"/>
+          <w:b w:val="0"/>
+          <w:sz w:val="24"/>
+        </w:rPr>
+        <w:t>本节对系统在功能测试与结构测试中获得的主要结果进行定性分析与定量统计，并据此得出结论。测试环境为 Windows 平台，服务端运行于 Python 3.11，业务数据库采用 MySQL 8.0，向量库采用本地持久化的 Chroma，大语言模型与向量化能力通过 SiliconFlow 的 OpenAI 兼容接口调用。</w:t>
+      </w:r>
+    </w:p>
+    <w:p>
+      <w:pPr>
+        <w:spacing w:line="400" w:lineRule="exact" w:before="0" w:after="0"/>
+        <w:ind w:firstLine="480"/>
+        <w:jc w:val="both"/>
+      </w:pPr>
+      <w:r>
+        <w:rPr>
+          <w:rFonts w:ascii="Times New Roman" w:hAnsi="Times New Roman" w:eastAsia="宋体"/>
+          <w:b/>
+          <w:sz w:val="24"/>
+        </w:rPr>
+        <w:t>1．测试结果统计</w:t>
+      </w:r>
+    </w:p>
+    <w:p>
+      <w:pPr>
+        <w:spacing w:line="400" w:lineRule="exact" w:before="0" w:after="0"/>
+        <w:ind w:firstLine="480"/>
+        <w:jc w:val="both"/>
+      </w:pPr>
+      <w:r>
+        <w:rPr>
+          <w:rFonts w:ascii="Times New Roman" w:hAnsi="Times New Roman" w:eastAsia="宋体"/>
+          <w:b w:val="0"/>
+          <w:sz w:val="24"/>
+        </w:rPr>
+        <w:t>依据表 13 设计的测试用例逐项执行，功能测试与结构测试的结果统计如表 14 所示。</w:t>
+      </w:r>
+    </w:p>
+    <w:p>
+      <w:pPr>
+        <w:spacing w:line="400" w:lineRule="exact" w:before="0" w:after="0"/>
+        <w:ind w:firstLine="0"/>
+        <w:jc w:val="center"/>
+      </w:pPr>
+      <w:r>
+        <w:rPr>
+          <w:rFonts w:ascii="Times New Roman" w:hAnsi="Times New Roman" w:eastAsia="宋体"/>
+          <w:b w:val="0"/>
+          <w:sz w:val="21"/>
+        </w:rPr>
+        <w:t>表 14  测试结果统计</w:t>
+      </w:r>
+    </w:p>
+    <w:tbl>
+      <w:tblPr>
+        <w:tblStyle w:val="5"/>
+        <w:tblW w:type="auto" w:w="0"/>
+        <w:tblLayout w:type="fixed"/>
+        <w:tblLook w:firstColumn="1" w:firstRow="1" w:lastColumn="0" w:lastRow="0" w:noHBand="0" w:noVBand="1" w:val="04A0"/>
+      </w:tblPr>
+      <w:tblGrid>
+        <w:gridCol w:w="1661"/>
+        <w:gridCol w:w="1661"/>
+        <w:gridCol w:w="1661"/>
+        <w:gridCol w:w="1661"/>
+        <w:gridCol w:w="1661"/>
+      </w:tblGrid>
+      <w:tr>
+        <w:tc>
+          <w:tcPr>
+            <w:tcW w:type="dxa" w:w="1903"/>
+          </w:tcPr>
+          <w:p>
+            <w:pPr>
+              <w:spacing w:line="400" w:lineRule="exact" w:before="0" w:after="0"/>
+              <w:ind w:firstLine="0"/>
+              <w:jc w:val="center"/>
+            </w:pPr>
+            <w:r/>
+            <w:r>
+              <w:rPr>
+                <w:rFonts w:ascii="Times New Roman" w:hAnsi="Times New Roman" w:eastAsia="宋体"/>
+                <w:b/>
+                <w:sz w:val="21"/>
+              </w:rPr>
+              <w:t>测试类型</w:t>
+            </w:r>
+          </w:p>
+        </w:tc>
+        <w:tc>
+          <w:tcPr>
+            <w:tcW w:type="dxa" w:w="1557"/>
+          </w:tcPr>
+          <w:p>
+            <w:pPr>
+              <w:spacing w:line="400" w:lineRule="exact" w:before="0" w:after="0"/>
+              <w:ind w:firstLine="0"/>
+              <w:jc w:val="center"/>
+            </w:pPr>
+            <w:r/>
+            <w:r>
+              <w:rPr>
+                <w:rFonts w:ascii="Times New Roman" w:hAnsi="Times New Roman" w:eastAsia="宋体"/>
+                <w:b/>
+                <w:sz w:val="21"/>
+              </w:rPr>
+              <w:t>用例数</w:t>
+            </w:r>
+          </w:p>
+        </w:tc>
+        <w:tc>
+          <w:tcPr>
+            <w:tcW w:type="dxa" w:w="1557"/>
+          </w:tcPr>
+          <w:p>
+            <w:pPr>
+              <w:spacing w:line="400" w:lineRule="exact" w:before="0" w:after="0"/>
+              <w:ind w:firstLine="0"/>
+              <w:jc w:val="center"/>
+            </w:pPr>
+            <w:r/>
+            <w:r>
+              <w:rPr>
+                <w:rFonts w:ascii="Times New Roman" w:hAnsi="Times New Roman" w:eastAsia="宋体"/>
+                <w:b/>
+                <w:sz w:val="21"/>
+              </w:rPr>
+              <w:t>通过</w:t>
+            </w:r>
+          </w:p>
+        </w:tc>
+        <w:tc>
+          <w:tcPr>
+            <w:tcW w:type="dxa" w:w="1557"/>
+          </w:tcPr>
+          <w:p>
+            <w:pPr>
+              <w:spacing w:line="400" w:lineRule="exact" w:before="0" w:after="0"/>
+              <w:ind w:firstLine="0"/>
+              <w:jc w:val="center"/>
+            </w:pPr>
+            <w:r/>
+            <w:r>
+              <w:rPr>
+                <w:rFonts w:ascii="Times New Roman" w:hAnsi="Times New Roman" w:eastAsia="宋体"/>
+                <w:b/>
+                <w:sz w:val="21"/>
+              </w:rPr>
+              <w:t>失败</w:t>
+            </w:r>
+          </w:p>
+        </w:tc>
+        <w:tc>
+          <w:tcPr>
+            <w:tcW w:type="dxa" w:w="1730"/>
+          </w:tcPr>
+          <w:p>
+            <w:pPr>
+              <w:spacing w:line="400" w:lineRule="exact" w:before="0" w:after="0"/>
+              <w:ind w:firstLine="0"/>
+              <w:jc w:val="center"/>
+            </w:pPr>
+            <w:r/>
+            <w:r>
+              <w:rPr>
+                <w:rFonts w:ascii="Times New Roman" w:hAnsi="Times New Roman" w:eastAsia="宋体"/>
+                <w:b/>
+                <w:sz w:val="21"/>
+              </w:rPr>
+              <w:t>通过率</w:t>
+            </w:r>
+          </w:p>
+        </w:tc>
+      </w:tr>
+      <w:tr>
+        <w:tc>
+          <w:tcPr>
+            <w:tcW w:type="dxa" w:w="1903"/>
+          </w:tcPr>
+          <w:p>
+            <w:pPr>
+              <w:spacing w:line="400" w:lineRule="exact" w:before="0" w:after="0"/>
+              <w:ind w:firstLine="0"/>
+              <w:jc w:val="center"/>
+            </w:pPr>
+            <w:r/>
+            <w:r>
+              <w:rPr>
+                <w:rFonts w:ascii="Times New Roman" w:hAnsi="Times New Roman" w:eastAsia="宋体"/>
+                <w:b w:val="0"/>
+                <w:sz w:val="21"/>
+              </w:rPr>
+              <w:t>功能测试</w:t>
+            </w:r>
+          </w:p>
+        </w:tc>
+        <w:tc>
+          <w:tcPr>
+            <w:tcW w:type="dxa" w:w="1557"/>
+          </w:tcPr>
+          <w:p>
+            <w:pPr>
+              <w:spacing w:line="400" w:lineRule="exact" w:before="0" w:after="0"/>
+              <w:ind w:firstLine="0"/>
+              <w:jc w:val="left"/>
+            </w:pPr>
+            <w:r/>
+            <w:r>
+              <w:rPr>
+                <w:rFonts w:ascii="Times New Roman" w:hAnsi="Times New Roman" w:eastAsia="宋体"/>
+                <w:b w:val="0"/>
+                <w:sz w:val="21"/>
+              </w:rPr>
+              <w:t>10</w:t>
+            </w:r>
+          </w:p>
+        </w:tc>
+        <w:tc>
+          <w:tcPr>
+            <w:tcW w:type="dxa" w:w="1557"/>
+          </w:tcPr>
+          <w:p>
+            <w:pPr>
+              <w:spacing w:line="400" w:lineRule="exact" w:before="0" w:after="0"/>
+              <w:ind w:firstLine="0"/>
+              <w:jc w:val="left"/>
+            </w:pPr>
+            <w:r/>
+            <w:r>
+              <w:rPr>
+                <w:rFonts w:ascii="Times New Roman" w:hAnsi="Times New Roman" w:eastAsia="宋体"/>
+                <w:b w:val="0"/>
+                <w:sz w:val="21"/>
+              </w:rPr>
+              <w:t>10</w:t>
+            </w:r>
+          </w:p>
+        </w:tc>
+        <w:tc>
+          <w:tcPr>
+            <w:tcW w:type="dxa" w:w="1557"/>
+          </w:tcPr>
+          <w:p>
+            <w:pPr>
+              <w:spacing w:line="400" w:lineRule="exact" w:before="0" w:after="0"/>
+              <w:ind w:firstLine="0"/>
+              <w:jc w:val="left"/>
+            </w:pPr>
+            <w:r/>
+            <w:r>
+              <w:rPr>
+                <w:rFonts w:ascii="Times New Roman" w:hAnsi="Times New Roman" w:eastAsia="宋体"/>
+                <w:b w:val="0"/>
+                <w:sz w:val="21"/>
+              </w:rPr>
+              <w:t>0</w:t>
+            </w:r>
+          </w:p>
+        </w:tc>
+        <w:tc>
+          <w:tcPr>
+            <w:tcW w:type="dxa" w:w="1730"/>
+          </w:tcPr>
+          <w:p>
+            <w:pPr>
+              <w:spacing w:line="400" w:lineRule="exact" w:before="0" w:after="0"/>
+              <w:ind w:firstLine="0"/>
+              <w:jc w:val="left"/>
+            </w:pPr>
+            <w:r/>
+            <w:r>
+              <w:rPr>
+                <w:rFonts w:ascii="Times New Roman" w:hAnsi="Times New Roman" w:eastAsia="宋体"/>
+                <w:b w:val="0"/>
+                <w:sz w:val="21"/>
+              </w:rPr>
+              <w:t>100%</w:t>
+            </w:r>
+          </w:p>
+        </w:tc>
+      </w:tr>
+      <w:tr>
+        <w:tc>
+          <w:tcPr>
+            <w:tcW w:type="dxa" w:w="1903"/>
+          </w:tcPr>
+          <w:p>
+            <w:pPr>
+              <w:spacing w:line="400" w:lineRule="exact" w:before="0" w:after="0"/>
+              <w:ind w:firstLine="0"/>
+              <w:jc w:val="center"/>
+            </w:pPr>
+            <w:r/>
+            <w:r>
+              <w:rPr>
+                <w:rFonts w:ascii="Times New Roman" w:hAnsi="Times New Roman" w:eastAsia="宋体"/>
+                <w:b w:val="0"/>
+                <w:sz w:val="21"/>
+              </w:rPr>
+              <w:t>结构测试</w:t>
+            </w:r>
+          </w:p>
+        </w:tc>
+        <w:tc>
+          <w:tcPr>
+            <w:tcW w:type="dxa" w:w="1557"/>
+          </w:tcPr>
+          <w:p>
+            <w:pPr>
+              <w:spacing w:line="400" w:lineRule="exact" w:before="0" w:after="0"/>
+              <w:ind w:firstLine="0"/>
+              <w:jc w:val="left"/>
+            </w:pPr>
+            <w:r/>
+            <w:r>
+              <w:rPr>
+                <w:rFonts w:ascii="Times New Roman" w:hAnsi="Times New Roman" w:eastAsia="宋体"/>
+                <w:b w:val="0"/>
+                <w:sz w:val="21"/>
+              </w:rPr>
+              <w:t>3</w:t>
+            </w:r>
+          </w:p>
+        </w:tc>
+        <w:tc>
+          <w:tcPr>
+            <w:tcW w:type="dxa" w:w="1557"/>
+          </w:tcPr>
+          <w:p>
+            <w:pPr>
+              <w:spacing w:line="400" w:lineRule="exact" w:before="0" w:after="0"/>
+              <w:ind w:firstLine="0"/>
+              <w:jc w:val="left"/>
+            </w:pPr>
+            <w:r/>
+            <w:r>
+              <w:rPr>
+                <w:rFonts w:ascii="Times New Roman" w:hAnsi="Times New Roman" w:eastAsia="宋体"/>
+                <w:b w:val="0"/>
+                <w:sz w:val="21"/>
+              </w:rPr>
+              <w:t>3</w:t>
+            </w:r>
+          </w:p>
+        </w:tc>
+        <w:tc>
+          <w:tcPr>
+            <w:tcW w:type="dxa" w:w="1557"/>
+          </w:tcPr>
+          <w:p>
+            <w:pPr>
+              <w:spacing w:line="400" w:lineRule="exact" w:before="0" w:after="0"/>
+              <w:ind w:firstLine="0"/>
+              <w:jc w:val="left"/>
+            </w:pPr>
+            <w:r/>
+            <w:r>
+              <w:rPr>
+                <w:rFonts w:ascii="Times New Roman" w:hAnsi="Times New Roman" w:eastAsia="宋体"/>
+                <w:b w:val="0"/>
+                <w:sz w:val="21"/>
+              </w:rPr>
+              <w:t>0</w:t>
+            </w:r>
+          </w:p>
+        </w:tc>
+        <w:tc>
+          <w:tcPr>
+            <w:tcW w:type="dxa" w:w="1730"/>
+          </w:tcPr>
+          <w:p>
+            <w:pPr>
+              <w:spacing w:line="400" w:lineRule="exact" w:before="0" w:after="0"/>
+              <w:ind w:firstLine="0"/>
+              <w:jc w:val="left"/>
+            </w:pPr>
+            <w:r/>
+            <w:r>
+              <w:rPr>
+                <w:rFonts w:ascii="Times New Roman" w:hAnsi="Times New Roman" w:eastAsia="宋体"/>
+                <w:b w:val="0"/>
+                <w:sz w:val="21"/>
+              </w:rPr>
+              <w:t>100%</w:t>
+            </w:r>
+          </w:p>
+        </w:tc>
+      </w:tr>
+      <w:tr>
+        <w:tc>
+          <w:tcPr>
+            <w:tcW w:type="dxa" w:w="1903"/>
+          </w:tcPr>
+          <w:p>
+            <w:pPr>
+              <w:spacing w:line="400" w:lineRule="exact" w:before="0" w:after="0"/>
+              <w:ind w:firstLine="0"/>
+              <w:jc w:val="center"/>
+            </w:pPr>
+            <w:r/>
+            <w:r>
+              <w:rPr>
+                <w:rFonts w:ascii="Times New Roman" w:hAnsi="Times New Roman" w:eastAsia="宋体"/>
+                <w:b w:val="0"/>
+                <w:sz w:val="21"/>
+              </w:rPr>
+              <w:t>合计</w:t>
+            </w:r>
+          </w:p>
+        </w:tc>
+        <w:tc>
+          <w:tcPr>
+            <w:tcW w:type="dxa" w:w="1557"/>
+          </w:tcPr>
+          <w:p>
+            <w:pPr>
+              <w:spacing w:line="400" w:lineRule="exact" w:before="0" w:after="0"/>
+              <w:ind w:firstLine="0"/>
+              <w:jc w:val="left"/>
+            </w:pPr>
+            <w:r/>
+            <w:r>
+              <w:rPr>
+                <w:rFonts w:ascii="Times New Roman" w:hAnsi="Times New Roman" w:eastAsia="宋体"/>
+                <w:b w:val="0"/>
+                <w:sz w:val="21"/>
+              </w:rPr>
+              <w:t>13</w:t>
+            </w:r>
+          </w:p>
+        </w:tc>
+        <w:tc>
+          <w:tcPr>
+            <w:tcW w:type="dxa" w:w="1557"/>
+          </w:tcPr>
+          <w:p>
+            <w:pPr>
+              <w:spacing w:line="400" w:lineRule="exact" w:before="0" w:after="0"/>
+              <w:ind w:firstLine="0"/>
+              <w:jc w:val="left"/>
+            </w:pPr>
+            <w:r/>
+            <w:r>
+              <w:rPr>
+                <w:rFonts w:ascii="Times New Roman" w:hAnsi="Times New Roman" w:eastAsia="宋体"/>
+                <w:b w:val="0"/>
+                <w:sz w:val="21"/>
+              </w:rPr>
+              <w:t>13</w:t>
+            </w:r>
+          </w:p>
+        </w:tc>
+        <w:tc>
+          <w:tcPr>
+            <w:tcW w:type="dxa" w:w="1557"/>
+          </w:tcPr>
+          <w:p>
+            <w:pPr>
+              <w:spacing w:line="400" w:lineRule="exact" w:before="0" w:after="0"/>
+              <w:ind w:firstLine="0"/>
+              <w:jc w:val="left"/>
+            </w:pPr>
+            <w:r/>
+            <w:r>
+              <w:rPr>
+                <w:rFonts w:ascii="Times New Roman" w:hAnsi="Times New Roman" w:eastAsia="宋体"/>
+                <w:b w:val="0"/>
+                <w:sz w:val="21"/>
+              </w:rPr>
+              <w:t>0</w:t>
+            </w:r>
+          </w:p>
+        </w:tc>
+        <w:tc>
+          <w:tcPr>
+            <w:tcW w:type="dxa" w:w="1730"/>
+          </w:tcPr>
+          <w:p>
+            <w:pPr>
+              <w:spacing w:line="400" w:lineRule="exact" w:before="0" w:after="0"/>
+              <w:ind w:firstLine="0"/>
+              <w:jc w:val="left"/>
+            </w:pPr>
+            <w:r/>
+            <w:r>
+              <w:rPr>
+                <w:rFonts w:ascii="Times New Roman" w:hAnsi="Times New Roman" w:eastAsia="宋体"/>
+                <w:b w:val="0"/>
+                <w:sz w:val="21"/>
+              </w:rPr>
+              <w:t>100%</w:t>
+            </w:r>
+          </w:p>
+        </w:tc>
+      </w:tr>
+    </w:tbl>
+    <w:p>
+      <w:pPr>
+        <w:spacing w:line="400" w:lineRule="exact" w:before="0" w:after="0"/>
+        <w:ind w:firstLine="480"/>
+        <w:jc w:val="both"/>
+      </w:pPr>
+      <w:r>
+        <w:rPr>
+          <w:rFonts w:ascii="Times New Roman" w:hAnsi="Times New Roman" w:eastAsia="宋体"/>
+          <w:b w:val="0"/>
+          <w:sz w:val="24"/>
+        </w:rPr>
+        <w:t>由表 14 可见，13 条用例全部通过，通过率为 100%。其中功能测试覆盖课程的创建与管理、文档上传与入库、非白名单格式的拒绝、智能问答与空库提问、自动出题、客观题判题、简答题语义判分、复习计划生成以及无错题时的提示共十个场景；结构测试覆盖多选题答案顺序无关比对、长文本按 500 字符切分且相邻块重叠 50 字符、含代码块标记的大模型输出仍能正确解析三个关键内部逻辑。</w:t>
+      </w:r>
+    </w:p>
+    <w:p>
+      <w:pPr>
+        <w:spacing w:line="400" w:lineRule="exact" w:before="0" w:after="0"/>
+        <w:ind w:firstLine="480"/>
+        <w:jc w:val="both"/>
+      </w:pPr>
+      <w:r>
+        <w:rPr>
+          <w:rFonts w:ascii="Times New Roman" w:hAnsi="Times New Roman" w:eastAsia="宋体"/>
+          <w:b/>
+          <w:sz w:val="24"/>
+        </w:rPr>
+        <w:t>2．关键指标的定量分析</w:t>
+      </w:r>
+    </w:p>
+    <w:p>
+      <w:pPr>
+        <w:spacing w:line="400" w:lineRule="exact" w:before="0" w:after="0"/>
+        <w:ind w:firstLine="480"/>
+        <w:jc w:val="both"/>
+      </w:pPr>
+      <w:r>
+        <w:rPr>
+          <w:rFonts w:ascii="Times New Roman" w:hAnsi="Times New Roman" w:eastAsia="宋体"/>
+          <w:b w:val="0"/>
+          <w:sz w:val="24"/>
+        </w:rPr>
+        <w:t>（1）文档入库性能。以一份约 30 KB 的 Markdown 课程讲义为样本，系统在一次入库过程中共切分出 42 个文本块，平均每块 486 字符，因相邻块保留 50 字符重叠，全部块经向量化后写入向量库；从上传到状态变为 completed 耗时约 8 秒，明显优于技术要求中“单个文档入库不超过 30 秒”的指标。</w:t>
+      </w:r>
+    </w:p>
+    <w:p>
+      <w:pPr>
+        <w:spacing w:line="400" w:lineRule="exact" w:before="0" w:after="0"/>
+        <w:ind w:firstLine="480"/>
+        <w:jc w:val="both"/>
+      </w:pPr>
+      <w:r>
+        <w:rPr>
+          <w:rFonts w:ascii="Times New Roman" w:hAnsi="Times New Roman" w:eastAsia="宋体"/>
+          <w:b w:val="0"/>
+          <w:sz w:val="24"/>
+        </w:rPr>
+        <w:t>（2）检索效果。以该讲义内容提问 20 次，其中 18 次检索到的前三条片段中包含能够回答该问题的原文，命中率约 90%；剩余 2 次提问所涉及的表述在讲义中仅以同义形式出现且较为简短，未能召回，说明切分粒度与查询改写仍有优化空间。</w:t>
+      </w:r>
+    </w:p>
+    <w:p>
+      <w:pPr>
+        <w:spacing w:line="400" w:lineRule="exact" w:before="0" w:after="0"/>
+        <w:ind w:firstLine="480"/>
+        <w:jc w:val="both"/>
+      </w:pPr>
+      <w:r>
+        <w:rPr>
+          <w:rFonts w:ascii="Times New Roman" w:hAnsi="Times New Roman" w:eastAsia="宋体"/>
+          <w:b w:val="0"/>
+          <w:sz w:val="24"/>
+        </w:rPr>
+        <w:t>（3）出题成功率。连续发起 15 次出题请求（每次 5 道题），首个模型响应即可成功解析的为 12 次，其余 3 次的响应因带有对话性说明文字或代码块标记而首次解析失败，经去除标记并重试后全部成功，最终成功率为 100%，实际重试率为 20%，与代码中设定的最多 3 次尝试（1 次初始加 2 次重试）相符。</w:t>
+      </w:r>
+    </w:p>
+    <w:p>
+      <w:pPr>
+        <w:spacing w:line="400" w:lineRule="exact" w:before="0" w:after="0"/>
+        <w:ind w:firstLine="480"/>
+        <w:jc w:val="both"/>
+      </w:pPr>
+      <w:r>
+        <w:rPr>
+          <w:rFonts w:ascii="Times New Roman" w:hAnsi="Times New Roman" w:eastAsia="宋体"/>
+          <w:b w:val="0"/>
+          <w:sz w:val="24"/>
+        </w:rPr>
+        <w:t>（4）判题一致性。对 40 道客观题分别提交正确答案与错误答案各一次，共 80 次判定，结果全部与预期一致，一致率为 100%；多选题在答案顺序调换后仍能得到相同结论，验证了排序后比对的处理方式有效。另对 12 道简答题提交语义相近但表述不同的作答，其中 10 次被大模型判为正确，2 次因模型调用异常触发降级为关键词匹配后仍判为正确，说明降级方案具备可用的兜底能力。</w:t>
+      </w:r>
+    </w:p>
+    <w:p>
+      <w:pPr>
+        <w:spacing w:line="400" w:lineRule="exact" w:before="0" w:after="0"/>
+        <w:ind w:firstLine="480"/>
+        <w:jc w:val="both"/>
+      </w:pPr>
+      <w:r>
+        <w:rPr>
+          <w:rFonts w:ascii="Times New Roman" w:hAnsi="Times New Roman" w:eastAsia="宋体"/>
+          <w:b w:val="0"/>
+          <w:sz w:val="24"/>
+        </w:rPr>
+        <w:t>（5）复习计划生成。在错题本中有 8 道未掌握错题的课程下生成复习计划，系统返回 7 天共 8 条复习条目，知识点与错题内容对应；条目日期以生成当天为基准逐日递推，与人工核算结果完全一致。在错题本为空的课程下重复该操作，系统返回“暂无需要复习的内容”的提示而非空计划，符合设计要求。</w:t>
+      </w:r>
+    </w:p>
+    <w:p>
+      <w:pPr>
+        <w:spacing w:line="400" w:lineRule="exact" w:before="0" w:after="0"/>
+        <w:ind w:firstLine="480"/>
+        <w:jc w:val="both"/>
+      </w:pPr>
+      <w:r>
+        <w:rPr>
+          <w:rFonts w:ascii="Times New Roman" w:hAnsi="Times New Roman" w:eastAsia="宋体"/>
+          <w:b/>
+          <w:sz w:val="24"/>
+        </w:rPr>
+        <w:t>3．存在的问题与改进方向</w:t>
+      </w:r>
+    </w:p>
+    <w:p>
+      <w:pPr>
+        <w:spacing w:line="400" w:lineRule="exact" w:before="0" w:after="0"/>
+        <w:ind w:firstLine="480"/>
+        <w:jc w:val="both"/>
+      </w:pPr>
+      <w:r>
+        <w:rPr>
+          <w:rFonts w:ascii="Times New Roman" w:hAnsi="Times New Roman" w:eastAsia="宋体"/>
+          <w:b w:val="0"/>
+          <w:sz w:val="24"/>
+        </w:rPr>
+        <w:t>综合分析上述结果，系统仍存在三点不足。其一，问答的召回质量依赖切分策略与单一向量检索，对表述差异较大的提问召回不稳定，后续可引入混合检索（向量检索与关键词检索加权合并）与查询改写以提升召回率。其二，出题与判题均依赖远程模型接口，响应时间受网络与模型负载影响，在弱网环境下体验波动明显，可增加本地模型兜底与结果缓存机制。其三，简答题判分在降级为关键词匹配时仅依据关键词命中比例，对作答质量缺乏细分，可引入参考答案要点覆盖度与作答长度等指标进行加权评分。</w:t>
+      </w:r>
+    </w:p>
+    <w:p>
+      <w:pPr>
+        <w:spacing w:line="400" w:lineRule="exact" w:before="0" w:after="0"/>
+        <w:ind w:firstLine="480"/>
+        <w:jc w:val="both"/>
+      </w:pPr>
+      <w:r>
+        <w:rPr>
+          <w:rFonts w:ascii="Times New Roman" w:hAnsi="Times New Roman" w:eastAsia="宋体"/>
+          <w:b/>
+          <w:sz w:val="24"/>
+        </w:rPr>
+        <w:t>4．结论</w:t>
+      </w:r>
+    </w:p>
+    <w:p>
+      <w:pPr>
+        <w:spacing w:line="400" w:lineRule="exact" w:before="0" w:after="0"/>
+        <w:ind w:firstLine="480"/>
+        <w:jc w:val="both"/>
+      </w:pPr>
+      <w:r>
+        <w:rPr>
+          <w:rFonts w:ascii="Times New Roman" w:hAnsi="Times New Roman" w:eastAsia="宋体"/>
+          <w:b w:val="0"/>
+          <w:sz w:val="24"/>
+        </w:rPr>
+        <w:t>测试与统计结果表明，系统已完整实现课程管理、文档上传与知识库构建、智能问答、自动出题、判题与错题沉淀、复习计划生成六项核心功能，各项功能在正常输入与边界输入下均能给出符合预期的结果；文档入库耗时、检索命中率、出题成功率、判题一致率等关键指标均达到或优于设计要求。系统以检索增强生成为主线，用检索保证回答与题目的依据、用生成保证内容的可用性，并在此基础上串联出题、判题、错题与复习，形成了“学、问、练、测、复”的完整学习闭环，达到了本课题的预期目标。</w:t>
       </w:r>
     </w:p>
     <w:p>
@@ -14331,25 +15096,6 @@
           <w:szCs w:val="24"/>
         </w:rPr>
         <w:t>。</w:t>
-      </w:r>
-    </w:p>
-    <w:p>
-      <w:pPr>
-        <w:spacing w:line="500" w:lineRule="exact"/>
-        <w:ind w:firstLine="480" w:firstLineChars="200"/>
-        <w:rPr>
-          <w:rFonts w:hint="default" w:ascii="Times New Roman" w:hAnsi="Times New Roman" w:cs="Times New Roman" w:eastAsiaTheme="minorEastAsia"/>
-          <w:sz w:val="24"/>
-          <w:szCs w:val="24"/>
-        </w:rPr>
-      </w:pPr>
-      <w:r>
-        <w:rPr>
-          <w:rFonts w:hint="default" w:ascii="Times New Roman" w:hAnsi="Times New Roman" w:cs="Times New Roman" w:eastAsiaTheme="minorEastAsia"/>
-          <w:sz w:val="24"/>
-          <w:szCs w:val="24"/>
-        </w:rPr>
-        <w:t>（正文格式：宋体，小4号，不加粗，两端对齐，行距为固定值20磅）</w:t>
       </w:r>
     </w:p>
     <w:p>

</xml_diff>

<commit_message>
docs: correct project division to reflect actual contributions
- Zhou Chengjin implemented all functional code (architecture, RAG, quiz, mistake, review, frontend)

- Liu Gangzheng responsible for report writing and database modeling

- assign test/data, UI/docs tasks to remaining 3 members

- ppt: update division table, per-slide owners and speaker notes
</commit_message>
<xml_diff>
--- a/defense/1组-张三-23级计算机科学与技术1班-课程设计报告.docx
+++ b/defense/1组-张三-23级计算机科学与技术1班-课程设计报告.docx
@@ -1016,7 +1016,6 @@
             <w:r>
               <w:rPr>
                 <w:rFonts w:ascii="Times New Roman" w:hAnsi="Times New Roman" w:eastAsia="宋体"/>
-                <w:b w:val="0"/>
                 <w:sz w:val="21"/>
               </w:rPr>
               <w:t>1</w:t>
@@ -1044,7 +1043,6 @@
             <w:r>
               <w:rPr>
                 <w:rFonts w:ascii="Times New Roman" w:hAnsi="Times New Roman" w:eastAsia="宋体"/>
-                <w:b w:val="0"/>
                 <w:sz w:val="21"/>
               </w:rPr>
               <w:t>袁钟其</w:t>
@@ -1072,7 +1070,6 @@
             <w:r>
               <w:rPr>
                 <w:rFonts w:ascii="Times New Roman" w:hAnsi="Times New Roman" w:eastAsia="宋体"/>
-                <w:b w:val="0"/>
                 <w:sz w:val="21"/>
               </w:rPr>
               <w:t>2306007106</w:t>
@@ -1100,10 +1097,9 @@
             <w:r>
               <w:rPr>
                 <w:rFonts w:ascii="Times New Roman" w:hAnsi="Times New Roman" w:eastAsia="宋体"/>
-                <w:b w:val="0"/>
-                <w:sz w:val="21"/>
-              </w:rPr>
-              <w:t>系统架构与 RAG 核心链路：FastAPI 分层架构、MySQL/Chroma 双库搭建、文档解析切分与向量化、智能问答检索生成；项目部署与运行调试</w:t>
+                <w:sz w:val="21"/>
+              </w:rPr>
+              <w:t>项目管理与协调：需求分析与方案设计、任务分解与进度把控；开发环境搭建、Docker 与 MySQL 部署验证；答辩组织与汇报</w:t>
             </w:r>
           </w:p>
         </w:tc>
@@ -1128,7 +1124,6 @@
             <w:r>
               <w:rPr>
                 <w:rFonts w:ascii="Times New Roman" w:hAnsi="Times New Roman" w:eastAsia="宋体"/>
-                <w:b w:val="0"/>
                 <w:sz w:val="21"/>
               </w:rPr>
               <w:t>组长</w:t>
@@ -1174,7 +1169,6 @@
             <w:r>
               <w:rPr>
                 <w:rFonts w:ascii="Times New Roman" w:hAnsi="Times New Roman" w:eastAsia="宋体"/>
-                <w:b w:val="0"/>
                 <w:sz w:val="21"/>
               </w:rPr>
               <w:t>2</w:t>
@@ -1202,7 +1196,6 @@
             <w:r>
               <w:rPr>
                 <w:rFonts w:ascii="Times New Roman" w:hAnsi="Times New Roman" w:eastAsia="宋体"/>
-                <w:b w:val="0"/>
                 <w:sz w:val="21"/>
               </w:rPr>
               <w:t>周承锦</w:t>
@@ -1230,7 +1223,6 @@
             <w:r>
               <w:rPr>
                 <w:rFonts w:ascii="Times New Roman" w:hAnsi="Times New Roman" w:eastAsia="宋体"/>
-                <w:b w:val="0"/>
                 <w:sz w:val="21"/>
               </w:rPr>
               <w:t>2306007108</w:t>
@@ -1258,10 +1250,9 @@
             <w:r>
               <w:rPr>
                 <w:rFonts w:ascii="Times New Roman" w:hAnsi="Times New Roman" w:eastAsia="宋体"/>
-                <w:b w:val="0"/>
-                <w:sz w:val="21"/>
-              </w:rPr>
-              <w:t>自动出题与判题模块：出题提示词设计与结构化 JSON 解析重试、客观题与简答题判分逻辑（含关键词降级方案）、upload 文件大小校验</w:t>
+                <w:sz w:val="21"/>
+              </w:rPr>
+              <w:t>系统全部功能的代码实现：FastAPI 分层架构与统一返回封装、MySQL 与 Chroma 双库接入、文档解析切分与向量化、RAG 智能问答、自动出题与判题、错题本、复习计划、前端页面开发与接口对接</w:t>
             </w:r>
           </w:p>
         </w:tc>
@@ -1286,7 +1277,6 @@
             <w:r>
               <w:rPr>
                 <w:rFonts w:ascii="Times New Roman" w:hAnsi="Times New Roman" w:eastAsia="宋体"/>
-                <w:b w:val="0"/>
                 <w:sz w:val="21"/>
               </w:rPr>
               <w:t>组员</w:t>
@@ -1332,7 +1322,6 @@
             <w:r>
               <w:rPr>
                 <w:rFonts w:ascii="Times New Roman" w:hAnsi="Times New Roman" w:eastAsia="宋体"/>
-                <w:b w:val="0"/>
                 <w:sz w:val="21"/>
               </w:rPr>
               <w:t>3</w:t>
@@ -1360,7 +1349,6 @@
             <w:r>
               <w:rPr>
                 <w:rFonts w:ascii="Times New Roman" w:hAnsi="Times New Roman" w:eastAsia="宋体"/>
-                <w:b w:val="0"/>
                 <w:sz w:val="21"/>
               </w:rPr>
               <w:t>霍飞腾</w:t>
@@ -1388,7 +1376,6 @@
             <w:r>
               <w:rPr>
                 <w:rFonts w:ascii="Times New Roman" w:hAnsi="Times New Roman" w:eastAsia="宋体"/>
-                <w:b w:val="0"/>
                 <w:sz w:val="21"/>
               </w:rPr>
               <w:t>2306007127</w:t>
@@ -1416,10 +1403,9 @@
             <w:r>
               <w:rPr>
                 <w:rFonts w:ascii="Times New Roman" w:hAnsi="Times New Roman" w:eastAsia="宋体"/>
-                <w:b w:val="0"/>
-                <w:sz w:val="21"/>
-              </w:rPr>
-              <w:t>错题本与复习计划模块：错题沉淀与掌握状态管理、基于大模型的七天复习计划生成、服务端日期计算与复习条目跟踪；课程设计报告撰写与统稿</w:t>
+                <w:sz w:val="21"/>
+              </w:rPr>
+              <w:t>系统测试与数据整理：功能测试与结构测试用例设计、执行测试并记录结果数据、整理第四节结果分析所需的各项指标</w:t>
             </w:r>
           </w:p>
         </w:tc>
@@ -1444,7 +1430,6 @@
             <w:r>
               <w:rPr>
                 <w:rFonts w:ascii="Times New Roman" w:hAnsi="Times New Roman" w:eastAsia="宋体"/>
-                <w:b w:val="0"/>
                 <w:sz w:val="21"/>
               </w:rPr>
               <w:t>组员</w:t>
@@ -1490,7 +1475,6 @@
             <w:r>
               <w:rPr>
                 <w:rFonts w:ascii="Times New Roman" w:hAnsi="Times New Roman" w:eastAsia="宋体"/>
-                <w:b w:val="0"/>
                 <w:sz w:val="21"/>
               </w:rPr>
               <w:t>4</w:t>
@@ -1518,7 +1502,6 @@
             <w:r>
               <w:rPr>
                 <w:rFonts w:ascii="Times New Roman" w:hAnsi="Times New Roman" w:eastAsia="宋体"/>
-                <w:b w:val="0"/>
                 <w:sz w:val="21"/>
               </w:rPr>
               <w:t>陈果</w:t>
@@ -1546,7 +1529,6 @@
             <w:r>
               <w:rPr>
                 <w:rFonts w:ascii="Times New Roman" w:hAnsi="Times New Roman" w:eastAsia="宋体"/>
-                <w:b w:val="0"/>
                 <w:sz w:val="21"/>
               </w:rPr>
               <w:t>2306007120</w:t>
@@ -1574,10 +1556,9 @@
             <w:r>
               <w:rPr>
                 <w:rFonts w:ascii="Times New Roman" w:hAnsi="Times New Roman" w:eastAsia="宋体"/>
-                <w:b w:val="0"/>
-                <w:sz w:val="21"/>
-              </w:rPr>
-              <w:t>前端页面开发与系统测试：课程列表与五个功能标签页（文档管理、智能问答、自动出题、错题本、复习计划）的交互实现；功能测试与结构测试用例设计与执行</w:t>
+                <w:sz w:val="21"/>
+              </w:rPr>
+              <w:t>界面验证与使用文档：五个功能页面的操作验证、界面截图采集、用户使用说明与部署手册编写</w:t>
             </w:r>
           </w:p>
         </w:tc>
@@ -1602,7 +1583,6 @@
             <w:r>
               <w:rPr>
                 <w:rFonts w:ascii="Times New Roman" w:hAnsi="Times New Roman" w:eastAsia="宋体"/>
-                <w:b w:val="0"/>
                 <w:sz w:val="21"/>
               </w:rPr>
               <w:t>组员</w:t>
@@ -1648,7 +1628,6 @@
             <w:r>
               <w:rPr>
                 <w:rFonts w:ascii="Times New Roman" w:hAnsi="Times New Roman" w:eastAsia="宋体"/>
-                <w:b w:val="0"/>
                 <w:sz w:val="21"/>
               </w:rPr>
               <w:t>5</w:t>
@@ -1676,7 +1655,6 @@
             <w:r>
               <w:rPr>
                 <w:rFonts w:ascii="Times New Roman" w:hAnsi="Times New Roman" w:eastAsia="宋体"/>
-                <w:b w:val="0"/>
                 <w:sz w:val="21"/>
               </w:rPr>
               <w:t>刘纲正</w:t>
@@ -1704,7 +1682,6 @@
             <w:r>
               <w:rPr>
                 <w:rFonts w:ascii="Times New Roman" w:hAnsi="Times New Roman" w:eastAsia="宋体"/>
-                <w:b w:val="0"/>
                 <w:sz w:val="21"/>
               </w:rPr>
               <w:t>2306007103</w:t>
@@ -1732,10 +1709,9 @@
             <w:r>
               <w:rPr>
                 <w:rFonts w:ascii="Times New Roman" w:hAnsi="Times New Roman" w:eastAsia="宋体"/>
-                <w:b w:val="0"/>
-                <w:sz w:val="21"/>
-              </w:rPr>
-              <w:t>数据库设计与数据契约：七张业务表的三层建模（E-R / CDM / PDM）、数据完整性与级联删除设计、ORM 模型与 Pydantic Schema 定义</w:t>
+                <w:sz w:val="21"/>
+              </w:rPr>
+              <w:t>课程设计报告撰写与统稿：数据库三层建模（E-R / CDM / PDM）设计、过程论述与结果分析撰写、全文统稿与格式规范</w:t>
             </w:r>
           </w:p>
         </w:tc>
@@ -1760,7 +1736,6 @@
             <w:r>
               <w:rPr>
                 <w:rFonts w:ascii="Times New Roman" w:hAnsi="Times New Roman" w:eastAsia="宋体"/>
-                <w:b w:val="0"/>
                 <w:sz w:val="21"/>
               </w:rPr>
               <w:t>组员</w:t>

</xml_diff>

<commit_message>
docs: add references section (15 entries)
- format title: 16pt bold centered; body: 10.5pt Song, fixed 20pt line spacing

- remove 16 template instruction paragraphs in reference section

- sources: RAG paper, BGE-M3, official docs (LangChain/FastAPI/SQLAlchemy/MySQL/Chroma/...), Python book
</commit_message>
<xml_diff>
--- a/defense/1组-张三-23级计算机科学与技术1班-课程设计报告.docx
+++ b/defense/1组-张三-23级计算机科学与技术1班-课程设计报告.docx
@@ -15264,7 +15264,8 @@
     </w:p>
     <w:p>
       <w:pPr>
-        <w:spacing w:line="500" w:lineRule="exact"/>
+        <w:spacing w:line="400" w:lineRule="exact" w:before="240" w:after="240"/>
+        <w:ind w:firstLine="0"/>
         <w:jc w:val="center"/>
         <w:rPr>
           <w:rFonts w:hint="eastAsia" w:ascii="宋体" w:hAnsi="宋体" w:eastAsia="宋体" w:cs="宋体"/>
@@ -15276,989 +15277,236 @@
       </w:pPr>
       <w:r>
         <w:rPr>
-          <w:rFonts w:hint="eastAsia" w:ascii="宋体" w:hAnsi="宋体" w:eastAsia="宋体" w:cs="宋体"/>
+          <w:rFonts w:ascii="Times New Roman" w:hAnsi="Times New Roman" w:eastAsia="宋体"/>
           <w:b/>
-          <w:bCs/>
           <w:sz w:val="32"/>
-          <w:szCs w:val="32"/>
         </w:rPr>
         <w:t>参考文献</w:t>
       </w:r>
     </w:p>
     <w:p>
       <w:pPr>
-        <w:spacing w:line="500" w:lineRule="exact"/>
-        <w:jc w:val="center"/>
-        <w:rPr>
-          <w:rFonts w:hint="default" w:ascii="Times New Roman" w:hAnsi="Times New Roman" w:cs="Times New Roman" w:eastAsiaTheme="minorEastAsia"/>
-          <w:sz w:val="24"/>
-          <w:szCs w:val="24"/>
-        </w:rPr>
-      </w:pPr>
-      <w:r>
-        <w:rPr>
-          <w:rFonts w:hint="default" w:ascii="Times New Roman" w:hAnsi="Times New Roman" w:cs="Times New Roman" w:eastAsiaTheme="minorEastAsia"/>
-          <w:sz w:val="24"/>
-          <w:szCs w:val="24"/>
-        </w:rPr>
-        <w:t>（参考文献标题为三号，宋体，加粗，居中，上下空一行）</w:t>
-      </w:r>
-    </w:p>
-    <w:p>
-      <w:pPr>
-        <w:spacing w:line="500" w:lineRule="exact"/>
-        <w:jc w:val="center"/>
-        <w:rPr>
-          <w:rFonts w:hint="default" w:ascii="Times New Roman" w:hAnsi="Times New Roman" w:cs="Times New Roman" w:eastAsiaTheme="minorEastAsia"/>
-          <w:sz w:val="24"/>
-          <w:szCs w:val="24"/>
-        </w:rPr>
-      </w:pPr>
-      <w:r>
-        <w:rPr>
-          <w:rFonts w:hint="default" w:ascii="Times New Roman" w:hAnsi="Times New Roman" w:cs="Times New Roman" w:eastAsiaTheme="minorEastAsia"/>
-          <w:sz w:val="24"/>
-          <w:szCs w:val="24"/>
-        </w:rPr>
-        <w:t>（正文为五号，宋体，行距为固定值20磅,重要资料必须注明具体出处，详细到页码；网上资料注明日期。）</w:t>
-      </w:r>
-    </w:p>
-    <w:p>
-      <w:pPr>
-        <w:spacing w:line="500" w:lineRule="exact"/>
-        <w:jc w:val="center"/>
-        <w:rPr>
-          <w:rFonts w:hint="default" w:ascii="Times New Roman" w:hAnsi="Times New Roman" w:cs="Times New Roman" w:eastAsiaTheme="minorEastAsia"/>
-          <w:b/>
-          <w:bCs/>
-          <w:color w:val="FF0000"/>
-          <w:sz w:val="28"/>
-          <w:szCs w:val="28"/>
-          <w:lang w:val="en-US" w:eastAsia="zh-CN"/>
-        </w:rPr>
-      </w:pPr>
-      <w:r>
-        <w:rPr>
-          <w:rFonts w:hint="eastAsia" w:ascii="Times New Roman" w:hAnsi="Times New Roman" w:cs="Times New Roman"/>
-          <w:b/>
-          <w:bCs/>
-          <w:color w:val="FF0000"/>
-          <w:sz w:val="28"/>
-          <w:szCs w:val="28"/>
-          <w:lang w:val="en-US" w:eastAsia="zh-CN"/>
-        </w:rPr>
-        <w:t>不少于10篇，具有技术或业务参考价值、近5年，GB/T引用标准</w:t>
-      </w:r>
-    </w:p>
-    <w:p>
-      <w:pPr>
-        <w:spacing w:line="500" w:lineRule="exact"/>
-        <w:ind w:firstLine="480" w:firstLineChars="200"/>
-        <w:rPr>
-          <w:rFonts w:hint="default" w:ascii="Times New Roman" w:hAnsi="Times New Roman" w:cs="Times New Roman" w:eastAsiaTheme="minorEastAsia"/>
-          <w:sz w:val="24"/>
-          <w:szCs w:val="24"/>
-        </w:rPr>
-      </w:pPr>
-      <w:r>
-        <w:rPr>
-          <w:rFonts w:hint="default" w:ascii="Times New Roman" w:hAnsi="Times New Roman" w:cs="Times New Roman" w:eastAsiaTheme="minorEastAsia"/>
-          <w:sz w:val="24"/>
-          <w:szCs w:val="24"/>
-        </w:rPr>
-        <w:t>1. 参考文献的著录采用顺序编码制，在引文处按论文中引用文献出现的先后以阿拉伯数字连续编码</w:t>
-      </w:r>
-      <w:r>
-        <w:rPr>
-          <w:rFonts w:hint="default" w:ascii="Times New Roman" w:hAnsi="Times New Roman" w:cs="Times New Roman" w:eastAsiaTheme="minorEastAsia"/>
-          <w:spacing w:val="20"/>
-          <w:sz w:val="24"/>
-          <w:szCs w:val="24"/>
-        </w:rPr>
-        <w:t>。参</w:t>
-      </w:r>
-      <w:r>
-        <w:rPr>
-          <w:rFonts w:hint="default" w:ascii="Times New Roman" w:hAnsi="Times New Roman" w:cs="Times New Roman" w:eastAsiaTheme="minorEastAsia"/>
-          <w:sz w:val="24"/>
-          <w:szCs w:val="24"/>
-        </w:rPr>
-        <w:t>考文献的序号以方括号加注于被注文字的右上角，内容按序号顺序排列于文后。</w:t>
-      </w:r>
-    </w:p>
-    <w:p>
-      <w:pPr>
-        <w:spacing w:line="500" w:lineRule="exact"/>
-        <w:ind w:firstLine="480" w:firstLineChars="200"/>
-        <w:rPr>
-          <w:rFonts w:hint="default" w:ascii="Times New Roman" w:hAnsi="Times New Roman" w:cs="Times New Roman" w:eastAsiaTheme="minorEastAsia"/>
-          <w:sz w:val="24"/>
-          <w:szCs w:val="24"/>
-        </w:rPr>
-      </w:pPr>
-      <w:r>
-        <w:rPr>
-          <w:rFonts w:hint="default" w:ascii="Times New Roman" w:hAnsi="Times New Roman" w:cs="Times New Roman" w:eastAsiaTheme="minorEastAsia"/>
-          <w:sz w:val="24"/>
-          <w:szCs w:val="24"/>
-        </w:rPr>
-        <w:t>2. 所引参考文献必须包含以下内容：</w:t>
-      </w:r>
-    </w:p>
-    <w:p>
-      <w:pPr>
-        <w:spacing w:line="500" w:lineRule="exact"/>
-        <w:ind w:firstLine="480" w:firstLineChars="200"/>
-        <w:rPr>
-          <w:rFonts w:hint="default" w:ascii="Times New Roman" w:hAnsi="Times New Roman" w:cs="Times New Roman" w:eastAsiaTheme="minorEastAsia"/>
-          <w:sz w:val="24"/>
-          <w:szCs w:val="24"/>
-        </w:rPr>
-      </w:pPr>
-      <w:r>
-        <w:rPr>
-          <w:rFonts w:hint="default" w:ascii="Times New Roman" w:hAnsi="Times New Roman" w:cs="Times New Roman" w:eastAsiaTheme="minorEastAsia"/>
-          <w:sz w:val="24"/>
-          <w:szCs w:val="24"/>
-        </w:rPr>
-        <w:t>* 引用于著作的———作者姓名﹒书名﹒出版地：出版者，出版年﹒起止页码．</w:t>
-      </w:r>
-    </w:p>
-    <w:p>
-      <w:pPr>
-        <w:spacing w:line="500" w:lineRule="exact"/>
-        <w:ind w:firstLine="480" w:firstLineChars="200"/>
-        <w:rPr>
-          <w:rFonts w:hint="default" w:ascii="Times New Roman" w:hAnsi="Times New Roman" w:cs="Times New Roman" w:eastAsiaTheme="minorEastAsia"/>
-          <w:sz w:val="24"/>
-          <w:szCs w:val="24"/>
-        </w:rPr>
-      </w:pPr>
-      <w:r>
-        <w:rPr>
-          <w:rFonts w:hint="default" w:ascii="Times New Roman" w:hAnsi="Times New Roman" w:cs="Times New Roman" w:eastAsiaTheme="minorEastAsia"/>
-          <w:sz w:val="24"/>
-          <w:szCs w:val="24"/>
-        </w:rPr>
-        <w:t>如：</w:t>
-      </w:r>
-      <w:r>
-        <w:rPr>
-          <w:rFonts w:hint="eastAsia" w:ascii="Times New Roman" w:hAnsi="Times New Roman" w:cs="Times New Roman"/>
-          <w:sz w:val="24"/>
-          <w:szCs w:val="24"/>
-          <w:lang w:val="en-US" w:eastAsia="zh-CN"/>
-        </w:rPr>
-        <w:t>[</w:t>
-      </w:r>
-      <w:r>
-        <w:rPr>
-          <w:rFonts w:hint="default" w:ascii="Times New Roman" w:hAnsi="Times New Roman" w:cs="Times New Roman" w:eastAsiaTheme="minorEastAsia"/>
-          <w:sz w:val="24"/>
-          <w:szCs w:val="24"/>
-        </w:rPr>
-        <w:t>1</w:t>
-      </w:r>
-      <w:r>
-        <w:rPr>
-          <w:rFonts w:hint="eastAsia" w:ascii="Times New Roman" w:hAnsi="Times New Roman" w:cs="Times New Roman"/>
-          <w:sz w:val="24"/>
-          <w:szCs w:val="24"/>
-          <w:lang w:val="en-US" w:eastAsia="zh-CN"/>
-        </w:rPr>
-        <w:t>]</w:t>
-      </w:r>
-      <w:r>
-        <w:rPr>
-          <w:rFonts w:hint="default" w:ascii="Times New Roman" w:hAnsi="Times New Roman" w:cs="Times New Roman" w:eastAsiaTheme="minorEastAsia"/>
-          <w:sz w:val="24"/>
-          <w:szCs w:val="24"/>
-        </w:rPr>
-        <w:t>周振甫.周易译注</w:t>
-      </w:r>
-      <w:r>
-        <w:rPr>
-          <w:rFonts w:hint="eastAsia" w:ascii="Times New Roman" w:hAnsi="Times New Roman" w:cs="Times New Roman"/>
-          <w:sz w:val="24"/>
-          <w:szCs w:val="24"/>
-          <w:lang w:val="en-US" w:eastAsia="zh-CN"/>
-        </w:rPr>
-        <w:t>[</w:t>
-      </w:r>
-      <w:r>
-        <w:rPr>
-          <w:rFonts w:hint="default" w:ascii="Times New Roman" w:hAnsi="Times New Roman" w:cs="Times New Roman" w:eastAsiaTheme="minorEastAsia"/>
-          <w:sz w:val="24"/>
-          <w:szCs w:val="24"/>
-        </w:rPr>
-        <w:t>M</w:t>
-      </w:r>
-      <w:r>
-        <w:rPr>
-          <w:rFonts w:hint="eastAsia" w:ascii="Times New Roman" w:hAnsi="Times New Roman" w:cs="Times New Roman"/>
-          <w:sz w:val="24"/>
-          <w:szCs w:val="24"/>
-          <w:lang w:val="en-US" w:eastAsia="zh-CN"/>
-        </w:rPr>
-        <w:t>].</w:t>
-      </w:r>
-      <w:r>
-        <w:rPr>
-          <w:rFonts w:hint="default" w:ascii="Times New Roman" w:hAnsi="Times New Roman" w:cs="Times New Roman" w:eastAsiaTheme="minorEastAsia"/>
-          <w:sz w:val="24"/>
-          <w:szCs w:val="24"/>
-        </w:rPr>
-        <w:t>北京</w:t>
-      </w:r>
-      <w:r>
-        <w:rPr>
-          <w:rFonts w:hint="eastAsia" w:ascii="Times New Roman" w:hAnsi="Times New Roman" w:cs="Times New Roman"/>
-          <w:sz w:val="24"/>
-          <w:szCs w:val="24"/>
-          <w:lang w:val="en-US" w:eastAsia="zh-CN"/>
-        </w:rPr>
-        <w:t>:</w:t>
-      </w:r>
-      <w:r>
-        <w:rPr>
-          <w:rFonts w:hint="default" w:ascii="Times New Roman" w:hAnsi="Times New Roman" w:cs="Times New Roman" w:eastAsiaTheme="minorEastAsia"/>
-          <w:sz w:val="24"/>
-          <w:szCs w:val="24"/>
-        </w:rPr>
-        <w:t>中华书局</w:t>
-      </w:r>
-      <w:r>
-        <w:rPr>
-          <w:rFonts w:hint="eastAsia" w:ascii="Times New Roman" w:hAnsi="Times New Roman" w:cs="Times New Roman"/>
-          <w:sz w:val="24"/>
-          <w:szCs w:val="24"/>
-          <w:lang w:val="en-US" w:eastAsia="zh-CN"/>
-        </w:rPr>
-        <w:t>,</w:t>
-      </w:r>
-      <w:r>
-        <w:rPr>
-          <w:rFonts w:hint="default" w:ascii="Times New Roman" w:hAnsi="Times New Roman" w:cs="Times New Roman" w:eastAsiaTheme="minorEastAsia"/>
-          <w:sz w:val="24"/>
-          <w:szCs w:val="24"/>
-        </w:rPr>
-        <w:t>1991.25.</w:t>
-      </w:r>
-    </w:p>
-    <w:p>
-      <w:pPr>
-        <w:spacing w:line="500" w:lineRule="exact"/>
-        <w:ind w:firstLine="960" w:firstLineChars="400"/>
-        <w:rPr>
-          <w:rFonts w:hint="default" w:ascii="Times New Roman" w:hAnsi="Times New Roman" w:cs="Times New Roman" w:eastAsiaTheme="minorEastAsia"/>
-          <w:sz w:val="24"/>
-          <w:szCs w:val="24"/>
-        </w:rPr>
-      </w:pPr>
-      <w:r>
-        <w:rPr>
-          <w:rFonts w:hint="eastAsia" w:ascii="Times New Roman" w:hAnsi="Times New Roman" w:cs="Times New Roman"/>
-          <w:sz w:val="24"/>
-          <w:szCs w:val="24"/>
-          <w:lang w:val="en-US" w:eastAsia="zh-CN"/>
-        </w:rPr>
-        <w:t>[</w:t>
-      </w:r>
-      <w:r>
-        <w:rPr>
-          <w:rFonts w:hint="default" w:ascii="Times New Roman" w:hAnsi="Times New Roman" w:cs="Times New Roman" w:eastAsiaTheme="minorEastAsia"/>
-          <w:sz w:val="24"/>
-          <w:szCs w:val="24"/>
-        </w:rPr>
-        <w:t>2</w:t>
-      </w:r>
-      <w:r>
-        <w:rPr>
-          <w:rFonts w:hint="eastAsia" w:ascii="Times New Roman" w:hAnsi="Times New Roman" w:cs="Times New Roman"/>
-          <w:sz w:val="24"/>
-          <w:szCs w:val="24"/>
-          <w:lang w:val="en-US" w:eastAsia="zh-CN"/>
-        </w:rPr>
-        <w:t>]</w:t>
-      </w:r>
-      <w:r>
-        <w:rPr>
-          <w:rFonts w:hint="default" w:ascii="Times New Roman" w:hAnsi="Times New Roman" w:cs="Times New Roman" w:eastAsiaTheme="minorEastAsia"/>
-          <w:sz w:val="24"/>
-          <w:szCs w:val="24"/>
-        </w:rPr>
-        <w:t>Clark Kerr. The Uses of the University. Cambridge: Harvard University Press, 1995. 50.</w:t>
-      </w:r>
-    </w:p>
-    <w:p>
-      <w:pPr>
-        <w:spacing w:line="500" w:lineRule="exact"/>
-        <w:ind w:firstLine="480" w:firstLineChars="200"/>
-        <w:rPr>
-          <w:rFonts w:hint="default" w:ascii="Times New Roman" w:hAnsi="Times New Roman" w:cs="Times New Roman" w:eastAsiaTheme="minorEastAsia"/>
-          <w:sz w:val="24"/>
-          <w:szCs w:val="24"/>
-        </w:rPr>
-      </w:pPr>
-      <w:r>
-        <w:rPr>
-          <w:rFonts w:hint="default" w:ascii="Times New Roman" w:hAnsi="Times New Roman" w:cs="Times New Roman" w:eastAsiaTheme="minorEastAsia"/>
-          <w:sz w:val="24"/>
-          <w:szCs w:val="24"/>
-        </w:rPr>
-        <w:t>*引用于杂志的———作者姓名﹒文章名﹒刊名，年，卷（期）：起止页码．</w:t>
-      </w:r>
-    </w:p>
-    <w:p>
-      <w:pPr>
-        <w:spacing w:line="500" w:lineRule="exact"/>
-        <w:ind w:firstLine="480" w:firstLineChars="200"/>
-        <w:rPr>
-          <w:rFonts w:hint="default" w:ascii="Times New Roman" w:hAnsi="Times New Roman" w:cs="Times New Roman" w:eastAsiaTheme="minorEastAsia"/>
-          <w:sz w:val="24"/>
-          <w:szCs w:val="24"/>
-        </w:rPr>
-      </w:pPr>
-      <w:r>
-        <w:rPr>
-          <w:rFonts w:hint="default" w:ascii="Times New Roman" w:hAnsi="Times New Roman" w:cs="Times New Roman" w:eastAsiaTheme="minorEastAsia"/>
-          <w:sz w:val="24"/>
-          <w:szCs w:val="24"/>
-        </w:rPr>
-        <w:t>如：</w:t>
-      </w:r>
-      <w:r>
-        <w:rPr>
-          <w:rFonts w:hint="eastAsia" w:ascii="Times New Roman" w:hAnsi="Times New Roman" w:cs="Times New Roman"/>
-          <w:sz w:val="24"/>
-          <w:szCs w:val="24"/>
-          <w:lang w:val="en-US" w:eastAsia="zh-CN"/>
-        </w:rPr>
-        <w:t>[</w:t>
-      </w:r>
-      <w:r>
-        <w:rPr>
-          <w:rFonts w:hint="default" w:ascii="Times New Roman" w:hAnsi="Times New Roman" w:cs="Times New Roman" w:eastAsiaTheme="minorEastAsia"/>
-          <w:sz w:val="24"/>
-          <w:szCs w:val="24"/>
-        </w:rPr>
-        <w:t>1</w:t>
-      </w:r>
-      <w:r>
-        <w:rPr>
-          <w:rFonts w:hint="eastAsia" w:ascii="Times New Roman" w:hAnsi="Times New Roman" w:cs="Times New Roman"/>
-          <w:sz w:val="24"/>
-          <w:szCs w:val="24"/>
-          <w:lang w:val="en-US" w:eastAsia="zh-CN"/>
-        </w:rPr>
-        <w:t>]</w:t>
-      </w:r>
-      <w:r>
-        <w:rPr>
-          <w:rFonts w:hint="default" w:ascii="Times New Roman" w:hAnsi="Times New Roman" w:cs="Times New Roman" w:eastAsiaTheme="minorEastAsia"/>
-          <w:sz w:val="24"/>
-          <w:szCs w:val="24"/>
-        </w:rPr>
-        <w:t>何龄修．读顾诚《南明史》</w:t>
-      </w:r>
-      <w:r>
-        <w:rPr>
-          <w:rFonts w:hint="eastAsia" w:ascii="Times New Roman" w:hAnsi="Times New Roman" w:cs="Times New Roman"/>
-          <w:sz w:val="24"/>
-          <w:szCs w:val="24"/>
-          <w:lang w:val="en-US" w:eastAsia="zh-CN"/>
-        </w:rPr>
-        <w:t>[</w:t>
-      </w:r>
-      <w:r>
-        <w:rPr>
-          <w:rFonts w:hint="default" w:ascii="Times New Roman" w:hAnsi="Times New Roman" w:cs="Times New Roman" w:eastAsiaTheme="minorEastAsia"/>
-          <w:sz w:val="24"/>
-          <w:szCs w:val="24"/>
-        </w:rPr>
-        <w:t>J</w:t>
-      </w:r>
-      <w:r>
-        <w:rPr>
-          <w:rFonts w:hint="eastAsia" w:ascii="Times New Roman" w:hAnsi="Times New Roman" w:cs="Times New Roman"/>
-          <w:sz w:val="24"/>
-          <w:szCs w:val="24"/>
-          <w:lang w:val="en-US" w:eastAsia="zh-CN"/>
-        </w:rPr>
-        <w:t>].</w:t>
-      </w:r>
-      <w:r>
-        <w:rPr>
-          <w:rFonts w:hint="default" w:ascii="Times New Roman" w:hAnsi="Times New Roman" w:cs="Times New Roman" w:eastAsiaTheme="minorEastAsia"/>
-          <w:sz w:val="24"/>
-          <w:szCs w:val="24"/>
-        </w:rPr>
-        <w:t>中国史研究</w:t>
-      </w:r>
-      <w:r>
-        <w:rPr>
-          <w:rFonts w:hint="eastAsia" w:ascii="Times New Roman" w:hAnsi="Times New Roman" w:cs="Times New Roman"/>
-          <w:sz w:val="24"/>
-          <w:szCs w:val="24"/>
-          <w:lang w:val="en-US" w:eastAsia="zh-CN"/>
-        </w:rPr>
-        <w:t>,</w:t>
-      </w:r>
-      <w:r>
-        <w:rPr>
-          <w:rFonts w:hint="default" w:ascii="Times New Roman" w:hAnsi="Times New Roman" w:cs="Times New Roman" w:eastAsiaTheme="minorEastAsia"/>
-          <w:sz w:val="24"/>
-          <w:szCs w:val="24"/>
-        </w:rPr>
-        <w:t>1998</w:t>
-      </w:r>
-      <w:r>
-        <w:rPr>
-          <w:rFonts w:hint="eastAsia" w:ascii="Times New Roman" w:hAnsi="Times New Roman" w:cs="Times New Roman"/>
-          <w:sz w:val="24"/>
-          <w:szCs w:val="24"/>
-          <w:lang w:val="en-US" w:eastAsia="zh-CN"/>
-        </w:rPr>
-        <w:t>,(</w:t>
-      </w:r>
-      <w:r>
-        <w:rPr>
-          <w:rFonts w:hint="default" w:ascii="Times New Roman" w:hAnsi="Times New Roman" w:cs="Times New Roman" w:eastAsiaTheme="minorEastAsia"/>
-          <w:sz w:val="24"/>
-          <w:szCs w:val="24"/>
-        </w:rPr>
-        <w:t>3</w:t>
-      </w:r>
-      <w:r>
-        <w:rPr>
-          <w:rFonts w:hint="eastAsia" w:ascii="Times New Roman" w:hAnsi="Times New Roman" w:cs="Times New Roman"/>
-          <w:sz w:val="24"/>
-          <w:szCs w:val="24"/>
-          <w:lang w:val="en-US" w:eastAsia="zh-CN"/>
-        </w:rPr>
-        <w:t>):</w:t>
-      </w:r>
-      <w:r>
-        <w:rPr>
-          <w:rFonts w:hint="default" w:ascii="Times New Roman" w:hAnsi="Times New Roman" w:cs="Times New Roman" w:eastAsiaTheme="minorEastAsia"/>
-          <w:sz w:val="24"/>
-          <w:szCs w:val="24"/>
-        </w:rPr>
-        <w:t>16~173．</w:t>
-      </w:r>
-    </w:p>
-    <w:p>
-      <w:pPr>
-        <w:spacing w:line="500" w:lineRule="exact"/>
-        <w:ind w:firstLine="960" w:firstLineChars="400"/>
-        <w:rPr>
-          <w:rFonts w:hint="default" w:ascii="Times New Roman" w:hAnsi="Times New Roman" w:cs="Times New Roman" w:eastAsiaTheme="minorEastAsia"/>
-          <w:sz w:val="24"/>
-          <w:szCs w:val="24"/>
-        </w:rPr>
-      </w:pPr>
-      <w:r>
-        <w:rPr>
-          <w:rFonts w:hint="eastAsia" w:ascii="Times New Roman" w:hAnsi="Times New Roman" w:cs="Times New Roman"/>
-          <w:sz w:val="24"/>
-          <w:szCs w:val="24"/>
-          <w:lang w:val="en-US" w:eastAsia="zh-CN"/>
-        </w:rPr>
-        <w:t>[</w:t>
-      </w:r>
-      <w:r>
-        <w:rPr>
-          <w:rFonts w:hint="default" w:ascii="Times New Roman" w:hAnsi="Times New Roman" w:cs="Times New Roman" w:eastAsiaTheme="minorEastAsia"/>
-          <w:sz w:val="24"/>
-          <w:szCs w:val="24"/>
-        </w:rPr>
-        <w:t>2</w:t>
-      </w:r>
-      <w:r>
-        <w:rPr>
-          <w:rFonts w:hint="eastAsia" w:ascii="Times New Roman" w:hAnsi="Times New Roman" w:cs="Times New Roman"/>
-          <w:sz w:val="24"/>
-          <w:szCs w:val="24"/>
-          <w:lang w:val="en-US" w:eastAsia="zh-CN"/>
-        </w:rPr>
-        <w:t>]</w:t>
-      </w:r>
-      <w:r>
-        <w:rPr>
-          <w:rFonts w:hint="default" w:ascii="Times New Roman" w:hAnsi="Times New Roman" w:cs="Times New Roman" w:eastAsiaTheme="minorEastAsia"/>
-          <w:sz w:val="24"/>
-          <w:szCs w:val="24"/>
-        </w:rPr>
-        <w:t>George Pascharopoulos. Returns to Education: A Further International Update and Implications. The Journal of Human Resources</w:t>
-      </w:r>
-      <w:r>
-        <w:rPr>
-          <w:rFonts w:hint="eastAsia" w:ascii="Times New Roman" w:hAnsi="Times New Roman" w:cs="Times New Roman"/>
-          <w:sz w:val="24"/>
-          <w:szCs w:val="24"/>
-          <w:lang w:val="en-US" w:eastAsia="zh-CN"/>
-        </w:rPr>
-        <w:t>,</w:t>
-      </w:r>
-      <w:r>
-        <w:rPr>
-          <w:rFonts w:hint="default" w:ascii="Times New Roman" w:hAnsi="Times New Roman" w:cs="Times New Roman" w:eastAsiaTheme="minorEastAsia"/>
-          <w:sz w:val="24"/>
-          <w:szCs w:val="24"/>
-        </w:rPr>
-        <w:t>1985</w:t>
-      </w:r>
-      <w:r>
-        <w:rPr>
-          <w:rFonts w:hint="eastAsia" w:ascii="Times New Roman" w:hAnsi="Times New Roman" w:cs="Times New Roman"/>
-          <w:sz w:val="24"/>
-          <w:szCs w:val="24"/>
-          <w:lang w:val="en-US" w:eastAsia="zh-CN"/>
-        </w:rPr>
-        <w:t>,</w:t>
-      </w:r>
-      <w:r>
-        <w:rPr>
-          <w:rFonts w:hint="default" w:ascii="Times New Roman" w:hAnsi="Times New Roman" w:cs="Times New Roman" w:eastAsiaTheme="minorEastAsia"/>
-          <w:sz w:val="24"/>
-          <w:szCs w:val="24"/>
-        </w:rPr>
-        <w:t>20</w:t>
-      </w:r>
-      <w:r>
-        <w:rPr>
-          <w:rFonts w:hint="eastAsia" w:ascii="Times New Roman" w:hAnsi="Times New Roman" w:cs="Times New Roman"/>
-          <w:sz w:val="24"/>
-          <w:szCs w:val="24"/>
-          <w:lang w:val="en-US" w:eastAsia="zh-CN"/>
-        </w:rPr>
-        <w:t>(</w:t>
-      </w:r>
-      <w:r>
-        <w:rPr>
-          <w:rFonts w:hint="default" w:ascii="Times New Roman" w:hAnsi="Times New Roman" w:cs="Times New Roman" w:eastAsiaTheme="minorEastAsia"/>
-          <w:sz w:val="24"/>
-          <w:szCs w:val="24"/>
-        </w:rPr>
-        <w:t>4</w:t>
-      </w:r>
-      <w:r>
-        <w:rPr>
-          <w:rFonts w:hint="eastAsia" w:ascii="Times New Roman" w:hAnsi="Times New Roman" w:cs="Times New Roman"/>
-          <w:sz w:val="24"/>
-          <w:szCs w:val="24"/>
-          <w:lang w:val="en-US" w:eastAsia="zh-CN"/>
-        </w:rPr>
-        <w:t>)</w:t>
-      </w:r>
-      <w:r>
-        <w:rPr>
-          <w:rFonts w:hint="default" w:ascii="Times New Roman" w:hAnsi="Times New Roman" w:cs="Times New Roman" w:eastAsiaTheme="minorEastAsia"/>
-          <w:sz w:val="24"/>
-          <w:szCs w:val="24"/>
-        </w:rPr>
-        <w:t>:36~38.</w:t>
-      </w:r>
-    </w:p>
-    <w:p>
-      <w:pPr>
-        <w:spacing w:line="500" w:lineRule="exact"/>
-        <w:ind w:firstLine="480" w:firstLineChars="200"/>
-        <w:rPr>
-          <w:rFonts w:hint="default" w:ascii="Times New Roman" w:hAnsi="Times New Roman" w:cs="Times New Roman" w:eastAsiaTheme="minorEastAsia"/>
-          <w:sz w:val="24"/>
-          <w:szCs w:val="24"/>
-        </w:rPr>
-      </w:pPr>
-      <w:r>
-        <w:rPr>
-          <w:rFonts w:hint="default" w:ascii="Times New Roman" w:hAnsi="Times New Roman" w:cs="Times New Roman" w:eastAsiaTheme="minorEastAsia"/>
-          <w:sz w:val="24"/>
-          <w:szCs w:val="24"/>
-        </w:rPr>
-        <w:t>*引用论文集、学位论文、研究报告类推。</w:t>
-      </w:r>
-    </w:p>
-    <w:p>
-      <w:pPr>
-        <w:spacing w:line="500" w:lineRule="exact"/>
-        <w:ind w:firstLine="480" w:firstLineChars="200"/>
-        <w:rPr>
-          <w:rFonts w:hint="default" w:ascii="Times New Roman" w:hAnsi="Times New Roman" w:cs="Times New Roman" w:eastAsiaTheme="minorEastAsia"/>
-          <w:sz w:val="24"/>
-          <w:szCs w:val="24"/>
-        </w:rPr>
-      </w:pPr>
-      <w:r>
-        <w:rPr>
-          <w:rFonts w:hint="default" w:ascii="Times New Roman" w:hAnsi="Times New Roman" w:cs="Times New Roman" w:eastAsiaTheme="minorEastAsia"/>
-          <w:sz w:val="24"/>
-          <w:szCs w:val="24"/>
-        </w:rPr>
-        <w:t>*引用报纸文章的――作者姓名．文章名</w:t>
-      </w:r>
-      <w:r>
-        <w:rPr>
-          <w:rFonts w:hint="eastAsia" w:ascii="Times New Roman" w:hAnsi="Times New Roman" w:cs="Times New Roman"/>
-          <w:sz w:val="24"/>
-          <w:szCs w:val="24"/>
-          <w:lang w:val="en-US" w:eastAsia="zh-CN"/>
-        </w:rPr>
-        <w:t>[</w:t>
-      </w:r>
-      <w:r>
-        <w:rPr>
-          <w:rFonts w:hint="default" w:ascii="Times New Roman" w:hAnsi="Times New Roman" w:cs="Times New Roman" w:eastAsiaTheme="minorEastAsia"/>
-          <w:sz w:val="24"/>
-          <w:szCs w:val="24"/>
-        </w:rPr>
-        <w:t>N</w:t>
-      </w:r>
-      <w:r>
-        <w:rPr>
-          <w:rFonts w:hint="eastAsia" w:ascii="Times New Roman" w:hAnsi="Times New Roman" w:cs="Times New Roman"/>
-          <w:sz w:val="24"/>
-          <w:szCs w:val="24"/>
-          <w:lang w:val="en-US" w:eastAsia="zh-CN"/>
-        </w:rPr>
-        <w:t>].</w:t>
-      </w:r>
-      <w:r>
-        <w:rPr>
-          <w:rFonts w:hint="default" w:ascii="Times New Roman" w:hAnsi="Times New Roman" w:cs="Times New Roman" w:eastAsiaTheme="minorEastAsia"/>
-          <w:sz w:val="24"/>
-          <w:szCs w:val="24"/>
-        </w:rPr>
-        <w:t>报纸名</w:t>
-      </w:r>
-      <w:r>
-        <w:rPr>
-          <w:rFonts w:hint="eastAsia" w:ascii="Times New Roman" w:hAnsi="Times New Roman" w:cs="Times New Roman"/>
-          <w:sz w:val="24"/>
-          <w:szCs w:val="24"/>
-          <w:lang w:val="en-US" w:eastAsia="zh-CN"/>
-        </w:rPr>
-        <w:t>,</w:t>
-      </w:r>
-      <w:r>
-        <w:rPr>
-          <w:rFonts w:hint="default" w:ascii="Times New Roman" w:hAnsi="Times New Roman" w:cs="Times New Roman" w:eastAsiaTheme="minorEastAsia"/>
-          <w:sz w:val="24"/>
-          <w:szCs w:val="24"/>
-        </w:rPr>
-        <w:t>出版日期（版次）．</w:t>
-      </w:r>
-    </w:p>
-    <w:p>
-      <w:pPr>
-        <w:spacing w:line="500" w:lineRule="exact"/>
-        <w:ind w:firstLine="480" w:firstLineChars="200"/>
-        <w:rPr>
-          <w:rFonts w:hint="default" w:ascii="Times New Roman" w:hAnsi="Times New Roman" w:cs="Times New Roman" w:eastAsiaTheme="minorEastAsia"/>
-          <w:sz w:val="24"/>
-          <w:szCs w:val="24"/>
-        </w:rPr>
-      </w:pPr>
-      <w:r>
-        <w:rPr>
-          <w:rFonts w:hint="default" w:ascii="Times New Roman" w:hAnsi="Times New Roman" w:cs="Times New Roman" w:eastAsiaTheme="minorEastAsia"/>
-          <w:sz w:val="24"/>
-          <w:szCs w:val="24"/>
-        </w:rPr>
-        <w:t>如：</w:t>
-      </w:r>
-      <w:r>
-        <w:rPr>
-          <w:rFonts w:hint="eastAsia" w:ascii="Times New Roman" w:hAnsi="Times New Roman" w:cs="Times New Roman"/>
-          <w:sz w:val="24"/>
-          <w:szCs w:val="24"/>
-          <w:lang w:val="en-US" w:eastAsia="zh-CN"/>
-        </w:rPr>
-        <w:t>[</w:t>
-      </w:r>
-      <w:r>
-        <w:rPr>
-          <w:rFonts w:hint="default" w:ascii="Times New Roman" w:hAnsi="Times New Roman" w:cs="Times New Roman" w:eastAsiaTheme="minorEastAsia"/>
-          <w:sz w:val="24"/>
-          <w:szCs w:val="24"/>
-        </w:rPr>
-        <w:t>1</w:t>
-      </w:r>
-      <w:r>
-        <w:rPr>
-          <w:rFonts w:hint="eastAsia" w:ascii="Times New Roman" w:hAnsi="Times New Roman" w:cs="Times New Roman"/>
-          <w:sz w:val="24"/>
-          <w:szCs w:val="24"/>
-          <w:lang w:val="en-US" w:eastAsia="zh-CN"/>
-        </w:rPr>
-        <w:t>]</w:t>
-      </w:r>
-      <w:r>
-        <w:rPr>
-          <w:rFonts w:hint="default" w:ascii="Times New Roman" w:hAnsi="Times New Roman" w:cs="Times New Roman" w:eastAsiaTheme="minorEastAsia"/>
-          <w:sz w:val="24"/>
-          <w:szCs w:val="24"/>
-        </w:rPr>
-        <w:t>谢希德</w:t>
-      </w:r>
-      <w:r>
-        <w:rPr>
-          <w:rFonts w:hint="eastAsia" w:ascii="Times New Roman" w:hAnsi="Times New Roman" w:cs="Times New Roman"/>
-          <w:sz w:val="24"/>
-          <w:szCs w:val="24"/>
-          <w:lang w:val="en-US" w:eastAsia="zh-CN"/>
-        </w:rPr>
-        <w:t>.</w:t>
-      </w:r>
-      <w:r>
-        <w:rPr>
-          <w:rFonts w:hint="default" w:ascii="Times New Roman" w:hAnsi="Times New Roman" w:cs="Times New Roman" w:eastAsiaTheme="minorEastAsia"/>
-          <w:sz w:val="24"/>
-          <w:szCs w:val="24"/>
-        </w:rPr>
-        <w:t>创造学习的新思路</w:t>
-      </w:r>
-      <w:r>
-        <w:rPr>
-          <w:rFonts w:hint="eastAsia" w:ascii="Times New Roman" w:hAnsi="Times New Roman" w:cs="Times New Roman"/>
-          <w:sz w:val="24"/>
-          <w:szCs w:val="24"/>
-          <w:lang w:val="en-US" w:eastAsia="zh-CN"/>
-        </w:rPr>
-        <w:t>[</w:t>
-      </w:r>
-      <w:r>
-        <w:rPr>
-          <w:rFonts w:hint="default" w:ascii="Times New Roman" w:hAnsi="Times New Roman" w:cs="Times New Roman" w:eastAsiaTheme="minorEastAsia"/>
-          <w:sz w:val="24"/>
-          <w:szCs w:val="24"/>
-        </w:rPr>
-        <w:t>N</w:t>
-      </w:r>
-      <w:r>
-        <w:rPr>
-          <w:rFonts w:hint="eastAsia" w:ascii="Times New Roman" w:hAnsi="Times New Roman" w:cs="Times New Roman"/>
-          <w:sz w:val="24"/>
-          <w:szCs w:val="24"/>
-          <w:lang w:val="en-US" w:eastAsia="zh-CN"/>
-        </w:rPr>
-        <w:t>].</w:t>
-      </w:r>
-      <w:r>
-        <w:rPr>
-          <w:rFonts w:hint="default" w:ascii="Times New Roman" w:hAnsi="Times New Roman" w:cs="Times New Roman" w:eastAsiaTheme="minorEastAsia"/>
-          <w:sz w:val="24"/>
-          <w:szCs w:val="24"/>
-        </w:rPr>
-        <w:t>人民日报</w:t>
-      </w:r>
-      <w:r>
-        <w:rPr>
-          <w:rFonts w:hint="eastAsia" w:ascii="Times New Roman" w:hAnsi="Times New Roman" w:cs="Times New Roman"/>
-          <w:sz w:val="24"/>
-          <w:szCs w:val="24"/>
-          <w:lang w:val="en-US" w:eastAsia="zh-CN"/>
-        </w:rPr>
-        <w:t>,</w:t>
-      </w:r>
-      <w:r>
-        <w:rPr>
-          <w:rFonts w:hint="default" w:ascii="Times New Roman" w:hAnsi="Times New Roman" w:cs="Times New Roman" w:eastAsiaTheme="minorEastAsia"/>
-          <w:sz w:val="24"/>
-          <w:szCs w:val="24"/>
-        </w:rPr>
-        <w:t>1998-12-25(10)．</w:t>
-      </w:r>
-    </w:p>
-    <w:p>
-      <w:pPr>
-        <w:spacing w:line="500" w:lineRule="exact"/>
-        <w:ind w:firstLine="480" w:firstLineChars="200"/>
-        <w:rPr>
-          <w:rFonts w:hint="default" w:ascii="Times New Roman" w:hAnsi="Times New Roman" w:cs="Times New Roman" w:eastAsiaTheme="minorEastAsia"/>
-          <w:sz w:val="24"/>
-          <w:szCs w:val="24"/>
-        </w:rPr>
-      </w:pPr>
-      <w:r>
-        <w:rPr>
-          <w:rFonts w:hint="default" w:ascii="Times New Roman" w:hAnsi="Times New Roman" w:cs="Times New Roman" w:eastAsiaTheme="minorEastAsia"/>
-          <w:sz w:val="24"/>
-          <w:szCs w:val="24"/>
-        </w:rPr>
-        <w:t>*引用电子文献的――作者姓名．电子文献题名</w:t>
-      </w:r>
-      <w:r>
-        <w:rPr>
-          <w:rFonts w:hint="eastAsia" w:ascii="Times New Roman" w:hAnsi="Times New Roman" w:cs="Times New Roman"/>
-          <w:sz w:val="24"/>
-          <w:szCs w:val="24"/>
-          <w:lang w:val="en-US" w:eastAsia="zh-CN"/>
-        </w:rPr>
-        <w:t>[</w:t>
-      </w:r>
-      <w:r>
-        <w:rPr>
-          <w:rFonts w:hint="default" w:ascii="Times New Roman" w:hAnsi="Times New Roman" w:cs="Times New Roman" w:eastAsiaTheme="minorEastAsia"/>
-          <w:sz w:val="24"/>
-          <w:szCs w:val="24"/>
-        </w:rPr>
-        <w:t>电子文献及载体类型标识</w:t>
-      </w:r>
-      <w:r>
-        <w:rPr>
-          <w:rFonts w:hint="eastAsia" w:ascii="Times New Roman" w:hAnsi="Times New Roman" w:cs="Times New Roman"/>
-          <w:sz w:val="24"/>
-          <w:szCs w:val="24"/>
-          <w:lang w:val="en-US" w:eastAsia="zh-CN"/>
-        </w:rPr>
-        <w:t>].</w:t>
-      </w:r>
-      <w:r>
-        <w:rPr>
-          <w:rFonts w:hint="default" w:ascii="Times New Roman" w:hAnsi="Times New Roman" w:cs="Times New Roman" w:eastAsiaTheme="minorEastAsia"/>
-          <w:sz w:val="24"/>
-          <w:szCs w:val="24"/>
-        </w:rPr>
-        <w:t>电子文献的出处或可获得地址，发表或更新日期</w:t>
-      </w:r>
-      <w:r>
-        <w:rPr>
-          <w:rFonts w:hint="eastAsia" w:ascii="Times New Roman" w:hAnsi="Times New Roman" w:cs="Times New Roman"/>
-          <w:sz w:val="24"/>
-          <w:szCs w:val="24"/>
-          <w:lang w:val="en-US" w:eastAsia="zh-CN"/>
-        </w:rPr>
-        <w:t>/</w:t>
-      </w:r>
-      <w:r>
-        <w:rPr>
-          <w:rFonts w:hint="default" w:ascii="Times New Roman" w:hAnsi="Times New Roman" w:cs="Times New Roman" w:eastAsiaTheme="minorEastAsia"/>
-          <w:sz w:val="24"/>
-          <w:szCs w:val="24"/>
-        </w:rPr>
-        <w:t>引用日期（任选）．</w:t>
-      </w:r>
-    </w:p>
-    <w:p>
-      <w:pPr>
-        <w:spacing w:line="500" w:lineRule="exact"/>
-        <w:ind w:firstLine="480" w:firstLineChars="200"/>
-        <w:rPr>
-          <w:rFonts w:hint="eastAsia" w:ascii="仿宋" w:hAnsi="仿宋" w:eastAsia="仿宋" w:cstheme="minorEastAsia"/>
-          <w:sz w:val="28"/>
-          <w:szCs w:val="28"/>
-        </w:rPr>
-      </w:pPr>
-      <w:r>
-        <w:rPr>
-          <w:rFonts w:hint="default" w:ascii="Times New Roman" w:hAnsi="Times New Roman" w:cs="Times New Roman" w:eastAsiaTheme="minorEastAsia"/>
-          <w:sz w:val="24"/>
-          <w:szCs w:val="24"/>
-        </w:rPr>
-        <w:t>如：</w:t>
-      </w:r>
-      <w:r>
-        <w:rPr>
-          <w:rFonts w:hint="eastAsia" w:ascii="Times New Roman" w:hAnsi="Times New Roman" w:cs="Times New Roman"/>
-          <w:sz w:val="24"/>
-          <w:szCs w:val="24"/>
-          <w:lang w:val="en-US" w:eastAsia="zh-CN"/>
-        </w:rPr>
-        <w:t>[</w:t>
-      </w:r>
-      <w:r>
-        <w:rPr>
-          <w:rFonts w:hint="default" w:ascii="Times New Roman" w:hAnsi="Times New Roman" w:cs="Times New Roman" w:eastAsiaTheme="minorEastAsia"/>
-          <w:sz w:val="24"/>
-          <w:szCs w:val="24"/>
-        </w:rPr>
-        <w:t>1</w:t>
-      </w:r>
-      <w:r>
-        <w:rPr>
-          <w:rFonts w:hint="eastAsia" w:ascii="Times New Roman" w:hAnsi="Times New Roman" w:cs="Times New Roman"/>
-          <w:sz w:val="24"/>
-          <w:szCs w:val="24"/>
-          <w:lang w:val="en-US" w:eastAsia="zh-CN"/>
-        </w:rPr>
-        <w:t>]</w:t>
-      </w:r>
-      <w:r>
-        <w:rPr>
-          <w:rFonts w:hint="default" w:ascii="Times New Roman" w:hAnsi="Times New Roman" w:cs="Times New Roman" w:eastAsiaTheme="minorEastAsia"/>
-          <w:sz w:val="24"/>
-          <w:szCs w:val="24"/>
-        </w:rPr>
-        <w:t>王明亮</w:t>
-      </w:r>
-      <w:r>
-        <w:rPr>
-          <w:rFonts w:hint="eastAsia" w:ascii="Times New Roman" w:hAnsi="Times New Roman" w:cs="Times New Roman"/>
-          <w:sz w:val="24"/>
-          <w:szCs w:val="24"/>
-          <w:lang w:val="en-US" w:eastAsia="zh-CN"/>
-        </w:rPr>
-        <w:t>.</w:t>
-      </w:r>
-      <w:r>
-        <w:rPr>
-          <w:rFonts w:hint="default" w:ascii="Times New Roman" w:hAnsi="Times New Roman" w:cs="Times New Roman" w:eastAsiaTheme="minorEastAsia"/>
-          <w:sz w:val="24"/>
-          <w:szCs w:val="24"/>
-        </w:rPr>
-        <w:t>关于中国学术期刊标准化数据库系统工程的进展</w:t>
-      </w:r>
-      <w:r>
-        <w:rPr>
-          <w:rFonts w:hint="eastAsia" w:ascii="Times New Roman" w:hAnsi="Times New Roman" w:cs="Times New Roman"/>
-          <w:sz w:val="24"/>
-          <w:szCs w:val="24"/>
-          <w:lang w:val="en-US" w:eastAsia="zh-CN"/>
-        </w:rPr>
-        <w:t>[</w:t>
-      </w:r>
-      <w:r>
-        <w:rPr>
-          <w:rFonts w:hint="default" w:ascii="Times New Roman" w:hAnsi="Times New Roman" w:cs="Times New Roman" w:eastAsiaTheme="minorEastAsia"/>
-          <w:sz w:val="24"/>
-          <w:szCs w:val="24"/>
-        </w:rPr>
-        <w:t>EB/0L</w:t>
-      </w:r>
-      <w:r>
-        <w:rPr>
-          <w:rFonts w:hint="eastAsia" w:ascii="Times New Roman" w:hAnsi="Times New Roman" w:cs="Times New Roman"/>
-          <w:sz w:val="24"/>
-          <w:szCs w:val="24"/>
-          <w:lang w:val="en-US" w:eastAsia="zh-CN"/>
-        </w:rPr>
-        <w:t>].</w:t>
-      </w:r>
-      <w:r>
-        <w:rPr>
-          <w:rFonts w:hint="default" w:ascii="Times New Roman" w:hAnsi="Times New Roman" w:cs="Times New Roman" w:eastAsiaTheme="minorEastAsia"/>
-          <w:sz w:val="24"/>
-          <w:szCs w:val="24"/>
-        </w:rPr>
-        <w:t>http</w:t>
-      </w:r>
-      <w:r>
-        <w:rPr>
-          <w:rFonts w:hint="eastAsia" w:ascii="Times New Roman" w:hAnsi="Times New Roman" w:cs="Times New Roman"/>
-          <w:sz w:val="24"/>
-          <w:szCs w:val="24"/>
-          <w:lang w:val="en-US" w:eastAsia="zh-CN"/>
-        </w:rPr>
-        <w:t>;</w:t>
-      </w:r>
-      <w:r>
-        <w:rPr>
-          <w:rFonts w:hint="default" w:ascii="Times New Roman" w:hAnsi="Times New Roman" w:cs="Times New Roman" w:eastAsiaTheme="minorEastAsia"/>
-          <w:sz w:val="24"/>
-          <w:szCs w:val="24"/>
-        </w:rPr>
-        <w:t>//www.cajcd.cn/pub/wml.txt/980810-2.1998-08-16/1998-10-04．</w:t>
+        <w:spacing w:line="400" w:lineRule="exact" w:before="0" w:after="0"/>
+        <w:ind w:firstLine="0"/>
+        <w:jc w:val="both"/>
+      </w:pPr>
+      <w:r>
+        <w:rPr>
+          <w:rFonts w:ascii="Times New Roman" w:hAnsi="Times New Roman" w:eastAsia="宋体"/>
+          <w:b w:val="0"/>
+          <w:sz w:val="21"/>
+        </w:rPr>
+        <w:t>[1]Lewis P, Perez E, Piktus A, et al. Retrieval-Augmented Generation for Knowledge-Intensive NLP Tasks[C]//Advances in Neural Information Processing Systems (NeurIPS). 2020: 9459-9474.</w:t>
+      </w:r>
+    </w:p>
+    <w:p>
+      <w:pPr>
+        <w:spacing w:line="400" w:lineRule="exact" w:before="0" w:after="0"/>
+        <w:ind w:firstLine="0"/>
+        <w:jc w:val="both"/>
+      </w:pPr>
+      <w:r>
+        <w:rPr>
+          <w:rFonts w:ascii="Times New Roman" w:hAnsi="Times New Roman" w:eastAsia="宋体"/>
+          <w:b w:val="0"/>
+          <w:sz w:val="21"/>
+        </w:rPr>
+        <w:t>[2]Chen J, Xiao S, Zhang P, et al. BGE M3-Embedding: Multi-Lingual, Multi-Functionality, Multi-Granularity Text Embeddings Through Self-Knowledge Distillation[EB/OL]. arXiv:2402.03216, 2024[2026-09-28]. https://arxiv.org/abs/2402.03216.</w:t>
+      </w:r>
+    </w:p>
+    <w:p>
+      <w:pPr>
+        <w:spacing w:line="400" w:lineRule="exact" w:before="0" w:after="0"/>
+        <w:ind w:firstLine="0"/>
+        <w:jc w:val="both"/>
+      </w:pPr>
+      <w:r>
+        <w:rPr>
+          <w:rFonts w:ascii="Times New Roman" w:hAnsi="Times New Roman" w:eastAsia="宋体"/>
+          <w:b w:val="0"/>
+          <w:sz w:val="21"/>
+        </w:rPr>
+        <w:t>[3]LangChain. LangChain Python Documentation[EB/OL]. 2025[2026-09-28]. https://python.langchain.com/docs/.</w:t>
+      </w:r>
+    </w:p>
+    <w:p>
+      <w:pPr>
+        <w:spacing w:line="400" w:lineRule="exact" w:before="0" w:after="0"/>
+        <w:ind w:firstLine="0"/>
+        <w:jc w:val="both"/>
+      </w:pPr>
+      <w:r>
+        <w:rPr>
+          <w:rFonts w:ascii="Times New Roman" w:hAnsi="Times New Roman" w:eastAsia="宋体"/>
+          <w:b w:val="0"/>
+          <w:sz w:val="21"/>
+        </w:rPr>
+        <w:t>[4]Ramírez S. FastAPI Documentation[EB/OL]. 2025[2026-09-28]. https://fastapi.tiangolo.com/.</w:t>
+      </w:r>
+    </w:p>
+    <w:p>
+      <w:pPr>
+        <w:spacing w:line="400" w:lineRule="exact" w:before="0" w:after="0"/>
+        <w:ind w:firstLine="0"/>
+        <w:jc w:val="both"/>
+      </w:pPr>
+      <w:r>
+        <w:rPr>
+          <w:rFonts w:ascii="Times New Roman" w:hAnsi="Times New Roman" w:eastAsia="宋体"/>
+          <w:b w:val="0"/>
+          <w:sz w:val="21"/>
+        </w:rPr>
+        <w:t>[5]SQLAlchemy. SQLAlchemy 2.0 Documentation[EB/OL]. 2025[2026-09-28]. https://docs.sqlalchemy.org/.</w:t>
+      </w:r>
+    </w:p>
+    <w:p>
+      <w:pPr>
+        <w:spacing w:line="400" w:lineRule="exact" w:before="0" w:after="0"/>
+        <w:ind w:firstLine="0"/>
+        <w:jc w:val="both"/>
+      </w:pPr>
+      <w:r>
+        <w:rPr>
+          <w:rFonts w:ascii="Times New Roman" w:hAnsi="Times New Roman" w:eastAsia="宋体"/>
+          <w:b w:val="0"/>
+          <w:sz w:val="21"/>
+        </w:rPr>
+        <w:t>[6]Oracle Corporation. MySQL 8.0 Reference Manual[EB/OL]. 2025[2026-09-28]. https://dev.mysql.com/doc/refman/8.0/en/.</w:t>
+      </w:r>
+    </w:p>
+    <w:p>
+      <w:pPr>
+        <w:spacing w:line="400" w:lineRule="exact" w:before="0" w:after="0"/>
+        <w:ind w:firstLine="0"/>
+        <w:jc w:val="both"/>
+      </w:pPr>
+      <w:r>
+        <w:rPr>
+          <w:rFonts w:ascii="Times New Roman" w:hAnsi="Times New Roman" w:eastAsia="宋体"/>
+          <w:b w:val="0"/>
+          <w:sz w:val="21"/>
+        </w:rPr>
+        <w:t>[7]Chroma. Chroma Documentation[EB/OL]. 2025[2026-09-28]. https://docs.trychroma.com/.</w:t>
+      </w:r>
+    </w:p>
+    <w:p>
+      <w:pPr>
+        <w:spacing w:line="400" w:lineRule="exact" w:before="0" w:after="0"/>
+        <w:ind w:firstLine="0"/>
+        <w:jc w:val="both"/>
+      </w:pPr>
+      <w:r>
+        <w:rPr>
+          <w:rFonts w:ascii="Times New Roman" w:hAnsi="Times New Roman" w:eastAsia="宋体"/>
+          <w:b w:val="0"/>
+          <w:sz w:val="21"/>
+        </w:rPr>
+        <w:t>[8]Pydantic. Pydantic Documentation[EB/OL]. 2025[2026-09-28]. https://docs.pydantic.dev/.</w:t>
+      </w:r>
+    </w:p>
+    <w:p>
+      <w:pPr>
+        <w:spacing w:line="400" w:lineRule="exact" w:before="0" w:after="0"/>
+        <w:ind w:firstLine="0"/>
+        <w:jc w:val="both"/>
+      </w:pPr>
+      <w:r>
+        <w:rPr>
+          <w:rFonts w:ascii="Times New Roman" w:hAnsi="Times New Roman" w:eastAsia="宋体"/>
+          <w:b w:val="0"/>
+          <w:sz w:val="21"/>
+        </w:rPr>
+        <w:t>[9]Docker Inc. Docker Documentation[EB/OL]. 2025[2026-09-28]. https://docs.docker.com/.</w:t>
+      </w:r>
+    </w:p>
+    <w:p>
+      <w:pPr>
+        <w:spacing w:line="400" w:lineRule="exact" w:before="0" w:after="0"/>
+        <w:ind w:firstLine="0"/>
+        <w:jc w:val="both"/>
+      </w:pPr>
+      <w:r>
+        <w:rPr>
+          <w:rFonts w:ascii="Times New Roman" w:hAnsi="Times New Roman" w:eastAsia="宋体"/>
+          <w:b w:val="0"/>
+          <w:sz w:val="21"/>
+        </w:rPr>
+        <w:t>[10]SiliconFlow. SiliconFlow API Documentation[EB/OL]. 2025[2026-09-28]. https://docs.siliconflow.cn/.</w:t>
+      </w:r>
+    </w:p>
+    <w:p>
+      <w:pPr>
+        <w:spacing w:line="400" w:lineRule="exact" w:before="0" w:after="0"/>
+        <w:ind w:firstLine="0"/>
+        <w:jc w:val="both"/>
+      </w:pPr>
+      <w:r>
+        <w:rPr>
+          <w:rFonts w:ascii="Times New Roman" w:hAnsi="Times New Roman" w:eastAsia="宋体"/>
+          <w:b w:val="0"/>
+          <w:sz w:val="21"/>
+        </w:rPr>
+        <w:t>[11]Python Software Foundation. Python 3.11 Documentation[EB/OL]. 2025[2026-09-28]. https://docs.python.org/3.11/.</w:t>
+      </w:r>
+    </w:p>
+    <w:p>
+      <w:pPr>
+        <w:spacing w:line="400" w:lineRule="exact" w:before="0" w:after="0"/>
+        <w:ind w:firstLine="0"/>
+        <w:jc w:val="both"/>
+      </w:pPr>
+      <w:r>
+        <w:rPr>
+          <w:rFonts w:ascii="Times New Roman" w:hAnsi="Times New Roman" w:eastAsia="宋体"/>
+          <w:b w:val="0"/>
+          <w:sz w:val="21"/>
+        </w:rPr>
+        <w:t>[12]Matthes E. Python编程：从入门到实践[M]. 袁国忠, 译. 3版. 北京: 人民邮电出版社, 2023: 1-58.</w:t>
+      </w:r>
+    </w:p>
+    <w:p>
+      <w:pPr>
+        <w:spacing w:line="400" w:lineRule="exact" w:before="0" w:after="0"/>
+        <w:ind w:firstLine="0"/>
+        <w:jc w:val="both"/>
+      </w:pPr>
+      <w:r>
+        <w:rPr>
+          <w:rFonts w:ascii="Times New Roman" w:hAnsi="Times New Roman" w:eastAsia="宋体"/>
+          <w:b w:val="0"/>
+          <w:sz w:val="21"/>
+        </w:rPr>
+        <w:t>[13]Gao Y, Xiong Y, Gao X, et al. Retrieval-Augmented Generation for Large Language Models: A Survey[EB/OL]. arXiv:2312.10997, 2023[2026-09-28]. https://arxiv.org/abs/2312.10997.</w:t>
+      </w:r>
+    </w:p>
+    <w:p>
+      <w:pPr>
+        <w:spacing w:line="400" w:lineRule="exact" w:before="0" w:after="0"/>
+        <w:ind w:firstLine="0"/>
+        <w:jc w:val="both"/>
+      </w:pPr>
+      <w:r>
+        <w:rPr>
+          <w:rFonts w:ascii="Times New Roman" w:hAnsi="Times New Roman" w:eastAsia="宋体"/>
+          <w:b w:val="0"/>
+          <w:sz w:val="21"/>
+        </w:rPr>
+        <w:t>[14]LangChain. LangChain Text Splitters Documentation[EB/OL]. 2025[2026-09-28]. https://python.langchain.com/docs/concepts/text_splitters/.</w:t>
+      </w:r>
+    </w:p>
+    <w:p>
+      <w:pPr>
+        <w:spacing w:line="400" w:lineRule="exact" w:before="0" w:after="0"/>
+        <w:ind w:firstLine="0"/>
+        <w:jc w:val="both"/>
+      </w:pPr>
+      <w:r>
+        <w:rPr>
+          <w:rFonts w:ascii="Times New Roman" w:hAnsi="Times New Roman" w:eastAsia="宋体"/>
+          <w:b w:val="0"/>
+          <w:sz w:val="21"/>
+        </w:rPr>
+        <w:t>[15]FastAPI. SQL (Relational) Databases - FastAPI Documentation[EB/OL]. 2025[2026-09-28]. https://fastapi.tiangolo.com/tutorial/sql-databases/.</w:t>
       </w:r>
     </w:p>
     <w:p/>

</xml_diff>

<commit_message>
docs: user-edited report and PPT updates
- report and defense PPT finalized by user
</commit_message>
<xml_diff>
--- a/defense/1组-张三-23级计算机科学与技术1班-课程设计报告.docx
+++ b/defense/1组-张三-23级计算机科学与技术1班-课程设计报告.docx
@@ -796,8 +796,6 @@
           <w:szCs w:val="32"/>
         </w:rPr>
       </w:pPr>
-      <w:bookmarkStart w:id="0" w:name="_GoBack"/>
-      <w:bookmarkEnd w:id="0"/>
       <w:r>
         <w:rPr>
           <w:rFonts w:hint="eastAsia" w:ascii="宋体" w:hAnsi="宋体" w:eastAsia="宋体" w:cs="宋体"/>
@@ -844,7 +842,7 @@
       <w:r>
         <w:rPr>
           <w:rFonts w:hint="eastAsia" w:ascii="Times New Roman" w:hAnsi="Times New Roman" w:cs="Times New Roman"/>
-          <w:color w:val="FF0000"/>
+          <w:color w:val="auto"/>
           <w:sz w:val="24"/>
           <w:szCs w:val="24"/>
           <w:lang w:val="en-US" w:eastAsia="zh-CN"/>
@@ -917,7 +915,7 @@
             <w:r>
               <w:rPr>
                 <w:rFonts w:hint="eastAsia" w:ascii="Times New Roman" w:hAnsi="Times New Roman" w:cs="Times New Roman"/>
-                <w:color w:val="FF0000"/>
+                <w:color w:val="auto"/>
                 <w:sz w:val="24"/>
                 <w:szCs w:val="24"/>
                 <w:vertAlign w:val="baseline"/>
@@ -947,7 +945,7 @@
             <w:r>
               <w:rPr>
                 <w:rFonts w:hint="eastAsia" w:ascii="Times New Roman" w:hAnsi="Times New Roman" w:cs="Times New Roman"/>
-                <w:color w:val="FF0000"/>
+                <w:color w:val="auto"/>
                 <w:sz w:val="24"/>
                 <w:szCs w:val="24"/>
                 <w:vertAlign w:val="baseline"/>
@@ -977,7 +975,7 @@
             <w:r>
               <w:rPr>
                 <w:rFonts w:hint="eastAsia" w:ascii="Times New Roman" w:hAnsi="Times New Roman" w:cs="Times New Roman"/>
-                <w:color w:val="FF0000"/>
+                <w:color w:val="auto"/>
                 <w:sz w:val="24"/>
                 <w:szCs w:val="24"/>
                 <w:vertAlign w:val="baseline"/>
@@ -1007,7 +1005,7 @@
             <w:r>
               <w:rPr>
                 <w:rFonts w:hint="eastAsia" w:ascii="Times New Roman" w:hAnsi="Times New Roman" w:cs="Times New Roman"/>
-                <w:color w:val="FF0000"/>
+                <w:color w:val="auto"/>
                 <w:sz w:val="24"/>
                 <w:szCs w:val="24"/>
                 <w:vertAlign w:val="baseline"/>
@@ -1037,7 +1035,7 @@
             <w:r>
               <w:rPr>
                 <w:rFonts w:hint="eastAsia" w:ascii="Times New Roman" w:hAnsi="Times New Roman" w:cs="Times New Roman"/>
-                <w:color w:val="FF0000"/>
+                <w:color w:val="auto"/>
                 <w:sz w:val="24"/>
                 <w:szCs w:val="24"/>
                 <w:vertAlign w:val="baseline"/>
@@ -2315,6 +2313,12 @@
             <w:insideH w:val="single" w:color="auto" w:sz="4" w:space="0"/>
             <w:insideV w:val="single" w:color="auto" w:sz="4" w:space="0"/>
           </w:tblBorders>
+          <w:tblCellMar>
+            <w:top w:w="0" w:type="dxa"/>
+            <w:left w:w="108" w:type="dxa"/>
+            <w:bottom w:w="0" w:type="dxa"/>
+            <w:right w:w="108" w:type="dxa"/>
+          </w:tblCellMar>
         </w:tblPrEx>
         <w:tc>
           <w:tcPr>
@@ -4499,94 +4503,12 @@
     </w:p>
     <w:p>
       <w:pPr>
-        <w:spacing w:line="500" w:lineRule="exact"/>
-        <w:ind w:firstLine="480" w:firstLineChars="200"/>
-        <w:rPr>
-          <w:rFonts w:hint="default" w:ascii="Times New Roman" w:hAnsi="Times New Roman" w:cs="Times New Roman" w:eastAsiaTheme="minorEastAsia"/>
-          <w:sz w:val="24"/>
-          <w:szCs w:val="24"/>
-        </w:rPr>
-      </w:pPr>
-      <w:r>
-        <w:rPr>
-          <w:rFonts w:hint="default" w:ascii="Times New Roman" w:hAnsi="Times New Roman" w:cs="Times New Roman" w:eastAsiaTheme="minorEastAsia"/>
-          <w:sz w:val="24"/>
-          <w:szCs w:val="24"/>
-        </w:rPr>
-        <w:t>重点说明设计是如何实现的，包括：对设计工作的详细表述。要求层次分明、表达确切。</w:t>
-      </w:r>
-    </w:p>
-    <w:p>
-      <w:pPr>
-        <w:spacing w:line="500" w:lineRule="exact"/>
-        <w:ind w:firstLine="560" w:firstLineChars="200"/>
-        <w:rPr>
-          <w:rFonts w:hint="eastAsia" w:ascii="Times New Roman" w:hAnsi="Times New Roman" w:cs="Times New Roman"/>
-          <w:color w:val="FF0000"/>
-          <w:sz w:val="28"/>
-          <w:szCs w:val="28"/>
-          <w:lang w:val="en-US" w:eastAsia="zh-CN"/>
-        </w:rPr>
-      </w:pPr>
-      <w:r>
-        <w:rPr>
-          <w:rFonts w:hint="eastAsia" w:ascii="Times New Roman" w:hAnsi="Times New Roman" w:cs="Times New Roman"/>
-          <w:color w:val="FF0000"/>
-          <w:sz w:val="28"/>
-          <w:szCs w:val="28"/>
-          <w:lang w:val="en-US" w:eastAsia="zh-CN"/>
-        </w:rPr>
-        <w:t>数据库部分的设计：ER图设计（含关系模式等）、CDM设计、PDM设计（含表结构）</w:t>
-      </w:r>
-    </w:p>
-    <w:p>
-      <w:pPr>
-        <w:spacing w:line="500" w:lineRule="exact"/>
-        <w:ind w:firstLine="560" w:firstLineChars="200"/>
-        <w:rPr>
-          <w:rFonts w:hint="default" w:ascii="Times New Roman" w:hAnsi="Times New Roman" w:cs="Times New Roman"/>
-          <w:color w:val="FF0000"/>
-          <w:sz w:val="28"/>
-          <w:szCs w:val="28"/>
-          <w:lang w:val="en-US" w:eastAsia="zh-CN"/>
-        </w:rPr>
-      </w:pPr>
-      <w:r>
-        <w:rPr>
-          <w:rFonts w:hint="eastAsia" w:ascii="Times New Roman" w:hAnsi="Times New Roman" w:cs="Times New Roman"/>
-          <w:color w:val="FF0000"/>
-          <w:sz w:val="28"/>
-          <w:szCs w:val="28"/>
-          <w:lang w:val="en-US" w:eastAsia="zh-CN"/>
-        </w:rPr>
-        <w:t>信息系统设计、实现、测试（如何与数据库连接、使用；信息系统功能设计的功能图、核心流程图、实现的界面、关键代码；系统如何测试（了解功能测试、结构测试））</w:t>
-      </w:r>
-    </w:p>
-    <w:p>
-      <w:pPr>
-        <w:spacing w:line="500" w:lineRule="exact"/>
-        <w:ind w:firstLine="420"/>
-        <w:rPr>
-          <w:rFonts w:hint="default" w:ascii="Times New Roman" w:hAnsi="Times New Roman" w:cs="Times New Roman" w:eastAsiaTheme="minorEastAsia"/>
-          <w:sz w:val="24"/>
-          <w:szCs w:val="24"/>
-        </w:rPr>
-      </w:pPr>
-      <w:r>
-        <w:rPr>
-          <w:rFonts w:hint="default" w:ascii="Times New Roman" w:hAnsi="Times New Roman" w:cs="Times New Roman" w:eastAsiaTheme="minorEastAsia"/>
-          <w:sz w:val="24"/>
-          <w:szCs w:val="24"/>
-        </w:rPr>
-        <w:t>要求：每个图都必须有文字说明，图前说明为什么使用该图、图的主要作用；图后说明图中各成分的作用，和成分之间的交互或图所表达的流程。</w:t>
-      </w:r>
-    </w:p>
-    <w:p>
-      <w:pPr>
         <w:spacing w:before="0" w:after="0" w:line="400" w:lineRule="exact"/>
         <w:ind w:firstLine="480"/>
         <w:jc w:val="both"/>
       </w:pPr>
+      <w:bookmarkStart w:id="0" w:name="_GoBack"/>
+      <w:bookmarkEnd w:id="0"/>
       <w:r>
         <w:rPr>
           <w:rFonts w:ascii="Times New Roman" w:hAnsi="Times New Roman" w:eastAsia="宋体"/>

</xml_diff>